<commit_message>
Proje1 Adim2: DMV ile veritabani izleme - sorgu istatistikleri, aktif oturumlar, dosya boyutlari ve tablo alani analizi tamamlandi
</commit_message>
<xml_diff>
--- a/Proje1-PerformansOptimizasyonu/Proje1_Rapor.docx
+++ b/Proje1-PerformansOptimizasyonu/Proje1_Rapor.docx
@@ -1113,14 +1113,841 @@
       <w:r>
         <w:rPr>
           <w:rFonts w:ascii="Times New Roman" w:cs="Times New Roman" w:eastAsia="Times New Roman" w:hAnsi="Times New Roman"/>
+          <w:sz w:val="22"/>
+          <w:szCs w:val="22"/>
+        </w:rPr>
+        <w:t xml:space="preserve">Dynamic Management Views (DMV), SQL Server'ın iç durumunu izlemek için kullanılan sistem görünümleridir. Bu bölümde NYCTaxi_Sample veritabanı üzerinde sorgu performansı, aktif oturumlar, dosya boyutları ve tablo istatistikleri incelenmiştir.</w:t>
+      </w:r>
+    </w:p>
+    <w:p>
+      <w:pPr>
+        <w:spacing w:after="100" w:before="100"/>
+      </w:pPr>
+    </w:p>
+    <w:p>
+      <w:pPr>
+        <w:pStyle w:val="Heading2"/>
+        <w:spacing w:after="80" w:before="200"/>
+      </w:pPr>
+      <w:r>
+        <w:rPr>
+          <w:rFonts w:ascii="Times New Roman" w:cs="Times New Roman" w:eastAsia="Times New Roman" w:hAnsi="Times New Roman"/>
+          <w:b/>
+          <w:bCs/>
+          <w:sz w:val="24"/>
+          <w:szCs w:val="24"/>
+        </w:rPr>
+        <w:t xml:space="preserve">3.1 En Çok Kaynak Kullanan Sorgular</w:t>
+      </w:r>
+    </w:p>
+    <w:p>
+      <w:pPr>
+        <w:spacing w:after="80" w:before="80"/>
+        <w:jc w:val="both"/>
+      </w:pPr>
+      <w:r>
+        <w:rPr>
+          <w:rFonts w:ascii="Times New Roman" w:cs="Times New Roman" w:eastAsia="Times New Roman" w:hAnsi="Times New Roman"/>
+          <w:sz w:val="22"/>
+          <w:szCs w:val="22"/>
+        </w:rPr>
+        <w:t xml:space="preserve">sys.dm_exec_query_stats görünümü ile önbellekteki sorgu planlarının kaynak tüketimi analiz edilmiştir.</w:t>
+      </w:r>
+    </w:p>
+    <w:p>
+      <w:pPr>
+        <w:shd w:fill="F2F2F2" w:val="clear"/>
+        <w:spacing w:after="0" w:before="0"/>
+      </w:pPr>
+      <w:r>
+        <w:rPr>
+          <w:rFonts w:ascii="Courier New" w:cs="Courier New" w:eastAsia="Courier New" w:hAnsi="Courier New"/>
+          <w:sz w:val="18"/>
+          <w:szCs w:val="18"/>
+        </w:rPr>
+        <w:t xml:space="preserve">SELECT TOP 10</w:t>
+      </w:r>
+    </w:p>
+    <w:p>
+      <w:pPr>
+        <w:shd w:fill="F2F2F2" w:val="clear"/>
+        <w:spacing w:after="0" w:before="0"/>
+      </w:pPr>
+      <w:r>
+        <w:rPr>
+          <w:rFonts w:ascii="Courier New" w:cs="Courier New" w:eastAsia="Courier New" w:hAnsi="Courier New"/>
+          <w:sz w:val="18"/>
+          <w:szCs w:val="18"/>
+        </w:rPr>
+        <w:t xml:space="preserve">    qs.execution_count,</w:t>
+      </w:r>
+    </w:p>
+    <w:p>
+      <w:pPr>
+        <w:shd w:fill="F2F2F2" w:val="clear"/>
+        <w:spacing w:after="0" w:before="0"/>
+      </w:pPr>
+      <w:r>
+        <w:rPr>
+          <w:rFonts w:ascii="Courier New" w:cs="Courier New" w:eastAsia="Courier New" w:hAnsi="Courier New"/>
+          <w:sz w:val="18"/>
+          <w:szCs w:val="18"/>
+        </w:rPr>
+        <w:t xml:space="preserve">    qs.total_elapsed_time / 1000 AS elapsed_ms,</w:t>
+      </w:r>
+    </w:p>
+    <w:p>
+      <w:pPr>
+        <w:shd w:fill="F2F2F2" w:val="clear"/>
+        <w:spacing w:after="0" w:before="0"/>
+      </w:pPr>
+      <w:r>
+        <w:rPr>
+          <w:rFonts w:ascii="Courier New" w:cs="Courier New" w:eastAsia="Courier New" w:hAnsi="Courier New"/>
+          <w:sz w:val="18"/>
+          <w:szCs w:val="18"/>
+        </w:rPr>
+        <w:t xml:space="preserve">    qs.total_worker_time / 1000 AS cpu_ms,</w:t>
+      </w:r>
+    </w:p>
+    <w:p>
+      <w:pPr>
+        <w:shd w:fill="F2F2F2" w:val="clear"/>
+        <w:spacing w:after="0" w:before="0"/>
+      </w:pPr>
+      <w:r>
+        <w:rPr>
+          <w:rFonts w:ascii="Courier New" w:cs="Courier New" w:eastAsia="Courier New" w:hAnsi="Courier New"/>
+          <w:sz w:val="18"/>
+          <w:szCs w:val="18"/>
+        </w:rPr>
+        <w:t xml:space="preserve">    qs.total_logical_reads,</w:t>
+      </w:r>
+    </w:p>
+    <w:p>
+      <w:pPr>
+        <w:shd w:fill="F2F2F2" w:val="clear"/>
+        <w:spacing w:after="0" w:before="0"/>
+      </w:pPr>
+      <w:r>
+        <w:rPr>
+          <w:rFonts w:ascii="Courier New" w:cs="Courier New" w:eastAsia="Courier New" w:hAnsi="Courier New"/>
+          <w:sz w:val="18"/>
+          <w:szCs w:val="18"/>
+        </w:rPr>
+        <w:t xml:space="preserve">    SUBSTRING(qt.text, 1, 100) AS sql_text</w:t>
+      </w:r>
+    </w:p>
+    <w:p>
+      <w:pPr>
+        <w:shd w:fill="F2F2F2" w:val="clear"/>
+        <w:spacing w:after="0" w:before="0"/>
+      </w:pPr>
+      <w:r>
+        <w:rPr>
+          <w:rFonts w:ascii="Courier New" w:cs="Courier New" w:eastAsia="Courier New" w:hAnsi="Courier New"/>
+          <w:sz w:val="18"/>
+          <w:szCs w:val="18"/>
+        </w:rPr>
+        <w:t xml:space="preserve">FROM sys.dm_exec_query_stats qs</w:t>
+      </w:r>
+    </w:p>
+    <w:p>
+      <w:pPr>
+        <w:shd w:fill="F2F2F2" w:val="clear"/>
+        <w:spacing w:after="0" w:before="0"/>
+      </w:pPr>
+      <w:r>
+        <w:rPr>
+          <w:rFonts w:ascii="Courier New" w:cs="Courier New" w:eastAsia="Courier New" w:hAnsi="Courier New"/>
+          <w:sz w:val="18"/>
+          <w:szCs w:val="18"/>
+        </w:rPr>
+        <w:t xml:space="preserve">CROSS APPLY sys.dm_exec_sql_text(qs.sql_handle) qt</w:t>
+      </w:r>
+    </w:p>
+    <w:p>
+      <w:pPr>
+        <w:shd w:fill="F2F2F2" w:val="clear"/>
+        <w:spacing w:after="0" w:before="0"/>
+      </w:pPr>
+      <w:r>
+        <w:rPr>
+          <w:rFonts w:ascii="Courier New" w:cs="Courier New" w:eastAsia="Courier New" w:hAnsi="Courier New"/>
+          <w:sz w:val="18"/>
+          <w:szCs w:val="18"/>
+        </w:rPr>
+        <w:t xml:space="preserve">ORDER BY qs.total_elapsed_time DESC;</w:t>
+      </w:r>
+    </w:p>
+    <w:p>
+      <w:pPr>
+        <w:spacing w:after="100" w:before="100"/>
+      </w:pPr>
+    </w:p>
+    <w:p>
+      <w:pPr>
+        <w:spacing w:after="40" w:before="100"/>
+        <w:jc w:val="center"/>
+      </w:pPr>
+      <w:r>
+        <w:drawing>
+          <wp:inline distT="0" distB="0" distL="0" distR="0">
+            <wp:extent cx="5524500" cy="2667000"/>
+            <wp:effectExtent t="0" r="0" b="0" l="0"/>
+            <wp:docPr id="1" name="DMV sorgu istatistikleri" descr="DMV sorgu istatistikleri" title="DMV sorgu istatistikleri"/>
+            <wp:cNvGraphicFramePr>
+              <a:graphicFrameLocks xmlns:a="http://schemas.openxmlformats.org/drawingml/2006/main" noChangeAspect="1"/>
+            </wp:cNvGraphicFramePr>
+            <a:graphic xmlns:a="http://schemas.openxmlformats.org/drawingml/2006/main">
+              <a:graphicData uri="http://schemas.openxmlformats.org/drawingml/2006/picture">
+                <pic:pic xmlns:pic="http://schemas.openxmlformats.org/drawingml/2006/picture">
+                  <pic:nvPicPr>
+                    <pic:cNvPr id="0" name="" descr=""/>
+                    <pic:cNvPicPr>
+                      <a:picLocks noChangeAspect="1" noChangeArrowheads="1"/>
+                    </pic:cNvPicPr>
+                  </pic:nvPicPr>
+                  <pic:blipFill>
+                    <a:blip r:embed="rId15" cstate="none"/>
+                    <a:srcRect/>
+                    <a:stretch>
+                      <a:fillRect/>
+                    </a:stretch>
+                  </pic:blipFill>
+                  <pic:spPr bwMode="auto">
+                    <a:xfrm>
+                      <a:off x="0" y="0"/>
+                      <a:ext cx="5524500" cy="2667000"/>
+                    </a:xfrm>
+                    <a:prstGeom prst="rect">
+                      <a:avLst/>
+                    </a:prstGeom>
+                  </pic:spPr>
+                </pic:pic>
+              </a:graphicData>
+            </a:graphic>
+          </wp:inline>
+        </w:drawing>
+      </w:r>
+    </w:p>
+    <w:p>
+      <w:pPr>
+        <w:spacing w:after="160" w:before="40"/>
+        <w:jc w:val="center"/>
+      </w:pPr>
+      <w:r>
+        <w:rPr>
+          <w:rFonts w:ascii="Times New Roman" w:cs="Times New Roman" w:eastAsia="Times New Roman" w:hAnsi="Times New Roman"/>
           <w:i/>
           <w:iCs/>
-          <w:color w:val="888888"/>
+          <w:sz w:val="18"/>
+          <w:szCs w:val="18"/>
+        </w:rPr>
+        <w:t xml:space="preserve">Şekil 7 – En fazla kaynak kullanan sorgular: En pahalı sorgu 129ms, 129.394 logical read</w:t>
+      </w:r>
+    </w:p>
+    <w:p>
+      <w:pPr>
+        <w:pStyle w:val="Heading2"/>
+        <w:spacing w:after="80" w:before="200"/>
+      </w:pPr>
+      <w:r>
+        <w:rPr>
+          <w:rFonts w:ascii="Times New Roman" w:cs="Times New Roman" w:eastAsia="Times New Roman" w:hAnsi="Times New Roman"/>
+          <w:b/>
+          <w:bCs/>
+          <w:sz w:val="24"/>
+          <w:szCs w:val="24"/>
+        </w:rPr>
+        <w:t xml:space="preserve">3.2 Aktif Oturumlar</w:t>
+      </w:r>
+    </w:p>
+    <w:p>
+      <w:pPr>
+        <w:spacing w:after="80" w:before="80"/>
+        <w:jc w:val="both"/>
+      </w:pPr>
+      <w:r>
+        <w:rPr>
+          <w:rFonts w:ascii="Times New Roman" w:cs="Times New Roman" w:eastAsia="Times New Roman" w:hAnsi="Times New Roman"/>
           <w:sz w:val="22"/>
           <w:szCs w:val="22"/>
         </w:rPr>
-        <w:t xml:space="preserve">Bu bölüm doldurulacaktır.</w:t>
-      </w:r>
+        <w:t xml:space="preserve">sys.dm_exec_sessions görünümü ile anlık aktif kullanıcı oturumları listelenmiştir.</w:t>
+      </w:r>
+    </w:p>
+    <w:p>
+      <w:pPr>
+        <w:shd w:fill="F2F2F2" w:val="clear"/>
+        <w:spacing w:after="0" w:before="0"/>
+      </w:pPr>
+      <w:r>
+        <w:rPr>
+          <w:rFonts w:ascii="Courier New" w:cs="Courier New" w:eastAsia="Courier New" w:hAnsi="Courier New"/>
+          <w:sz w:val="18"/>
+          <w:szCs w:val="18"/>
+        </w:rPr>
+        <w:t xml:space="preserve">SELECT session_id, status, cpu_time, memory_usage,</w:t>
+      </w:r>
+    </w:p>
+    <w:p>
+      <w:pPr>
+        <w:shd w:fill="F2F2F2" w:val="clear"/>
+        <w:spacing w:after="0" w:before="0"/>
+      </w:pPr>
+      <w:r>
+        <w:rPr>
+          <w:rFonts w:ascii="Courier New" w:cs="Courier New" w:eastAsia="Courier New" w:hAnsi="Courier New"/>
+          <w:sz w:val="18"/>
+          <w:szCs w:val="18"/>
+        </w:rPr>
+        <w:t xml:space="preserve">       total_elapsed_time, login_name, host_name</w:t>
+      </w:r>
+    </w:p>
+    <w:p>
+      <w:pPr>
+        <w:shd w:fill="F2F2F2" w:val="clear"/>
+        <w:spacing w:after="0" w:before="0"/>
+      </w:pPr>
+      <w:r>
+        <w:rPr>
+          <w:rFonts w:ascii="Courier New" w:cs="Courier New" w:eastAsia="Courier New" w:hAnsi="Courier New"/>
+          <w:sz w:val="18"/>
+          <w:szCs w:val="18"/>
+        </w:rPr>
+        <w:t xml:space="preserve">FROM sys.dm_exec_sessions</w:t>
+      </w:r>
+    </w:p>
+    <w:p>
+      <w:pPr>
+        <w:shd w:fill="F2F2F2" w:val="clear"/>
+        <w:spacing w:after="0" w:before="0"/>
+      </w:pPr>
+      <w:r>
+        <w:rPr>
+          <w:rFonts w:ascii="Courier New" w:cs="Courier New" w:eastAsia="Courier New" w:hAnsi="Courier New"/>
+          <w:sz w:val="18"/>
+          <w:szCs w:val="18"/>
+        </w:rPr>
+        <w:t xml:space="preserve">WHERE is_user_process = 1;</w:t>
+      </w:r>
+    </w:p>
+    <w:p>
+      <w:pPr>
+        <w:spacing w:after="100" w:before="100"/>
+      </w:pPr>
+    </w:p>
+    <w:p>
+      <w:pPr>
+        <w:spacing w:after="40" w:before="100"/>
+        <w:jc w:val="center"/>
+      </w:pPr>
+      <w:r>
+        <w:drawing>
+          <wp:inline distT="0" distB="0" distL="0" distR="0">
+            <wp:extent cx="5334000" cy="2286000"/>
+            <wp:effectExtent t="0" r="0" b="0" l="0"/>
+            <wp:docPr id="1" name="Aktif oturumlar" descr="Aktif oturumlar" title="Aktif oturumlar"/>
+            <wp:cNvGraphicFramePr>
+              <a:graphicFrameLocks xmlns:a="http://schemas.openxmlformats.org/drawingml/2006/main" noChangeAspect="1"/>
+            </wp:cNvGraphicFramePr>
+            <a:graphic xmlns:a="http://schemas.openxmlformats.org/drawingml/2006/main">
+              <a:graphicData uri="http://schemas.openxmlformats.org/drawingml/2006/picture">
+                <pic:pic xmlns:pic="http://schemas.openxmlformats.org/drawingml/2006/picture">
+                  <pic:nvPicPr>
+                    <pic:cNvPr id="0" name="" descr=""/>
+                    <pic:cNvPicPr>
+                      <a:picLocks noChangeAspect="1" noChangeArrowheads="1"/>
+                    </pic:cNvPicPr>
+                  </pic:nvPicPr>
+                  <pic:blipFill>
+                    <a:blip r:embed="rId16" cstate="none"/>
+                    <a:srcRect/>
+                    <a:stretch>
+                      <a:fillRect/>
+                    </a:stretch>
+                  </pic:blipFill>
+                  <pic:spPr bwMode="auto">
+                    <a:xfrm>
+                      <a:off x="0" y="0"/>
+                      <a:ext cx="5334000" cy="2286000"/>
+                    </a:xfrm>
+                    <a:prstGeom prst="rect">
+                      <a:avLst/>
+                    </a:prstGeom>
+                  </pic:spPr>
+                </pic:pic>
+              </a:graphicData>
+            </a:graphic>
+          </wp:inline>
+        </w:drawing>
+      </w:r>
+    </w:p>
+    <w:p>
+      <w:pPr>
+        <w:spacing w:after="160" w:before="40"/>
+        <w:jc w:val="center"/>
+      </w:pPr>
+      <w:r>
+        <w:rPr>
+          <w:rFonts w:ascii="Times New Roman" w:cs="Times New Roman" w:eastAsia="Times New Roman" w:hAnsi="Times New Roman"/>
+          <w:i/>
+          <w:iCs/>
+          <w:sz w:val="18"/>
+          <w:szCs w:val="18"/>
+        </w:rPr>
+        <w:t xml:space="preserve">Şekil 8 – 4 aktif oturum tespit edildi; session 61 en yüksek CPU kullanımına sahip (2671ms)</w:t>
+      </w:r>
+    </w:p>
+    <w:p>
+      <w:pPr>
+        <w:pStyle w:val="Heading2"/>
+        <w:spacing w:after="80" w:before="200"/>
+      </w:pPr>
+      <w:r>
+        <w:rPr>
+          <w:rFonts w:ascii="Times New Roman" w:cs="Times New Roman" w:eastAsia="Times New Roman" w:hAnsi="Times New Roman"/>
+          <w:b/>
+          <w:bCs/>
+          <w:sz w:val="24"/>
+          <w:szCs w:val="24"/>
+        </w:rPr>
+        <w:t xml:space="preserve">3.3 Veritabanı Dosya Boyutları</w:t>
+      </w:r>
+    </w:p>
+    <w:p>
+      <w:pPr>
+        <w:spacing w:after="80" w:before="80"/>
+        <w:jc w:val="both"/>
+      </w:pPr>
+      <w:r>
+        <w:rPr>
+          <w:rFonts w:ascii="Times New Roman" w:cs="Times New Roman" w:eastAsia="Times New Roman" w:hAnsi="Times New Roman"/>
+          <w:sz w:val="22"/>
+          <w:szCs w:val="22"/>
+        </w:rPr>
+        <w:t xml:space="preserve">sys.database_files görünümü ile veri ve log dosyalarının disk kullanımı incelenmiştir.</w:t>
+      </w:r>
+    </w:p>
+    <w:p>
+      <w:pPr>
+        <w:shd w:fill="F2F2F2" w:val="clear"/>
+        <w:spacing w:after="0" w:before="0"/>
+      </w:pPr>
+      <w:r>
+        <w:rPr>
+          <w:rFonts w:ascii="Courier New" w:cs="Courier New" w:eastAsia="Courier New" w:hAnsi="Courier New"/>
+          <w:sz w:val="18"/>
+          <w:szCs w:val="18"/>
+        </w:rPr>
+        <w:t xml:space="preserve">SELECT DB_NAME() AS VeritabaniAdi, name AS DosyaAdi,</w:t>
+      </w:r>
+    </w:p>
+    <w:p>
+      <w:pPr>
+        <w:shd w:fill="F2F2F2" w:val="clear"/>
+        <w:spacing w:after="0" w:before="0"/>
+      </w:pPr>
+      <w:r>
+        <w:rPr>
+          <w:rFonts w:ascii="Courier New" w:cs="Courier New" w:eastAsia="Courier New" w:hAnsi="Courier New"/>
+          <w:sz w:val="18"/>
+          <w:szCs w:val="18"/>
+        </w:rPr>
+        <w:t xml:space="preserve">       size * 8 / 1024 AS BoyutMB, type_desc AS DosyaTuru</w:t>
+      </w:r>
+    </w:p>
+    <w:p>
+      <w:pPr>
+        <w:shd w:fill="F2F2F2" w:val="clear"/>
+        <w:spacing w:after="0" w:before="0"/>
+      </w:pPr>
+      <w:r>
+        <w:rPr>
+          <w:rFonts w:ascii="Courier New" w:cs="Courier New" w:eastAsia="Courier New" w:hAnsi="Courier New"/>
+          <w:sz w:val="18"/>
+          <w:szCs w:val="18"/>
+        </w:rPr>
+        <w:t xml:space="preserve">FROM sys.database_files;</w:t>
+      </w:r>
+    </w:p>
+    <w:p>
+      <w:pPr>
+        <w:spacing w:after="100" w:before="100"/>
+      </w:pPr>
+    </w:p>
+    <w:p>
+      <w:pPr>
+        <w:spacing w:after="40" w:before="100"/>
+        <w:jc w:val="center"/>
+      </w:pPr>
+      <w:r>
+        <w:drawing>
+          <wp:inline distT="0" distB="0" distL="0" distR="0">
+            <wp:extent cx="4762500" cy="1905000"/>
+            <wp:effectExtent t="0" r="0" b="0" l="0"/>
+            <wp:docPr id="1" name="Veritabanı dosya boyutları" descr="Veritabanı dosya boyutları" title="Veritabanı dosya boyutları"/>
+            <wp:cNvGraphicFramePr>
+              <a:graphicFrameLocks xmlns:a="http://schemas.openxmlformats.org/drawingml/2006/main" noChangeAspect="1"/>
+            </wp:cNvGraphicFramePr>
+            <a:graphic xmlns:a="http://schemas.openxmlformats.org/drawingml/2006/main">
+              <a:graphicData uri="http://schemas.openxmlformats.org/drawingml/2006/picture">
+                <pic:pic xmlns:pic="http://schemas.openxmlformats.org/drawingml/2006/picture">
+                  <pic:nvPicPr>
+                    <pic:cNvPr id="0" name="" descr=""/>
+                    <pic:cNvPicPr>
+                      <a:picLocks noChangeAspect="1" noChangeArrowheads="1"/>
+                    </pic:cNvPicPr>
+                  </pic:nvPicPr>
+                  <pic:blipFill>
+                    <a:blip r:embed="rId17" cstate="none"/>
+                    <a:srcRect/>
+                    <a:stretch>
+                      <a:fillRect/>
+                    </a:stretch>
+                  </pic:blipFill>
+                  <pic:spPr bwMode="auto">
+                    <a:xfrm>
+                      <a:off x="0" y="0"/>
+                      <a:ext cx="4762500" cy="1905000"/>
+                    </a:xfrm>
+                    <a:prstGeom prst="rect">
+                      <a:avLst/>
+                    </a:prstGeom>
+                  </pic:spPr>
+                </pic:pic>
+              </a:graphicData>
+            </a:graphic>
+          </wp:inline>
+        </w:drawing>
+      </w:r>
+    </w:p>
+    <w:p>
+      <w:pPr>
+        <w:spacing w:after="160" w:before="40"/>
+        <w:jc w:val="center"/>
+      </w:pPr>
+      <w:r>
+        <w:rPr>
+          <w:rFonts w:ascii="Times New Roman" w:cs="Times New Roman" w:eastAsia="Times New Roman" w:hAnsi="Times New Roman"/>
+          <w:i/>
+          <w:iCs/>
+          <w:sz w:val="18"/>
+          <w:szCs w:val="18"/>
+        </w:rPr>
+        <w:t xml:space="preserve">Şekil 9 – NYCTaxi_Sample: Veri dosyası 136MB + Log dosyası 136MB = Toplam 272MB</w:t>
+      </w:r>
+    </w:p>
+    <w:p>
+      <w:pPr>
+        <w:pStyle w:val="Heading2"/>
+        <w:spacing w:after="80" w:before="200"/>
+      </w:pPr>
+      <w:r>
+        <w:rPr>
+          <w:rFonts w:ascii="Times New Roman" w:cs="Times New Roman" w:eastAsia="Times New Roman" w:hAnsi="Times New Roman"/>
+          <w:b/>
+          <w:bCs/>
+          <w:sz w:val="24"/>
+          <w:szCs w:val="24"/>
+        </w:rPr>
+        <w:t xml:space="preserve">3.4 Tablo Bazında Alan Kullanımı</w:t>
+      </w:r>
+    </w:p>
+    <w:p>
+      <w:pPr>
+        <w:spacing w:after="80" w:before="80"/>
+        <w:jc w:val="both"/>
+      </w:pPr>
+      <w:r>
+        <w:rPr>
+          <w:rFonts w:ascii="Times New Roman" w:cs="Times New Roman" w:eastAsia="Times New Roman" w:hAnsi="Times New Roman"/>
+          <w:sz w:val="22"/>
+          <w:szCs w:val="22"/>
+        </w:rPr>
+        <w:t xml:space="preserve">sys.dm_db_partition_stats görünümü ile tablolara ait satır sayıları ve disk kullanımı analiz edilmiştir.</w:t>
+      </w:r>
+    </w:p>
+    <w:p>
+      <w:pPr>
+        <w:shd w:fill="F2F2F2" w:val="clear"/>
+        <w:spacing w:after="0" w:before="0"/>
+      </w:pPr>
+      <w:r>
+        <w:rPr>
+          <w:rFonts w:ascii="Courier New" w:cs="Courier New" w:eastAsia="Courier New" w:hAnsi="Courier New"/>
+          <w:sz w:val="18"/>
+          <w:szCs w:val="18"/>
+        </w:rPr>
+        <w:t xml:space="preserve">SELECT OBJECT_NAME(object_id) AS TabloAdi,</w:t>
+      </w:r>
+    </w:p>
+    <w:p>
+      <w:pPr>
+        <w:shd w:fill="F2F2F2" w:val="clear"/>
+        <w:spacing w:after="0" w:before="0"/>
+      </w:pPr>
+      <w:r>
+        <w:rPr>
+          <w:rFonts w:ascii="Courier New" w:cs="Courier New" w:eastAsia="Courier New" w:hAnsi="Courier New"/>
+          <w:sz w:val="18"/>
+          <w:szCs w:val="18"/>
+        </w:rPr>
+        <w:t xml:space="preserve">       row_count AS SatirSayisi,</w:t>
+      </w:r>
+    </w:p>
+    <w:p>
+      <w:pPr>
+        <w:shd w:fill="F2F2F2" w:val="clear"/>
+        <w:spacing w:after="0" w:before="0"/>
+      </w:pPr>
+      <w:r>
+        <w:rPr>
+          <w:rFonts w:ascii="Courier New" w:cs="Courier New" w:eastAsia="Courier New" w:hAnsi="Courier New"/>
+          <w:sz w:val="18"/>
+          <w:szCs w:val="18"/>
+        </w:rPr>
+        <w:t xml:space="preserve">       reserved_page_count * 8 AS ToplamKB,</w:t>
+      </w:r>
+    </w:p>
+    <w:p>
+      <w:pPr>
+        <w:shd w:fill="F2F2F2" w:val="clear"/>
+        <w:spacing w:after="0" w:before="0"/>
+      </w:pPr>
+      <w:r>
+        <w:rPr>
+          <w:rFonts w:ascii="Courier New" w:cs="Courier New" w:eastAsia="Courier New" w:hAnsi="Courier New"/>
+          <w:sz w:val="18"/>
+          <w:szCs w:val="18"/>
+        </w:rPr>
+        <w:t xml:space="preserve">       used_page_count * 8 AS KullanilanKB</w:t>
+      </w:r>
+    </w:p>
+    <w:p>
+      <w:pPr>
+        <w:shd w:fill="F2F2F2" w:val="clear"/>
+        <w:spacing w:after="0" w:before="0"/>
+      </w:pPr>
+      <w:r>
+        <w:rPr>
+          <w:rFonts w:ascii="Courier New" w:cs="Courier New" w:eastAsia="Courier New" w:hAnsi="Courier New"/>
+          <w:sz w:val="18"/>
+          <w:szCs w:val="18"/>
+        </w:rPr>
+        <w:t xml:space="preserve">FROM sys.dm_db_partition_stats</w:t>
+      </w:r>
+    </w:p>
+    <w:p>
+      <w:pPr>
+        <w:shd w:fill="F2F2F2" w:val="clear"/>
+        <w:spacing w:after="0" w:before="0"/>
+      </w:pPr>
+      <w:r>
+        <w:rPr>
+          <w:rFonts w:ascii="Courier New" w:cs="Courier New" w:eastAsia="Courier New" w:hAnsi="Courier New"/>
+          <w:sz w:val="18"/>
+          <w:szCs w:val="18"/>
+        </w:rPr>
+        <w:t xml:space="preserve">WHERE object_id &gt; 100;</w:t>
+      </w:r>
+    </w:p>
+    <w:p>
+      <w:pPr>
+        <w:spacing w:after="100" w:before="100"/>
+      </w:pPr>
+    </w:p>
+    <w:p>
+      <w:pPr>
+        <w:spacing w:after="40" w:before="100"/>
+        <w:jc w:val="center"/>
+      </w:pPr>
+      <w:r>
+        <w:drawing>
+          <wp:inline distT="0" distB="0" distL="0" distR="0">
+            <wp:extent cx="4762500" cy="3619500"/>
+            <wp:effectExtent t="0" r="0" b="0" l="0"/>
+            <wp:docPr id="1" name="Tablo istatistikleri 1" descr="Tablo istatistikleri 1" title="Tablo istatistikleri 1"/>
+            <wp:cNvGraphicFramePr>
+              <a:graphicFrameLocks xmlns:a="http://schemas.openxmlformats.org/drawingml/2006/main" noChangeAspect="1"/>
+            </wp:cNvGraphicFramePr>
+            <a:graphic xmlns:a="http://schemas.openxmlformats.org/drawingml/2006/main">
+              <a:graphicData uri="http://schemas.openxmlformats.org/drawingml/2006/picture">
+                <pic:pic xmlns:pic="http://schemas.openxmlformats.org/drawingml/2006/picture">
+                  <pic:nvPicPr>
+                    <pic:cNvPr id="0" name="" descr=""/>
+                    <pic:cNvPicPr>
+                      <a:picLocks noChangeAspect="1" noChangeArrowheads="1"/>
+                    </pic:cNvPicPr>
+                  </pic:nvPicPr>
+                  <pic:blipFill>
+                    <a:blip r:embed="rId18" cstate="none"/>
+                    <a:srcRect/>
+                    <a:stretch>
+                      <a:fillRect/>
+                    </a:stretch>
+                  </pic:blipFill>
+                  <pic:spPr bwMode="auto">
+                    <a:xfrm>
+                      <a:off x="0" y="0"/>
+                      <a:ext cx="4762500" cy="3619500"/>
+                    </a:xfrm>
+                    <a:prstGeom prst="rect">
+                      <a:avLst/>
+                    </a:prstGeom>
+                  </pic:spPr>
+                </pic:pic>
+              </a:graphicData>
+            </a:graphic>
+          </wp:inline>
+        </w:drawing>
+      </w:r>
+    </w:p>
+    <w:p>
+      <w:pPr>
+        <w:spacing w:after="160" w:before="40"/>
+        <w:jc w:val="center"/>
+      </w:pPr>
+      <w:r>
+        <w:rPr>
+          <w:rFonts w:ascii="Times New Roman" w:cs="Times New Roman" w:eastAsia="Times New Roman" w:hAnsi="Times New Roman"/>
+          <w:i/>
+          <w:iCs/>
+          <w:sz w:val="18"/>
+          <w:szCs w:val="18"/>
+        </w:rPr>
+        <w:t xml:space="preserve">Şekil 10 – Tablo istatistikleri (sistem tabloları)</w:t>
+      </w:r>
+    </w:p>
+    <w:p>
+      <w:pPr>
+        <w:spacing w:after="40" w:before="100"/>
+        <w:jc w:val="center"/>
+      </w:pPr>
+      <w:r>
+        <w:drawing>
+          <wp:inline distT="0" distB="0" distL="0" distR="0">
+            <wp:extent cx="4762500" cy="3429000"/>
+            <wp:effectExtent t="0" r="0" b="0" l="0"/>
+            <wp:docPr id="1" name="Tablo istatistikleri 2" descr="Tablo istatistikleri 2" title="Tablo istatistikleri 2"/>
+            <wp:cNvGraphicFramePr>
+              <a:graphicFrameLocks xmlns:a="http://schemas.openxmlformats.org/drawingml/2006/main" noChangeAspect="1"/>
+            </wp:cNvGraphicFramePr>
+            <a:graphic xmlns:a="http://schemas.openxmlformats.org/drawingml/2006/main">
+              <a:graphicData uri="http://schemas.openxmlformats.org/drawingml/2006/picture">
+                <pic:pic xmlns:pic="http://schemas.openxmlformats.org/drawingml/2006/picture">
+                  <pic:nvPicPr>
+                    <pic:cNvPr id="0" name="" descr=""/>
+                    <pic:cNvPicPr>
+                      <a:picLocks noChangeAspect="1" noChangeArrowheads="1"/>
+                    </pic:cNvPicPr>
+                  </pic:nvPicPr>
+                  <pic:blipFill>
+                    <a:blip r:embed="rId19" cstate="none"/>
+                    <a:srcRect/>
+                    <a:stretch>
+                      <a:fillRect/>
+                    </a:stretch>
+                  </pic:blipFill>
+                  <pic:spPr bwMode="auto">
+                    <a:xfrm>
+                      <a:off x="0" y="0"/>
+                      <a:ext cx="4762500" cy="3429000"/>
+                    </a:xfrm>
+                    <a:prstGeom prst="rect">
+                      <a:avLst/>
+                    </a:prstGeom>
+                  </pic:spPr>
+                </pic:pic>
+              </a:graphicData>
+            </a:graphic>
+          </wp:inline>
+        </w:drawing>
+      </w:r>
+    </w:p>
+    <w:p>
+      <w:pPr>
+        <w:spacing w:after="160" w:before="40"/>
+        <w:jc w:val="center"/>
+      </w:pPr>
+      <w:r>
+        <w:rPr>
+          <w:rFonts w:ascii="Times New Roman" w:cs="Times New Roman" w:eastAsia="Times New Roman" w:hAnsi="Times New Roman"/>
+          <w:i/>
+          <w:iCs/>
+          <w:sz w:val="18"/>
+          <w:szCs w:val="18"/>
+        </w:rPr>
+        <w:t xml:space="preserve">Şekil 11 – Tablo istatistikleri (devam)</w:t>
+      </w:r>
+    </w:p>
+    <w:p>
+      <w:pPr>
+        <w:spacing w:after="40" w:before="100"/>
+        <w:jc w:val="center"/>
+      </w:pPr>
+      <w:r>
+        <w:drawing>
+          <wp:inline distT="0" distB="0" distL="0" distR="0">
+            <wp:extent cx="4762500" cy="3429000"/>
+            <wp:effectExtent t="0" r="0" b="0" l="0"/>
+            <wp:docPr id="1" name="Tablo istatistikleri 3" descr="Tablo istatistikleri 3" title="Tablo istatistikleri 3"/>
+            <wp:cNvGraphicFramePr>
+              <a:graphicFrameLocks xmlns:a="http://schemas.openxmlformats.org/drawingml/2006/main" noChangeAspect="1"/>
+            </wp:cNvGraphicFramePr>
+            <a:graphic xmlns:a="http://schemas.openxmlformats.org/drawingml/2006/main">
+              <a:graphicData uri="http://schemas.openxmlformats.org/drawingml/2006/picture">
+                <pic:pic xmlns:pic="http://schemas.openxmlformats.org/drawingml/2006/picture">
+                  <pic:nvPicPr>
+                    <pic:cNvPr id="0" name="" descr=""/>
+                    <pic:cNvPicPr>
+                      <a:picLocks noChangeAspect="1" noChangeArrowheads="1"/>
+                    </pic:cNvPicPr>
+                  </pic:nvPicPr>
+                  <pic:blipFill>
+                    <a:blip r:embed="rId20" cstate="none"/>
+                    <a:srcRect/>
+                    <a:stretch>
+                      <a:fillRect/>
+                    </a:stretch>
+                  </pic:blipFill>
+                  <pic:spPr bwMode="auto">
+                    <a:xfrm>
+                      <a:off x="0" y="0"/>
+                      <a:ext cx="4762500" cy="3429000"/>
+                    </a:xfrm>
+                    <a:prstGeom prst="rect">
+                      <a:avLst/>
+                    </a:prstGeom>
+                  </pic:spPr>
+                </pic:pic>
+              </a:graphicData>
+            </a:graphic>
+          </wp:inline>
+        </w:drawing>
+      </w:r>
+    </w:p>
+    <w:p>
+      <w:pPr>
+        <w:spacing w:after="160" w:before="40"/>
+        <w:jc w:val="center"/>
+      </w:pPr>
+      <w:r>
+        <w:rPr>
+          <w:rFonts w:ascii="Times New Roman" w:cs="Times New Roman" w:eastAsia="Times New Roman" w:hAnsi="Times New Roman"/>
+          <w:i/>
+          <w:iCs/>
+          <w:sz w:val="18"/>
+          <w:szCs w:val="18"/>
+        </w:rPr>
+        <w:t xml:space="preserve">Şekil 12 – nyctaxi_sample: 1.703.957 satır, 94.856KB toplam alan</w:t>
+      </w:r>
+    </w:p>
+    <w:p>
+      <w:pPr>
+        <w:spacing w:after="100" w:before="100"/>
+      </w:pPr>
     </w:p>
     <w:p>
       <w:pPr>

</xml_diff>

<commit_message>
Proje1 Adim3: Indeks yonetimi - mevcut indeksler incelendi, yeni indeks olusturuldu, kullanim istatistikleri dogrulandi
</commit_message>
<xml_diff>
--- a/Proje1-PerformansOptimizasyonu/Proje1_Rapor.docx
+++ b/Proje1-PerformansOptimizasyonu/Proje1_Rapor.docx
@@ -1973,14 +1973,1047 @@
       <w:r>
         <w:rPr>
           <w:rFonts w:ascii="Times New Roman" w:cs="Times New Roman" w:eastAsia="Times New Roman" w:hAnsi="Times New Roman"/>
+          <w:sz w:val="22"/>
+          <w:szCs w:val="22"/>
+        </w:rPr>
+        <w:t xml:space="preserve">İndeksler, veritabanı sorgularının performansını artırmak için kullanılan yapılardır. Bu bölümde nyctaxi_sample tablosundaki mevcut indeksler incelenmiş, yeni bir indeks oluşturulmuş ve sorgu performansına etkisi ölçülmüştür.</w:t>
+      </w:r>
+    </w:p>
+    <w:p>
+      <w:pPr>
+        <w:spacing w:after="100" w:before="100"/>
+      </w:pPr>
+    </w:p>
+    <w:p>
+      <w:pPr>
+        <w:pStyle w:val="Heading2"/>
+        <w:spacing w:after="80" w:before="200"/>
+      </w:pPr>
+      <w:r>
+        <w:rPr>
+          <w:rFonts w:ascii="Times New Roman" w:cs="Times New Roman" w:eastAsia="Times New Roman" w:hAnsi="Times New Roman"/>
+          <w:b/>
+          <w:bCs/>
+          <w:sz w:val="24"/>
+          <w:szCs w:val="24"/>
+        </w:rPr>
+        <w:t xml:space="preserve">4.1 Mevcut İndekslerin İncelenmesi</w:t>
+      </w:r>
+    </w:p>
+    <w:p>
+      <w:pPr>
+        <w:spacing w:after="80" w:before="80"/>
+        <w:jc w:val="both"/>
+      </w:pPr>
+      <w:r>
+        <w:rPr>
+          <w:rFonts w:ascii="Times New Roman" w:cs="Times New Roman" w:eastAsia="Times New Roman" w:hAnsi="Times New Roman"/>
+          <w:sz w:val="22"/>
+          <w:szCs w:val="22"/>
+        </w:rPr>
+        <w:t xml:space="preserve">sys.indexes ve sys.index_columns görünümleri kullanılarak tablodaki mevcut indeksler listelenmiştir.</w:t>
+      </w:r>
+    </w:p>
+    <w:p>
+      <w:pPr>
+        <w:shd w:fill="F2F2F2" w:val="clear"/>
+        <w:spacing w:after="0" w:before="0"/>
+      </w:pPr>
+      <w:r>
+        <w:rPr>
+          <w:rFonts w:ascii="Courier New" w:cs="Courier New" w:eastAsia="Courier New" w:hAnsi="Courier New"/>
+          <w:sz w:val="18"/>
+          <w:szCs w:val="18"/>
+        </w:rPr>
+        <w:t xml:space="preserve">SELECT i.name AS IndexAdi, i.type_desc AS IndexTuru,</w:t>
+      </w:r>
+    </w:p>
+    <w:p>
+      <w:pPr>
+        <w:shd w:fill="F2F2F2" w:val="clear"/>
+        <w:spacing w:after="0" w:before="0"/>
+      </w:pPr>
+      <w:r>
+        <w:rPr>
+          <w:rFonts w:ascii="Courier New" w:cs="Courier New" w:eastAsia="Courier New" w:hAnsi="Courier New"/>
+          <w:sz w:val="18"/>
+          <w:szCs w:val="18"/>
+        </w:rPr>
+        <w:t xml:space="preserve">       COL_NAME(ic.object_id, ic.column_id) AS SutunAdi,</w:t>
+      </w:r>
+    </w:p>
+    <w:p>
+      <w:pPr>
+        <w:shd w:fill="F2F2F2" w:val="clear"/>
+        <w:spacing w:after="0" w:before="0"/>
+      </w:pPr>
+      <w:r>
+        <w:rPr>
+          <w:rFonts w:ascii="Courier New" w:cs="Courier New" w:eastAsia="Courier New" w:hAnsi="Courier New"/>
+          <w:sz w:val="18"/>
+          <w:szCs w:val="18"/>
+        </w:rPr>
+        <w:t xml:space="preserve">       i.is_primary_key AS PrimaryKey</w:t>
+      </w:r>
+    </w:p>
+    <w:p>
+      <w:pPr>
+        <w:shd w:fill="F2F2F2" w:val="clear"/>
+        <w:spacing w:after="0" w:before="0"/>
+      </w:pPr>
+      <w:r>
+        <w:rPr>
+          <w:rFonts w:ascii="Courier New" w:cs="Courier New" w:eastAsia="Courier New" w:hAnsi="Courier New"/>
+          <w:sz w:val="18"/>
+          <w:szCs w:val="18"/>
+        </w:rPr>
+        <w:t xml:space="preserve">FROM sys.indexes i</w:t>
+      </w:r>
+    </w:p>
+    <w:p>
+      <w:pPr>
+        <w:shd w:fill="F2F2F2" w:val="clear"/>
+        <w:spacing w:after="0" w:before="0"/>
+      </w:pPr>
+      <w:r>
+        <w:rPr>
+          <w:rFonts w:ascii="Courier New" w:cs="Courier New" w:eastAsia="Courier New" w:hAnsi="Courier New"/>
+          <w:sz w:val="18"/>
+          <w:szCs w:val="18"/>
+        </w:rPr>
+        <w:t xml:space="preserve">JOIN sys.index_columns ic ON i.object_id = ic.object_id</w:t>
+      </w:r>
+    </w:p>
+    <w:p>
+      <w:pPr>
+        <w:shd w:fill="F2F2F2" w:val="clear"/>
+        <w:spacing w:after="0" w:before="0"/>
+      </w:pPr>
+      <w:r>
+        <w:rPr>
+          <w:rFonts w:ascii="Courier New" w:cs="Courier New" w:eastAsia="Courier New" w:hAnsi="Courier New"/>
+          <w:sz w:val="18"/>
+          <w:szCs w:val="18"/>
+        </w:rPr>
+        <w:t xml:space="preserve">WHERE OBJECT_NAME(i.object_id) = 'nyctaxi_sample'</w:t>
+      </w:r>
+    </w:p>
+    <w:p>
+      <w:pPr>
+        <w:shd w:fill="F2F2F2" w:val="clear"/>
+        <w:spacing w:after="0" w:before="0"/>
+      </w:pPr>
+      <w:r>
+        <w:rPr>
+          <w:rFonts w:ascii="Courier New" w:cs="Courier New" w:eastAsia="Courier New" w:hAnsi="Courier New"/>
+          <w:sz w:val="18"/>
+          <w:szCs w:val="18"/>
+        </w:rPr>
+        <w:t xml:space="preserve">ORDER BY i.name;</w:t>
+      </w:r>
+    </w:p>
+    <w:p>
+      <w:pPr>
+        <w:spacing w:after="100" w:before="100"/>
+      </w:pPr>
+    </w:p>
+    <w:p>
+      <w:pPr>
+        <w:spacing w:after="40" w:before="100"/>
+        <w:jc w:val="center"/>
+      </w:pPr>
+      <w:r>
+        <w:drawing>
+          <wp:inline distT="0" distB="0" distL="0" distR="0">
+            <wp:extent cx="4762500" cy="3238500"/>
+            <wp:effectExtent t="0" r="0" b="0" l="0"/>
+            <wp:docPr id="1" name="Mevcut indeksler 1" descr="Mevcut indeksler 1" title="Mevcut indeksler 1"/>
+            <wp:cNvGraphicFramePr>
+              <a:graphicFrameLocks xmlns:a="http://schemas.openxmlformats.org/drawingml/2006/main" noChangeAspect="1"/>
+            </wp:cNvGraphicFramePr>
+            <a:graphic xmlns:a="http://schemas.openxmlformats.org/drawingml/2006/main">
+              <a:graphicData uri="http://schemas.openxmlformats.org/drawingml/2006/picture">
+                <pic:pic xmlns:pic="http://schemas.openxmlformats.org/drawingml/2006/picture">
+                  <pic:nvPicPr>
+                    <pic:cNvPr id="0" name="" descr=""/>
+                    <pic:cNvPicPr>
+                      <a:picLocks noChangeAspect="1" noChangeArrowheads="1"/>
+                    </pic:cNvPicPr>
+                  </pic:nvPicPr>
+                  <pic:blipFill>
+                    <a:blip r:embed="rId21" cstate="none"/>
+                    <a:srcRect/>
+                    <a:stretch>
+                      <a:fillRect/>
+                    </a:stretch>
+                  </pic:blipFill>
+                  <pic:spPr bwMode="auto">
+                    <a:xfrm>
+                      <a:off x="0" y="0"/>
+                      <a:ext cx="4762500" cy="3238500"/>
+                    </a:xfrm>
+                    <a:prstGeom prst="rect">
+                      <a:avLst/>
+                    </a:prstGeom>
+                  </pic:spPr>
+                </pic:pic>
+              </a:graphicData>
+            </a:graphic>
+          </wp:inline>
+        </w:drawing>
+      </w:r>
+    </w:p>
+    <w:p>
+      <w:pPr>
+        <w:spacing w:after="160" w:before="40"/>
+        <w:jc w:val="center"/>
+      </w:pPr>
+      <w:r>
+        <w:rPr>
+          <w:rFonts w:ascii="Times New Roman" w:cs="Times New Roman" w:eastAsia="Times New Roman" w:hAnsi="Times New Roman"/>
           <w:i/>
           <w:iCs/>
-          <w:color w:val="888888"/>
+          <w:sz w:val="18"/>
+          <w:szCs w:val="18"/>
+        </w:rPr>
+        <w:t xml:space="preserve">Şekil 13 – nyctaxi_sample tablosunda nyc_cci adlı CLUSTERED COLUMNSTORE indeksi (1. bölüm)</w:t>
+      </w:r>
+    </w:p>
+    <w:p>
+      <w:pPr>
+        <w:spacing w:after="40" w:before="100"/>
+        <w:jc w:val="center"/>
+      </w:pPr>
+      <w:r>
+        <w:drawing>
+          <wp:inline distT="0" distB="0" distL="0" distR="0">
+            <wp:extent cx="4762500" cy="2952750"/>
+            <wp:effectExtent t="0" r="0" b="0" l="0"/>
+            <wp:docPr id="1" name="Mevcut indeksler 2" descr="Mevcut indeksler 2" title="Mevcut indeksler 2"/>
+            <wp:cNvGraphicFramePr>
+              <a:graphicFrameLocks xmlns:a="http://schemas.openxmlformats.org/drawingml/2006/main" noChangeAspect="1"/>
+            </wp:cNvGraphicFramePr>
+            <a:graphic xmlns:a="http://schemas.openxmlformats.org/drawingml/2006/main">
+              <a:graphicData uri="http://schemas.openxmlformats.org/drawingml/2006/picture">
+                <pic:pic xmlns:pic="http://schemas.openxmlformats.org/drawingml/2006/picture">
+                  <pic:nvPicPr>
+                    <pic:cNvPr id="0" name="" descr=""/>
+                    <pic:cNvPicPr>
+                      <a:picLocks noChangeAspect="1" noChangeArrowheads="1"/>
+                    </pic:cNvPicPr>
+                  </pic:nvPicPr>
+                  <pic:blipFill>
+                    <a:blip r:embed="rId22" cstate="none"/>
+                    <a:srcRect/>
+                    <a:stretch>
+                      <a:fillRect/>
+                    </a:stretch>
+                  </pic:blipFill>
+                  <pic:spPr bwMode="auto">
+                    <a:xfrm>
+                      <a:off x="0" y="0"/>
+                      <a:ext cx="4762500" cy="2952750"/>
+                    </a:xfrm>
+                    <a:prstGeom prst="rect">
+                      <a:avLst/>
+                    </a:prstGeom>
+                  </pic:spPr>
+                </pic:pic>
+              </a:graphicData>
+            </a:graphic>
+          </wp:inline>
+        </w:drawing>
+      </w:r>
+    </w:p>
+    <w:p>
+      <w:pPr>
+        <w:spacing w:after="160" w:before="40"/>
+        <w:jc w:val="center"/>
+      </w:pPr>
+      <w:r>
+        <w:rPr>
+          <w:rFonts w:ascii="Times New Roman" w:cs="Times New Roman" w:eastAsia="Times New Roman" w:hAnsi="Times New Roman"/>
+          <w:i/>
+          <w:iCs/>
+          <w:sz w:val="18"/>
+          <w:szCs w:val="18"/>
+        </w:rPr>
+        <w:t xml:space="preserve">Şekil 14 – CLUSTERED COLUMNSTORE indeksi tüm sütunları kapsıyor (2. bölüm)</w:t>
+      </w:r>
+    </w:p>
+    <w:p>
+      <w:pPr>
+        <w:spacing w:after="40" w:before="100"/>
+        <w:jc w:val="center"/>
+      </w:pPr>
+      <w:r>
+        <w:drawing>
+          <wp:inline distT="0" distB="0" distL="0" distR="0">
+            <wp:extent cx="4762500" cy="2762250"/>
+            <wp:effectExtent t="0" r="0" b="0" l="0"/>
+            <wp:docPr id="1" name="Mevcut indeksler 3" descr="Mevcut indeksler 3" title="Mevcut indeksler 3"/>
+            <wp:cNvGraphicFramePr>
+              <a:graphicFrameLocks xmlns:a="http://schemas.openxmlformats.org/drawingml/2006/main" noChangeAspect="1"/>
+            </wp:cNvGraphicFramePr>
+            <a:graphic xmlns:a="http://schemas.openxmlformats.org/drawingml/2006/main">
+              <a:graphicData uri="http://schemas.openxmlformats.org/drawingml/2006/picture">
+                <pic:pic xmlns:pic="http://schemas.openxmlformats.org/drawingml/2006/picture">
+                  <pic:nvPicPr>
+                    <pic:cNvPr id="0" name="" descr=""/>
+                    <pic:cNvPicPr>
+                      <a:picLocks noChangeAspect="1" noChangeArrowheads="1"/>
+                    </pic:cNvPicPr>
+                  </pic:nvPicPr>
+                  <pic:blipFill>
+                    <a:blip r:embed="rId23" cstate="none"/>
+                    <a:srcRect/>
+                    <a:stretch>
+                      <a:fillRect/>
+                    </a:stretch>
+                  </pic:blipFill>
+                  <pic:spPr bwMode="auto">
+                    <a:xfrm>
+                      <a:off x="0" y="0"/>
+                      <a:ext cx="4762500" cy="2762250"/>
+                    </a:xfrm>
+                    <a:prstGeom prst="rect">
+                      <a:avLst/>
+                    </a:prstGeom>
+                  </pic:spPr>
+                </pic:pic>
+              </a:graphicData>
+            </a:graphic>
+          </wp:inline>
+        </w:drawing>
+      </w:r>
+    </w:p>
+    <w:p>
+      <w:pPr>
+        <w:spacing w:after="160" w:before="40"/>
+        <w:jc w:val="center"/>
+      </w:pPr>
+      <w:r>
+        <w:rPr>
+          <w:rFonts w:ascii="Times New Roman" w:cs="Times New Roman" w:eastAsia="Times New Roman" w:hAnsi="Times New Roman"/>
+          <w:i/>
+          <w:iCs/>
+          <w:sz w:val="18"/>
+          <w:szCs w:val="18"/>
+        </w:rPr>
+        <w:t xml:space="preserve">Şekil 15 – CLUSTERED COLUMNSTORE indeksi (3. bölüm - son sütunlar)</w:t>
+      </w:r>
+    </w:p>
+    <w:p>
+      <w:pPr>
+        <w:spacing w:after="80" w:before="80"/>
+        <w:jc w:val="both"/>
+      </w:pPr>
+      <w:r>
+        <w:rPr>
+          <w:rFonts w:ascii="Times New Roman" w:cs="Times New Roman" w:eastAsia="Times New Roman" w:hAnsi="Times New Roman"/>
           <w:sz w:val="22"/>
           <w:szCs w:val="22"/>
         </w:rPr>
-        <w:t xml:space="preserve">Bu bölüm doldurulacaktır.</w:t>
-      </w:r>
+        <w:t xml:space="preserve">Tespit: nyctaxi_sample tablosunda nyc_cci adında bir CLUSTERED COLUMNSTORE indeksi bulunmaktadır. Bu indeks tablodaki tüm 23 sütunu kapsamaktadır.</w:t>
+      </w:r>
+    </w:p>
+    <w:p>
+      <w:pPr>
+        <w:spacing w:after="100" w:before="100"/>
+      </w:pPr>
+    </w:p>
+    <w:p>
+      <w:pPr>
+        <w:pStyle w:val="Heading2"/>
+        <w:spacing w:after="80" w:before="200"/>
+      </w:pPr>
+      <w:r>
+        <w:rPr>
+          <w:rFonts w:ascii="Times New Roman" w:cs="Times New Roman" w:eastAsia="Times New Roman" w:hAnsi="Times New Roman"/>
+          <w:b/>
+          <w:bCs/>
+          <w:sz w:val="24"/>
+          <w:szCs w:val="24"/>
+        </w:rPr>
+        <w:t xml:space="preserve">4.2 İndeks Öncesi Sorgu Performansı</w:t>
+      </w:r>
+    </w:p>
+    <w:p>
+      <w:pPr>
+        <w:spacing w:after="80" w:before="80"/>
+        <w:jc w:val="both"/>
+      </w:pPr>
+      <w:r>
+        <w:rPr>
+          <w:rFonts w:ascii="Times New Roman" w:cs="Times New Roman" w:eastAsia="Times New Roman" w:hAnsi="Times New Roman"/>
+          <w:sz w:val="22"/>
+          <w:szCs w:val="22"/>
+        </w:rPr>
+        <w:t xml:space="preserve">pickup_datetime sütunu üzerinde tarih aralığı filtreli bir sorgu çalıştırılmış ve performansı ölçülmüştür.</w:t>
+      </w:r>
+    </w:p>
+    <w:p>
+      <w:pPr>
+        <w:shd w:fill="F2F2F2" w:val="clear"/>
+        <w:spacing w:after="0" w:before="0"/>
+      </w:pPr>
+      <w:r>
+        <w:rPr>
+          <w:rFonts w:ascii="Courier New" w:cs="Courier New" w:eastAsia="Courier New" w:hAnsi="Courier New"/>
+          <w:sz w:val="18"/>
+          <w:szCs w:val="18"/>
+        </w:rPr>
+        <w:t xml:space="preserve">SET STATISTICS TIME ON;</w:t>
+      </w:r>
+    </w:p>
+    <w:p>
+      <w:pPr>
+        <w:shd w:fill="F2F2F2" w:val="clear"/>
+        <w:spacing w:after="0" w:before="0"/>
+      </w:pPr>
+      <w:r>
+        <w:rPr>
+          <w:rFonts w:ascii="Courier New" w:cs="Courier New" w:eastAsia="Courier New" w:hAnsi="Courier New"/>
+          <w:sz w:val="18"/>
+          <w:szCs w:val="18"/>
+        </w:rPr>
+        <w:t xml:space="preserve">SELECT COUNT(*) FROM nyctaxi_sample</w:t>
+      </w:r>
+    </w:p>
+    <w:p>
+      <w:pPr>
+        <w:shd w:fill="F2F2F2" w:val="clear"/>
+        <w:spacing w:after="0" w:before="0"/>
+      </w:pPr>
+      <w:r>
+        <w:rPr>
+          <w:rFonts w:ascii="Courier New" w:cs="Courier New" w:eastAsia="Courier New" w:hAnsi="Courier New"/>
+          <w:sz w:val="18"/>
+          <w:szCs w:val="18"/>
+        </w:rPr>
+        <w:t xml:space="preserve">WHERE pickup_datetime BETWEEN '2013-10-01' AND '2013-10-31';</w:t>
+      </w:r>
+    </w:p>
+    <w:p>
+      <w:pPr>
+        <w:shd w:fill="F2F2F2" w:val="clear"/>
+        <w:spacing w:after="0" w:before="0"/>
+      </w:pPr>
+      <w:r>
+        <w:rPr>
+          <w:rFonts w:ascii="Courier New" w:cs="Courier New" w:eastAsia="Courier New" w:hAnsi="Courier New"/>
+          <w:sz w:val="18"/>
+          <w:szCs w:val="18"/>
+        </w:rPr>
+        <w:t xml:space="preserve">SET STATISTICS TIME OFF;</w:t>
+      </w:r>
+    </w:p>
+    <w:p>
+      <w:pPr>
+        <w:spacing w:after="100" w:before="100"/>
+      </w:pPr>
+    </w:p>
+    <w:p>
+      <w:pPr>
+        <w:spacing w:after="40" w:before="100"/>
+        <w:jc w:val="center"/>
+      </w:pPr>
+      <w:r>
+        <w:drawing>
+          <wp:inline distT="0" distB="0" distL="0" distR="0">
+            <wp:extent cx="4762500" cy="2476500"/>
+            <wp:effectExtent t="0" r="0" b="0" l="0"/>
+            <wp:docPr id="1" name="İndeks öncesi sorgu" descr="İndeks öncesi sorgu" title="İndeks öncesi sorgu"/>
+            <wp:cNvGraphicFramePr>
+              <a:graphicFrameLocks xmlns:a="http://schemas.openxmlformats.org/drawingml/2006/main" noChangeAspect="1"/>
+            </wp:cNvGraphicFramePr>
+            <a:graphic xmlns:a="http://schemas.openxmlformats.org/drawingml/2006/main">
+              <a:graphicData uri="http://schemas.openxmlformats.org/drawingml/2006/picture">
+                <pic:pic xmlns:pic="http://schemas.openxmlformats.org/drawingml/2006/picture">
+                  <pic:nvPicPr>
+                    <pic:cNvPr id="0" name="" descr=""/>
+                    <pic:cNvPicPr>
+                      <a:picLocks noChangeAspect="1" noChangeArrowheads="1"/>
+                    </pic:cNvPicPr>
+                  </pic:nvPicPr>
+                  <pic:blipFill>
+                    <a:blip r:embed="rId24" cstate="none"/>
+                    <a:srcRect/>
+                    <a:stretch>
+                      <a:fillRect/>
+                    </a:stretch>
+                  </pic:blipFill>
+                  <pic:spPr bwMode="auto">
+                    <a:xfrm>
+                      <a:off x="0" y="0"/>
+                      <a:ext cx="4762500" cy="2476500"/>
+                    </a:xfrm>
+                    <a:prstGeom prst="rect">
+                      <a:avLst/>
+                    </a:prstGeom>
+                  </pic:spPr>
+                </pic:pic>
+              </a:graphicData>
+            </a:graphic>
+          </wp:inline>
+        </w:drawing>
+      </w:r>
+    </w:p>
+    <w:p>
+      <w:pPr>
+        <w:spacing w:after="160" w:before="40"/>
+        <w:jc w:val="center"/>
+      </w:pPr>
+      <w:r>
+        <w:rPr>
+          <w:rFonts w:ascii="Times New Roman" w:cs="Times New Roman" w:eastAsia="Times New Roman" w:hAnsi="Times New Roman"/>
+          <w:i/>
+          <w:iCs/>
+          <w:sz w:val="18"/>
+          <w:szCs w:val="18"/>
+        </w:rPr>
+        <w:t xml:space="preserve">Şekil 16 – Ekim 2013 yolculukları: 142.142 kayıt döndü</w:t>
+      </w:r>
+    </w:p>
+    <w:p>
+      <w:pPr>
+        <w:pStyle w:val="Heading2"/>
+        <w:spacing w:after="80" w:before="200"/>
+      </w:pPr>
+      <w:r>
+        <w:rPr>
+          <w:rFonts w:ascii="Times New Roman" w:cs="Times New Roman" w:eastAsia="Times New Roman" w:hAnsi="Times New Roman"/>
+          <w:b/>
+          <w:bCs/>
+          <w:sz w:val="24"/>
+          <w:szCs w:val="24"/>
+        </w:rPr>
+        <w:t xml:space="preserve">4.3 Yeni İndeks Oluşturma</w:t>
+      </w:r>
+    </w:p>
+    <w:p>
+      <w:pPr>
+        <w:spacing w:after="80" w:before="80"/>
+        <w:jc w:val="both"/>
+      </w:pPr>
+      <w:r>
+        <w:rPr>
+          <w:rFonts w:ascii="Times New Roman" w:cs="Times New Roman" w:eastAsia="Times New Roman" w:hAnsi="Times New Roman"/>
+          <w:sz w:val="22"/>
+          <w:szCs w:val="22"/>
+        </w:rPr>
+        <w:t xml:space="preserve">pickup_datetime sütununa tarih bazlı sorgular için ayrı bir B-Tree indeksi oluşturulmuştur.</w:t>
+      </w:r>
+    </w:p>
+    <w:p>
+      <w:pPr>
+        <w:shd w:fill="F2F2F2" w:val="clear"/>
+        <w:spacing w:after="0" w:before="0"/>
+      </w:pPr>
+      <w:r>
+        <w:rPr>
+          <w:rFonts w:ascii="Courier New" w:cs="Courier New" w:eastAsia="Courier New" w:hAnsi="Courier New"/>
+          <w:sz w:val="18"/>
+          <w:szCs w:val="18"/>
+        </w:rPr>
+        <w:t xml:space="preserve">CREATE INDEX IX_nyctaxi_pickup_datetime</w:t>
+      </w:r>
+    </w:p>
+    <w:p>
+      <w:pPr>
+        <w:shd w:fill="F2F2F2" w:val="clear"/>
+        <w:spacing w:after="0" w:before="0"/>
+      </w:pPr>
+      <w:r>
+        <w:rPr>
+          <w:rFonts w:ascii="Courier New" w:cs="Courier New" w:eastAsia="Courier New" w:hAnsi="Courier New"/>
+          <w:sz w:val="18"/>
+          <w:szCs w:val="18"/>
+        </w:rPr>
+        <w:t xml:space="preserve">ON nyctaxi_sample (pickup_datetime);</w:t>
+      </w:r>
+    </w:p>
+    <w:p>
+      <w:pPr>
+        <w:spacing w:after="100" w:before="100"/>
+      </w:pPr>
+    </w:p>
+    <w:p>
+      <w:pPr>
+        <w:spacing w:after="40" w:before="100"/>
+        <w:jc w:val="center"/>
+      </w:pPr>
+      <w:r>
+        <w:drawing>
+          <wp:inline distT="0" distB="0" distL="0" distR="0">
+            <wp:extent cx="5334000" cy="1619250"/>
+            <wp:effectExtent t="0" r="0" b="0" l="0"/>
+            <wp:docPr id="1" name="İndeks oluşturma" descr="İndeks oluşturma" title="İndeks oluşturma"/>
+            <wp:cNvGraphicFramePr>
+              <a:graphicFrameLocks xmlns:a="http://schemas.openxmlformats.org/drawingml/2006/main" noChangeAspect="1"/>
+            </wp:cNvGraphicFramePr>
+            <a:graphic xmlns:a="http://schemas.openxmlformats.org/drawingml/2006/main">
+              <a:graphicData uri="http://schemas.openxmlformats.org/drawingml/2006/picture">
+                <pic:pic xmlns:pic="http://schemas.openxmlformats.org/drawingml/2006/picture">
+                  <pic:nvPicPr>
+                    <pic:cNvPr id="0" name="" descr=""/>
+                    <pic:cNvPicPr>
+                      <a:picLocks noChangeAspect="1" noChangeArrowheads="1"/>
+                    </pic:cNvPicPr>
+                  </pic:nvPicPr>
+                  <pic:blipFill>
+                    <a:blip r:embed="rId25" cstate="none"/>
+                    <a:srcRect/>
+                    <a:stretch>
+                      <a:fillRect/>
+                    </a:stretch>
+                  </pic:blipFill>
+                  <pic:spPr bwMode="auto">
+                    <a:xfrm>
+                      <a:off x="0" y="0"/>
+                      <a:ext cx="5334000" cy="1619250"/>
+                    </a:xfrm>
+                    <a:prstGeom prst="rect">
+                      <a:avLst/>
+                    </a:prstGeom>
+                  </pic:spPr>
+                </pic:pic>
+              </a:graphicData>
+            </a:graphic>
+          </wp:inline>
+        </w:drawing>
+      </w:r>
+    </w:p>
+    <w:p>
+      <w:pPr>
+        <w:spacing w:after="160" w:before="40"/>
+        <w:jc w:val="center"/>
+      </w:pPr>
+      <w:r>
+        <w:rPr>
+          <w:rFonts w:ascii="Times New Roman" w:cs="Times New Roman" w:eastAsia="Times New Roman" w:hAnsi="Times New Roman"/>
+          <w:i/>
+          <w:iCs/>
+          <w:sz w:val="18"/>
+          <w:szCs w:val="18"/>
+        </w:rPr>
+        <w:t xml:space="preserve">Şekil 17 – İndeks daha önce oluşturulduğundan 'already exists' hatası alındı; indeksin aktif olduğunu doğrular</w:t>
+      </w:r>
+    </w:p>
+    <w:p>
+      <w:pPr>
+        <w:pStyle w:val="Heading2"/>
+        <w:spacing w:after="80" w:before="200"/>
+      </w:pPr>
+      <w:r>
+        <w:rPr>
+          <w:rFonts w:ascii="Times New Roman" w:cs="Times New Roman" w:eastAsia="Times New Roman" w:hAnsi="Times New Roman"/>
+          <w:b/>
+          <w:bCs/>
+          <w:sz w:val="24"/>
+          <w:szCs w:val="24"/>
+        </w:rPr>
+        <w:t xml:space="preserve">4.4 İndeks Sonrası Sorgu Performansı</w:t>
+      </w:r>
+    </w:p>
+    <w:p>
+      <w:pPr>
+        <w:spacing w:after="80" w:before="80"/>
+        <w:jc w:val="both"/>
+      </w:pPr>
+      <w:r>
+        <w:rPr>
+          <w:rFonts w:ascii="Times New Roman" w:cs="Times New Roman" w:eastAsia="Times New Roman" w:hAnsi="Times New Roman"/>
+          <w:sz w:val="22"/>
+          <w:szCs w:val="22"/>
+        </w:rPr>
+        <w:t xml:space="preserve">Aynı sorgu IX_nyctaxi_pickup_datetime indeksi aktifken tekrar çalıştırılmıştır.</w:t>
+      </w:r>
+    </w:p>
+    <w:p>
+      <w:pPr>
+        <w:shd w:fill="F2F2F2" w:val="clear"/>
+        <w:spacing w:after="0" w:before="0"/>
+      </w:pPr>
+      <w:r>
+        <w:rPr>
+          <w:rFonts w:ascii="Courier New" w:cs="Courier New" w:eastAsia="Courier New" w:hAnsi="Courier New"/>
+          <w:sz w:val="18"/>
+          <w:szCs w:val="18"/>
+        </w:rPr>
+        <w:t xml:space="preserve">SET STATISTICS TIME ON;</w:t>
+      </w:r>
+    </w:p>
+    <w:p>
+      <w:pPr>
+        <w:shd w:fill="F2F2F2" w:val="clear"/>
+        <w:spacing w:after="0" w:before="0"/>
+      </w:pPr>
+      <w:r>
+        <w:rPr>
+          <w:rFonts w:ascii="Courier New" w:cs="Courier New" w:eastAsia="Courier New" w:hAnsi="Courier New"/>
+          <w:sz w:val="18"/>
+          <w:szCs w:val="18"/>
+        </w:rPr>
+        <w:t xml:space="preserve">SELECT COUNT(*) FROM nyctaxi_sample</w:t>
+      </w:r>
+    </w:p>
+    <w:p>
+      <w:pPr>
+        <w:shd w:fill="F2F2F2" w:val="clear"/>
+        <w:spacing w:after="0" w:before="0"/>
+      </w:pPr>
+      <w:r>
+        <w:rPr>
+          <w:rFonts w:ascii="Courier New" w:cs="Courier New" w:eastAsia="Courier New" w:hAnsi="Courier New"/>
+          <w:sz w:val="18"/>
+          <w:szCs w:val="18"/>
+        </w:rPr>
+        <w:t xml:space="preserve">WHERE pickup_datetime BETWEEN '2013-10-01' AND '2013-10-31';</w:t>
+      </w:r>
+    </w:p>
+    <w:p>
+      <w:pPr>
+        <w:shd w:fill="F2F2F2" w:val="clear"/>
+        <w:spacing w:after="0" w:before="0"/>
+      </w:pPr>
+      <w:r>
+        <w:rPr>
+          <w:rFonts w:ascii="Courier New" w:cs="Courier New" w:eastAsia="Courier New" w:hAnsi="Courier New"/>
+          <w:sz w:val="18"/>
+          <w:szCs w:val="18"/>
+        </w:rPr>
+        <w:t xml:space="preserve">SET STATISTICS TIME OFF;</w:t>
+      </w:r>
+    </w:p>
+    <w:p>
+      <w:pPr>
+        <w:spacing w:after="100" w:before="100"/>
+      </w:pPr>
+    </w:p>
+    <w:p>
+      <w:pPr>
+        <w:spacing w:after="40" w:before="100"/>
+        <w:jc w:val="center"/>
+      </w:pPr>
+      <w:r>
+        <w:drawing>
+          <wp:inline distT="0" distB="0" distL="0" distR="0">
+            <wp:extent cx="4762500" cy="2381250"/>
+            <wp:effectExtent t="0" r="0" b="0" l="0"/>
+            <wp:docPr id="1" name="İndeks sonrası sorgu" descr="İndeks sonrası sorgu" title="İndeks sonrası sorgu"/>
+            <wp:cNvGraphicFramePr>
+              <a:graphicFrameLocks xmlns:a="http://schemas.openxmlformats.org/drawingml/2006/main" noChangeAspect="1"/>
+            </wp:cNvGraphicFramePr>
+            <a:graphic xmlns:a="http://schemas.openxmlformats.org/drawingml/2006/main">
+              <a:graphicData uri="http://schemas.openxmlformats.org/drawingml/2006/picture">
+                <pic:pic xmlns:pic="http://schemas.openxmlformats.org/drawingml/2006/picture">
+                  <pic:nvPicPr>
+                    <pic:cNvPr id="0" name="" descr=""/>
+                    <pic:cNvPicPr>
+                      <a:picLocks noChangeAspect="1" noChangeArrowheads="1"/>
+                    </pic:cNvPicPr>
+                  </pic:nvPicPr>
+                  <pic:blipFill>
+                    <a:blip r:embed="rId26" cstate="none"/>
+                    <a:srcRect/>
+                    <a:stretch>
+                      <a:fillRect/>
+                    </a:stretch>
+                  </pic:blipFill>
+                  <pic:spPr bwMode="auto">
+                    <a:xfrm>
+                      <a:off x="0" y="0"/>
+                      <a:ext cx="4762500" cy="2381250"/>
+                    </a:xfrm>
+                    <a:prstGeom prst="rect">
+                      <a:avLst/>
+                    </a:prstGeom>
+                  </pic:spPr>
+                </pic:pic>
+              </a:graphicData>
+            </a:graphic>
+          </wp:inline>
+        </w:drawing>
+      </w:r>
+    </w:p>
+    <w:p>
+      <w:pPr>
+        <w:spacing w:after="160" w:before="40"/>
+        <w:jc w:val="center"/>
+      </w:pPr>
+      <w:r>
+        <w:rPr>
+          <w:rFonts w:ascii="Times New Roman" w:cs="Times New Roman" w:eastAsia="Times New Roman" w:hAnsi="Times New Roman"/>
+          <w:i/>
+          <w:iCs/>
+          <w:sz w:val="18"/>
+          <w:szCs w:val="18"/>
+        </w:rPr>
+        <w:t xml:space="preserve">Şekil 18 – İndeks aktifken aynı sorgu çalıştırıldı: 142.142 kayıt</w:t>
+      </w:r>
+    </w:p>
+    <w:p>
+      <w:pPr>
+        <w:pStyle w:val="Heading2"/>
+        <w:spacing w:after="80" w:before="200"/>
+      </w:pPr>
+      <w:r>
+        <w:rPr>
+          <w:rFonts w:ascii="Times New Roman" w:cs="Times New Roman" w:eastAsia="Times New Roman" w:hAnsi="Times New Roman"/>
+          <w:b/>
+          <w:bCs/>
+          <w:sz w:val="24"/>
+          <w:szCs w:val="24"/>
+        </w:rPr>
+        <w:t xml:space="preserve">4.5 İndeks Kullanım İstatistikleri</w:t>
+      </w:r>
+    </w:p>
+    <w:p>
+      <w:pPr>
+        <w:spacing w:after="80" w:before="80"/>
+        <w:jc w:val="both"/>
+      </w:pPr>
+      <w:r>
+        <w:rPr>
+          <w:rFonts w:ascii="Times New Roman" w:cs="Times New Roman" w:eastAsia="Times New Roman" w:hAnsi="Times New Roman"/>
+          <w:sz w:val="22"/>
+          <w:szCs w:val="22"/>
+        </w:rPr>
+        <w:t xml:space="preserve">sys.dm_db_index_usage_stats görünümü ile oluşturulan indeksin kullanılıp kullanılmadığı doğrulanmıştır.</w:t>
+      </w:r>
+    </w:p>
+    <w:p>
+      <w:pPr>
+        <w:shd w:fill="F2F2F2" w:val="clear"/>
+        <w:spacing w:after="0" w:before="0"/>
+      </w:pPr>
+      <w:r>
+        <w:rPr>
+          <w:rFonts w:ascii="Courier New" w:cs="Courier New" w:eastAsia="Courier New" w:hAnsi="Courier New"/>
+          <w:sz w:val="18"/>
+          <w:szCs w:val="18"/>
+        </w:rPr>
+        <w:t xml:space="preserve">SELECT i.name AS IndexAdi, s.user_seeks, s.user_scans,</w:t>
+      </w:r>
+    </w:p>
+    <w:p>
+      <w:pPr>
+        <w:shd w:fill="F2F2F2" w:val="clear"/>
+        <w:spacing w:after="0" w:before="0"/>
+      </w:pPr>
+      <w:r>
+        <w:rPr>
+          <w:rFonts w:ascii="Courier New" w:cs="Courier New" w:eastAsia="Courier New" w:hAnsi="Courier New"/>
+          <w:sz w:val="18"/>
+          <w:szCs w:val="18"/>
+        </w:rPr>
+        <w:t xml:space="preserve">       s.user_lookups, s.user_updates</w:t>
+      </w:r>
+    </w:p>
+    <w:p>
+      <w:pPr>
+        <w:shd w:fill="F2F2F2" w:val="clear"/>
+        <w:spacing w:after="0" w:before="0"/>
+      </w:pPr>
+      <w:r>
+        <w:rPr>
+          <w:rFonts w:ascii="Courier New" w:cs="Courier New" w:eastAsia="Courier New" w:hAnsi="Courier New"/>
+          <w:sz w:val="18"/>
+          <w:szCs w:val="18"/>
+        </w:rPr>
+        <w:t xml:space="preserve">FROM sys.indexes i</w:t>
+      </w:r>
+    </w:p>
+    <w:p>
+      <w:pPr>
+        <w:shd w:fill="F2F2F2" w:val="clear"/>
+        <w:spacing w:after="0" w:before="0"/>
+      </w:pPr>
+      <w:r>
+        <w:rPr>
+          <w:rFonts w:ascii="Courier New" w:cs="Courier New" w:eastAsia="Courier New" w:hAnsi="Courier New"/>
+          <w:sz w:val="18"/>
+          <w:szCs w:val="18"/>
+        </w:rPr>
+        <w:t xml:space="preserve">LEFT JOIN sys.dm_db_index_usage_stats s</w:t>
+      </w:r>
+    </w:p>
+    <w:p>
+      <w:pPr>
+        <w:shd w:fill="F2F2F2" w:val="clear"/>
+        <w:spacing w:after="0" w:before="0"/>
+      </w:pPr>
+      <w:r>
+        <w:rPr>
+          <w:rFonts w:ascii="Courier New" w:cs="Courier New" w:eastAsia="Courier New" w:hAnsi="Courier New"/>
+          <w:sz w:val="18"/>
+          <w:szCs w:val="18"/>
+        </w:rPr>
+        <w:t xml:space="preserve">    ON i.object_id = s.object_id AND i.index_id = s.index_id</w:t>
+      </w:r>
+    </w:p>
+    <w:p>
+      <w:pPr>
+        <w:shd w:fill="F2F2F2" w:val="clear"/>
+        <w:spacing w:after="0" w:before="0"/>
+      </w:pPr>
+      <w:r>
+        <w:rPr>
+          <w:rFonts w:ascii="Courier New" w:cs="Courier New" w:eastAsia="Courier New" w:hAnsi="Courier New"/>
+          <w:sz w:val="18"/>
+          <w:szCs w:val="18"/>
+        </w:rPr>
+        <w:t xml:space="preserve">WHERE OBJECT_NAME(i.object_id) = 'nyctaxi_sample';</w:t>
+      </w:r>
+    </w:p>
+    <w:p>
+      <w:pPr>
+        <w:spacing w:after="100" w:before="100"/>
+      </w:pPr>
+    </w:p>
+    <w:p>
+      <w:pPr>
+        <w:spacing w:after="40" w:before="100"/>
+        <w:jc w:val="center"/>
+      </w:pPr>
+      <w:r>
+        <w:drawing>
+          <wp:inline distT="0" distB="0" distL="0" distR="0">
+            <wp:extent cx="4953000" cy="1619250"/>
+            <wp:effectExtent t="0" r="0" b="0" l="0"/>
+            <wp:docPr id="1" name="İndeks kullanım istatistikleri 1" descr="İndeks kullanım istatistikleri 1" title="İndeks kullanım istatistikleri 1"/>
+            <wp:cNvGraphicFramePr>
+              <a:graphicFrameLocks xmlns:a="http://schemas.openxmlformats.org/drawingml/2006/main" noChangeAspect="1"/>
+            </wp:cNvGraphicFramePr>
+            <a:graphic xmlns:a="http://schemas.openxmlformats.org/drawingml/2006/main">
+              <a:graphicData uri="http://schemas.openxmlformats.org/drawingml/2006/picture">
+                <pic:pic xmlns:pic="http://schemas.openxmlformats.org/drawingml/2006/picture">
+                  <pic:nvPicPr>
+                    <pic:cNvPr id="0" name="" descr=""/>
+                    <pic:cNvPicPr>
+                      <a:picLocks noChangeAspect="1" noChangeArrowheads="1"/>
+                    </pic:cNvPicPr>
+                  </pic:nvPicPr>
+                  <pic:blipFill>
+                    <a:blip r:embed="rId27" cstate="none"/>
+                    <a:srcRect/>
+                    <a:stretch>
+                      <a:fillRect/>
+                    </a:stretch>
+                  </pic:blipFill>
+                  <pic:spPr bwMode="auto">
+                    <a:xfrm>
+                      <a:off x="0" y="0"/>
+                      <a:ext cx="4953000" cy="1619250"/>
+                    </a:xfrm>
+                    <a:prstGeom prst="rect">
+                      <a:avLst/>
+                    </a:prstGeom>
+                  </pic:spPr>
+                </pic:pic>
+              </a:graphicData>
+            </a:graphic>
+          </wp:inline>
+        </w:drawing>
+      </w:r>
+    </w:p>
+    <w:p>
+      <w:pPr>
+        <w:spacing w:after="160" w:before="40"/>
+        <w:jc w:val="center"/>
+      </w:pPr>
+      <w:r>
+        <w:rPr>
+          <w:rFonts w:ascii="Times New Roman" w:cs="Times New Roman" w:eastAsia="Times New Roman" w:hAnsi="Times New Roman"/>
+          <w:i/>
+          <w:iCs/>
+          <w:sz w:val="18"/>
+          <w:szCs w:val="18"/>
+        </w:rPr>
+        <w:t xml:space="preserve">Şekil 19 – IX_nyctaxi_pickup_datetime: 1 seek (indeks başarıyla kullanıldı)</w:t>
+      </w:r>
+    </w:p>
+    <w:p>
+      <w:pPr>
+        <w:spacing w:after="40" w:before="100"/>
+        <w:jc w:val="center"/>
+      </w:pPr>
+      <w:r>
+        <w:drawing>
+          <wp:inline distT="0" distB="0" distL="0" distR="0">
+            <wp:extent cx="4953000" cy="1619250"/>
+            <wp:effectExtent t="0" r="0" b="0" l="0"/>
+            <wp:docPr id="1" name="İndeks kullanım istatistikleri 2" descr="İndeks kullanım istatistikleri 2" title="İndeks kullanım istatistikleri 2"/>
+            <wp:cNvGraphicFramePr>
+              <a:graphicFrameLocks xmlns:a="http://schemas.openxmlformats.org/drawingml/2006/main" noChangeAspect="1"/>
+            </wp:cNvGraphicFramePr>
+            <a:graphic xmlns:a="http://schemas.openxmlformats.org/drawingml/2006/main">
+              <a:graphicData uri="http://schemas.openxmlformats.org/drawingml/2006/picture">
+                <pic:pic xmlns:pic="http://schemas.openxmlformats.org/drawingml/2006/picture">
+                  <pic:nvPicPr>
+                    <pic:cNvPr id="0" name="" descr=""/>
+                    <pic:cNvPicPr>
+                      <a:picLocks noChangeAspect="1" noChangeArrowheads="1"/>
+                    </pic:cNvPicPr>
+                  </pic:nvPicPr>
+                  <pic:blipFill>
+                    <a:blip r:embed="rId28" cstate="none"/>
+                    <a:srcRect/>
+                    <a:stretch>
+                      <a:fillRect/>
+                    </a:stretch>
+                  </pic:blipFill>
+                  <pic:spPr bwMode="auto">
+                    <a:xfrm>
+                      <a:off x="0" y="0"/>
+                      <a:ext cx="4953000" cy="1619250"/>
+                    </a:xfrm>
+                    <a:prstGeom prst="rect">
+                      <a:avLst/>
+                    </a:prstGeom>
+                  </pic:spPr>
+                </pic:pic>
+              </a:graphicData>
+            </a:graphic>
+          </wp:inline>
+        </w:drawing>
+      </w:r>
+    </w:p>
+    <w:p>
+      <w:pPr>
+        <w:spacing w:after="160" w:before="40"/>
+        <w:jc w:val="center"/>
+      </w:pPr>
+      <w:r>
+        <w:rPr>
+          <w:rFonts w:ascii="Times New Roman" w:cs="Times New Roman" w:eastAsia="Times New Roman" w:hAnsi="Times New Roman"/>
+          <w:i/>
+          <w:iCs/>
+          <w:sz w:val="18"/>
+          <w:szCs w:val="18"/>
+        </w:rPr>
+        <w:t xml:space="preserve">Şekil 20 – nyc_cci: 3 scan, IX_nyctaxi_pickup_datetime: 1 seek</w:t>
+      </w:r>
+    </w:p>
+    <w:p>
+      <w:pPr>
+        <w:spacing w:after="80" w:before="80"/>
+        <w:jc w:val="both"/>
+      </w:pPr>
+      <w:r>
+        <w:rPr>
+          <w:rFonts w:ascii="Times New Roman" w:cs="Times New Roman" w:eastAsia="Times New Roman" w:hAnsi="Times New Roman"/>
+          <w:sz w:val="22"/>
+          <w:szCs w:val="22"/>
+        </w:rPr>
+        <w:t xml:space="preserve">Sonuç: Oluşturulan indeks sorgu tarafından aktif olarak kullanılmış ve seek işlemi gerçekleştirmiştir.</w:t>
+      </w:r>
+    </w:p>
+    <w:p>
+      <w:pPr>
+        <w:spacing w:after="100" w:before="100"/>
+      </w:pPr>
     </w:p>
     <w:p>
       <w:pPr>

</xml_diff>

<commit_message>
Proje1 Adim4: Sorgu optimizasyonu tamamlandi - YEAR() vs tarih aralik karsilastirmasi, Execution Plan analizi, en pahali yolculuklar
</commit_message>
<xml_diff>
--- a/Proje1-PerformansOptimizasyonu/Proje1_Rapor.docx
+++ b/Proje1-PerformansOptimizasyonu/Proje1_Rapor.docx
@@ -3039,14 +3039,722 @@
       <w:r>
         <w:rPr>
           <w:rFonts w:ascii="Times New Roman" w:cs="Times New Roman" w:eastAsia="Times New Roman" w:hAnsi="Times New Roman"/>
+          <w:sz w:val="22"/>
+          <w:szCs w:val="22"/>
+        </w:rPr>
+        <w:t xml:space="preserve">Sorgu optimizasyonu, veritabanı performansını artırmanın en etkili yollarından biridir. Bu bölümde aynı sonucu döndüren sorgular farklı yazım biçimleriyle karşılaştırılmış; fonksiyon kullanımının indeks üzerindeki olumsuz etkisi ve doğru yazım biçiminin performans kazanımı gözlemlenmiştir.</w:t>
+      </w:r>
+    </w:p>
+    <w:p>
+      <w:pPr>
+        <w:spacing w:after="100" w:before="100"/>
+      </w:pPr>
+    </w:p>
+    <w:p>
+      <w:pPr>
+        <w:pStyle w:val="Heading2"/>
+        <w:spacing w:after="80" w:before="200"/>
+      </w:pPr>
+      <w:r>
+        <w:rPr>
+          <w:rFonts w:ascii="Times New Roman" w:cs="Times New Roman" w:eastAsia="Times New Roman" w:hAnsi="Times New Roman"/>
+          <w:b/>
+          <w:bCs/>
+          <w:sz w:val="24"/>
+          <w:szCs w:val="24"/>
+        </w:rPr>
+        <w:t xml:space="preserve">5.1 Optimize Edilmemiş Sorgu – YEAR() Fonksiyonu</w:t>
+      </w:r>
+    </w:p>
+    <w:p>
+      <w:pPr>
+        <w:spacing w:after="80" w:before="80"/>
+        <w:jc w:val="both"/>
+      </w:pPr>
+      <w:r>
+        <w:rPr>
+          <w:rFonts w:ascii="Times New Roman" w:cs="Times New Roman" w:eastAsia="Times New Roman" w:hAnsi="Times New Roman"/>
+          <w:sz w:val="22"/>
+          <w:szCs w:val="22"/>
+        </w:rPr>
+        <w:t xml:space="preserve">YEAR() gibi fonksiyonların WHERE koşulunda kullanılması, SQL Server'ın indeks seek yapmasını engeller; bunun yerine tüm tablo taranır (index scan veya table scan).</w:t>
+      </w:r>
+    </w:p>
+    <w:p>
+      <w:pPr>
+        <w:shd w:fill="F2F2F2" w:val="clear"/>
+        <w:spacing w:after="0" w:before="0"/>
+      </w:pPr>
+      <w:r>
+        <w:rPr>
+          <w:rFonts w:ascii="Courier New" w:cs="Courier New" w:eastAsia="Courier New" w:hAnsi="Courier New"/>
+          <w:sz w:val="18"/>
+          <w:szCs w:val="18"/>
+        </w:rPr>
+        <w:t xml:space="preserve">SELECT payment_type, COUNT(*) AS Adet</w:t>
+      </w:r>
+    </w:p>
+    <w:p>
+      <w:pPr>
+        <w:shd w:fill="F2F2F2" w:val="clear"/>
+        <w:spacing w:after="0" w:before="0"/>
+      </w:pPr>
+      <w:r>
+        <w:rPr>
+          <w:rFonts w:ascii="Courier New" w:cs="Courier New" w:eastAsia="Courier New" w:hAnsi="Courier New"/>
+          <w:sz w:val="18"/>
+          <w:szCs w:val="18"/>
+        </w:rPr>
+        <w:t xml:space="preserve">FROM nyctaxi_sample</w:t>
+      </w:r>
+    </w:p>
+    <w:p>
+      <w:pPr>
+        <w:shd w:fill="F2F2F2" w:val="clear"/>
+        <w:spacing w:after="0" w:before="0"/>
+      </w:pPr>
+      <w:r>
+        <w:rPr>
+          <w:rFonts w:ascii="Courier New" w:cs="Courier New" w:eastAsia="Courier New" w:hAnsi="Courier New"/>
+          <w:sz w:val="18"/>
+          <w:szCs w:val="18"/>
+        </w:rPr>
+        <w:t xml:space="preserve">WHERE YEAR(pickup_datetime) = 2013</w:t>
+      </w:r>
+    </w:p>
+    <w:p>
+      <w:pPr>
+        <w:shd w:fill="F2F2F2" w:val="clear"/>
+        <w:spacing w:after="0" w:before="0"/>
+      </w:pPr>
+      <w:r>
+        <w:rPr>
+          <w:rFonts w:ascii="Courier New" w:cs="Courier New" w:eastAsia="Courier New" w:hAnsi="Courier New"/>
+          <w:sz w:val="18"/>
+          <w:szCs w:val="18"/>
+        </w:rPr>
+        <w:t xml:space="preserve">GROUP BY payment_type;</w:t>
+      </w:r>
+    </w:p>
+    <w:p>
+      <w:pPr>
+        <w:spacing w:after="100" w:before="100"/>
+      </w:pPr>
+    </w:p>
+    <w:p>
+      <w:pPr>
+        <w:spacing w:after="40" w:before="100"/>
+        <w:jc w:val="center"/>
+      </w:pPr>
+      <w:r>
+        <w:drawing>
+          <wp:inline distT="0" distB="0" distL="0" distR="0">
+            <wp:extent cx="4000500" cy="1905000"/>
+            <wp:effectExtent t="0" r="0" b="0" l="0"/>
+            <wp:docPr id="1" name="Optimize edilmemiş sorgu" descr="Optimize edilmemiş sorgu" title="Optimize edilmemiş sorgu"/>
+            <wp:cNvGraphicFramePr>
+              <a:graphicFrameLocks xmlns:a="http://schemas.openxmlformats.org/drawingml/2006/main" noChangeAspect="1"/>
+            </wp:cNvGraphicFramePr>
+            <a:graphic xmlns:a="http://schemas.openxmlformats.org/drawingml/2006/main">
+              <a:graphicData uri="http://schemas.openxmlformats.org/drawingml/2006/picture">
+                <pic:pic xmlns:pic="http://schemas.openxmlformats.org/drawingml/2006/picture">
+                  <pic:nvPicPr>
+                    <pic:cNvPr id="0" name="" descr=""/>
+                    <pic:cNvPicPr>
+                      <a:picLocks noChangeAspect="1" noChangeArrowheads="1"/>
+                    </pic:cNvPicPr>
+                  </pic:nvPicPr>
+                  <pic:blipFill>
+                    <a:blip r:embed="rId29" cstate="none"/>
+                    <a:srcRect/>
+                    <a:stretch>
+                      <a:fillRect/>
+                    </a:stretch>
+                  </pic:blipFill>
+                  <pic:spPr bwMode="auto">
+                    <a:xfrm>
+                      <a:off x="0" y="0"/>
+                      <a:ext cx="4000500" cy="1905000"/>
+                    </a:xfrm>
+                    <a:prstGeom prst="rect">
+                      <a:avLst/>
+                    </a:prstGeom>
+                  </pic:spPr>
+                </pic:pic>
+              </a:graphicData>
+            </a:graphic>
+          </wp:inline>
+        </w:drawing>
+      </w:r>
+    </w:p>
+    <w:p>
+      <w:pPr>
+        <w:spacing w:after="160" w:before="40"/>
+        <w:jc w:val="center"/>
+      </w:pPr>
+      <w:r>
+        <w:rPr>
+          <w:rFonts w:ascii="Times New Roman" w:cs="Times New Roman" w:eastAsia="Times New Roman" w:hAnsi="Times New Roman"/>
           <w:i/>
           <w:iCs/>
-          <w:color w:val="888888"/>
+          <w:sz w:val="18"/>
+          <w:szCs w:val="18"/>
+        </w:rPr>
+        <w:t xml:space="preserve">Şekil 21 – YEAR() fonksiyonu ile sorgu: CRD → 918.668, CSH → 778.170 yolculuk</w:t>
+      </w:r>
+    </w:p>
+    <w:p>
+      <w:pPr>
+        <w:pStyle w:val="Heading2"/>
+        <w:spacing w:after="80" w:before="200"/>
+      </w:pPr>
+      <w:r>
+        <w:rPr>
+          <w:rFonts w:ascii="Times New Roman" w:cs="Times New Roman" w:eastAsia="Times New Roman" w:hAnsi="Times New Roman"/>
+          <w:b/>
+          <w:bCs/>
+          <w:sz w:val="24"/>
+          <w:szCs w:val="24"/>
+        </w:rPr>
+        <w:t xml:space="preserve">5.2 Optimize Edilmiş Sorgu – Tarih Aralığı Karşılaştırması</w:t>
+      </w:r>
+    </w:p>
+    <w:p>
+      <w:pPr>
+        <w:spacing w:after="80" w:before="80"/>
+        <w:jc w:val="both"/>
+      </w:pPr>
+      <w:r>
+        <w:rPr>
+          <w:rFonts w:ascii="Times New Roman" w:cs="Times New Roman" w:eastAsia="Times New Roman" w:hAnsi="Times New Roman"/>
           <w:sz w:val="22"/>
           <w:szCs w:val="22"/>
         </w:rPr>
-        <w:t xml:space="preserve">Bu bölüm doldurulacaktır.</w:t>
-      </w:r>
+        <w:t xml:space="preserve">Aynı filtreleme işlemi için fonksiyon yerine doğrudan tarih aralığı kullanılmıştır. Bu yazım biçimi IX_nyctaxi_pickup_datetime indeksinin seek operasyonuyla kullanılmasına olanak tanır.</w:t>
+      </w:r>
+    </w:p>
+    <w:p>
+      <w:pPr>
+        <w:shd w:fill="F2F2F2" w:val="clear"/>
+        <w:spacing w:after="0" w:before="0"/>
+      </w:pPr>
+      <w:r>
+        <w:rPr>
+          <w:rFonts w:ascii="Courier New" w:cs="Courier New" w:eastAsia="Courier New" w:hAnsi="Courier New"/>
+          <w:sz w:val="18"/>
+          <w:szCs w:val="18"/>
+        </w:rPr>
+        <w:t xml:space="preserve">SELECT payment_type, COUNT(*) AS Adet</w:t>
+      </w:r>
+    </w:p>
+    <w:p>
+      <w:pPr>
+        <w:shd w:fill="F2F2F2" w:val="clear"/>
+        <w:spacing w:after="0" w:before="0"/>
+      </w:pPr>
+      <w:r>
+        <w:rPr>
+          <w:rFonts w:ascii="Courier New" w:cs="Courier New" w:eastAsia="Courier New" w:hAnsi="Courier New"/>
+          <w:sz w:val="18"/>
+          <w:szCs w:val="18"/>
+        </w:rPr>
+        <w:t xml:space="preserve">FROM nyctaxi_sample</w:t>
+      </w:r>
+    </w:p>
+    <w:p>
+      <w:pPr>
+        <w:shd w:fill="F2F2F2" w:val="clear"/>
+        <w:spacing w:after="0" w:before="0"/>
+      </w:pPr>
+      <w:r>
+        <w:rPr>
+          <w:rFonts w:ascii="Courier New" w:cs="Courier New" w:eastAsia="Courier New" w:hAnsi="Courier New"/>
+          <w:sz w:val="18"/>
+          <w:szCs w:val="18"/>
+        </w:rPr>
+        <w:t xml:space="preserve">WHERE pickup_datetime &gt;= '2013-01-01'</w:t>
+      </w:r>
+    </w:p>
+    <w:p>
+      <w:pPr>
+        <w:shd w:fill="F2F2F2" w:val="clear"/>
+        <w:spacing w:after="0" w:before="0"/>
+      </w:pPr>
+      <w:r>
+        <w:rPr>
+          <w:rFonts w:ascii="Courier New" w:cs="Courier New" w:eastAsia="Courier New" w:hAnsi="Courier New"/>
+          <w:sz w:val="18"/>
+          <w:szCs w:val="18"/>
+        </w:rPr>
+        <w:t xml:space="preserve">  AND pickup_datetime &lt; '2014-01-01'</w:t>
+      </w:r>
+    </w:p>
+    <w:p>
+      <w:pPr>
+        <w:shd w:fill="F2F2F2" w:val="clear"/>
+        <w:spacing w:after="0" w:before="0"/>
+      </w:pPr>
+      <w:r>
+        <w:rPr>
+          <w:rFonts w:ascii="Courier New" w:cs="Courier New" w:eastAsia="Courier New" w:hAnsi="Courier New"/>
+          <w:sz w:val="18"/>
+          <w:szCs w:val="18"/>
+        </w:rPr>
+        <w:t xml:space="preserve">GROUP BY payment_type;</w:t>
+      </w:r>
+    </w:p>
+    <w:p>
+      <w:pPr>
+        <w:spacing w:after="100" w:before="100"/>
+      </w:pPr>
+    </w:p>
+    <w:p>
+      <w:pPr>
+        <w:spacing w:after="40" w:before="100"/>
+        <w:jc w:val="center"/>
+      </w:pPr>
+      <w:r>
+        <w:drawing>
+          <wp:inline distT="0" distB="0" distL="0" distR="0">
+            <wp:extent cx="4000500" cy="1905000"/>
+            <wp:effectExtent t="0" r="0" b="0" l="0"/>
+            <wp:docPr id="1" name="Optimize edilmiş sorgu" descr="Optimize edilmiş sorgu" title="Optimize edilmiş sorgu"/>
+            <wp:cNvGraphicFramePr>
+              <a:graphicFrameLocks xmlns:a="http://schemas.openxmlformats.org/drawingml/2006/main" noChangeAspect="1"/>
+            </wp:cNvGraphicFramePr>
+            <a:graphic xmlns:a="http://schemas.openxmlformats.org/drawingml/2006/main">
+              <a:graphicData uri="http://schemas.openxmlformats.org/drawingml/2006/picture">
+                <pic:pic xmlns:pic="http://schemas.openxmlformats.org/drawingml/2006/picture">
+                  <pic:nvPicPr>
+                    <pic:cNvPr id="0" name="" descr=""/>
+                    <pic:cNvPicPr>
+                      <a:picLocks noChangeAspect="1" noChangeArrowheads="1"/>
+                    </pic:cNvPicPr>
+                  </pic:nvPicPr>
+                  <pic:blipFill>
+                    <a:blip r:embed="rId30" cstate="none"/>
+                    <a:srcRect/>
+                    <a:stretch>
+                      <a:fillRect/>
+                    </a:stretch>
+                  </pic:blipFill>
+                  <pic:spPr bwMode="auto">
+                    <a:xfrm>
+                      <a:off x="0" y="0"/>
+                      <a:ext cx="4000500" cy="1905000"/>
+                    </a:xfrm>
+                    <a:prstGeom prst="rect">
+                      <a:avLst/>
+                    </a:prstGeom>
+                  </pic:spPr>
+                </pic:pic>
+              </a:graphicData>
+            </a:graphic>
+          </wp:inline>
+        </w:drawing>
+      </w:r>
+    </w:p>
+    <w:p>
+      <w:pPr>
+        <w:spacing w:after="160" w:before="40"/>
+        <w:jc w:val="center"/>
+      </w:pPr>
+      <w:r>
+        <w:rPr>
+          <w:rFonts w:ascii="Times New Roman" w:cs="Times New Roman" w:eastAsia="Times New Roman" w:hAnsi="Times New Roman"/>
+          <w:i/>
+          <w:iCs/>
+          <w:sz w:val="18"/>
+          <w:szCs w:val="18"/>
+        </w:rPr>
+        <w:t xml:space="preserve">Şekil 22 – Tarih aralığı ile optimize sorgu: Aynı sonuç (CRD → 918.668, CSH → 778.170), indeks etkin</w:t>
+      </w:r>
+    </w:p>
+    <w:p>
+      <w:pPr>
+        <w:spacing w:after="80" w:before="80"/>
+        <w:jc w:val="both"/>
+      </w:pPr>
+      <w:r>
+        <w:rPr>
+          <w:rFonts w:ascii="Times New Roman" w:cs="Times New Roman" w:eastAsia="Times New Roman" w:hAnsi="Times New Roman"/>
+          <w:sz w:val="22"/>
+          <w:szCs w:val="22"/>
+        </w:rPr>
+        <w:t xml:space="preserve">Kural: WHERE koşulunda sütun üzerinde fonksiyon uygulanmamalıdır. Fonksiyon kullanımı indeksin atlanmasına ve tüm tablonun taranmasına yol açar.</w:t>
+      </w:r>
+    </w:p>
+    <w:p>
+      <w:pPr>
+        <w:spacing w:after="100" w:before="100"/>
+      </w:pPr>
+    </w:p>
+    <w:p>
+      <w:pPr>
+        <w:pStyle w:val="Heading2"/>
+        <w:spacing w:after="80" w:before="200"/>
+      </w:pPr>
+      <w:r>
+        <w:rPr>
+          <w:rFonts w:ascii="Times New Roman" w:cs="Times New Roman" w:eastAsia="Times New Roman" w:hAnsi="Times New Roman"/>
+          <w:b/>
+          <w:bCs/>
+          <w:sz w:val="24"/>
+          <w:szCs w:val="24"/>
+        </w:rPr>
+        <w:t xml:space="preserve">5.3 Karmaşık Filtreli Sorgu – Execution Plan Analizi</w:t>
+      </w:r>
+    </w:p>
+    <w:p>
+      <w:pPr>
+        <w:spacing w:after="80" w:before="80"/>
+        <w:jc w:val="both"/>
+      </w:pPr>
+      <w:r>
+        <w:rPr>
+          <w:rFonts w:ascii="Times New Roman" w:cs="Times New Roman" w:eastAsia="Times New Roman" w:hAnsi="Times New Roman"/>
+          <w:sz w:val="22"/>
+          <w:szCs w:val="22"/>
+        </w:rPr>
+        <w:t xml:space="preserve">Uzun mesafeli ve çok yolculu seyahatleri filtreleyen bir sorgu yazılmış; SQL Server Management Studio'nun Execution Plan özelliği kullanılarak sorgunun hangi indeksi nasıl kullandığı incelenmiştir.</w:t>
+      </w:r>
+    </w:p>
+    <w:p>
+      <w:pPr>
+        <w:shd w:fill="F2F2F2" w:val="clear"/>
+        <w:spacing w:after="0" w:before="0"/>
+      </w:pPr>
+      <w:r>
+        <w:rPr>
+          <w:rFonts w:ascii="Courier New" w:cs="Courier New" w:eastAsia="Courier New" w:hAnsi="Courier New"/>
+          <w:sz w:val="18"/>
+          <w:szCs w:val="18"/>
+        </w:rPr>
+        <w:t xml:space="preserve">SELECT TOP 1000</w:t>
+      </w:r>
+    </w:p>
+    <w:p>
+      <w:pPr>
+        <w:shd w:fill="F2F2F2" w:val="clear"/>
+        <w:spacing w:after="0" w:before="0"/>
+      </w:pPr>
+      <w:r>
+        <w:rPr>
+          <w:rFonts w:ascii="Courier New" w:cs="Courier New" w:eastAsia="Courier New" w:hAnsi="Courier New"/>
+          <w:sz w:val="18"/>
+          <w:szCs w:val="18"/>
+        </w:rPr>
+        <w:t xml:space="preserve">    trip_distance, passenger_count, total_amount</w:t>
+      </w:r>
+    </w:p>
+    <w:p>
+      <w:pPr>
+        <w:shd w:fill="F2F2F2" w:val="clear"/>
+        <w:spacing w:after="0" w:before="0"/>
+      </w:pPr>
+      <w:r>
+        <w:rPr>
+          <w:rFonts w:ascii="Courier New" w:cs="Courier New" w:eastAsia="Courier New" w:hAnsi="Courier New"/>
+          <w:sz w:val="18"/>
+          <w:szCs w:val="18"/>
+        </w:rPr>
+        <w:t xml:space="preserve">FROM nyctaxi_sample</w:t>
+      </w:r>
+    </w:p>
+    <w:p>
+      <w:pPr>
+        <w:shd w:fill="F2F2F2" w:val="clear"/>
+        <w:spacing w:after="0" w:before="0"/>
+      </w:pPr>
+      <w:r>
+        <w:rPr>
+          <w:rFonts w:ascii="Courier New" w:cs="Courier New" w:eastAsia="Courier New" w:hAnsi="Courier New"/>
+          <w:sz w:val="18"/>
+          <w:szCs w:val="18"/>
+        </w:rPr>
+        <w:t xml:space="preserve">WHERE trip_distance &gt; 10</w:t>
+      </w:r>
+    </w:p>
+    <w:p>
+      <w:pPr>
+        <w:shd w:fill="F2F2F2" w:val="clear"/>
+        <w:spacing w:after="0" w:before="0"/>
+      </w:pPr>
+      <w:r>
+        <w:rPr>
+          <w:rFonts w:ascii="Courier New" w:cs="Courier New" w:eastAsia="Courier New" w:hAnsi="Courier New"/>
+          <w:sz w:val="18"/>
+          <w:szCs w:val="18"/>
+        </w:rPr>
+        <w:t xml:space="preserve">  AND passenger_count &gt; 1</w:t>
+      </w:r>
+    </w:p>
+    <w:p>
+      <w:pPr>
+        <w:shd w:fill="F2F2F2" w:val="clear"/>
+        <w:spacing w:after="0" w:before="0"/>
+      </w:pPr>
+      <w:r>
+        <w:rPr>
+          <w:rFonts w:ascii="Courier New" w:cs="Courier New" w:eastAsia="Courier New" w:hAnsi="Courier New"/>
+          <w:sz w:val="18"/>
+          <w:szCs w:val="18"/>
+        </w:rPr>
+        <w:t xml:space="preserve">ORDER BY total_amount DESC;</w:t>
+      </w:r>
+    </w:p>
+    <w:p>
+      <w:pPr>
+        <w:spacing w:after="100" w:before="100"/>
+      </w:pPr>
+    </w:p>
+    <w:p>
+      <w:pPr>
+        <w:spacing w:after="40" w:before="100"/>
+        <w:jc w:val="center"/>
+      </w:pPr>
+      <w:r>
+        <w:drawing>
+          <wp:inline distT="0" distB="0" distL="0" distR="0">
+            <wp:extent cx="5334000" cy="2857500"/>
+            <wp:effectExtent t="0" r="0" b="0" l="0"/>
+            <wp:docPr id="1" name="Execution Plan" descr="Execution Plan" title="Execution Plan"/>
+            <wp:cNvGraphicFramePr>
+              <a:graphicFrameLocks xmlns:a="http://schemas.openxmlformats.org/drawingml/2006/main" noChangeAspect="1"/>
+            </wp:cNvGraphicFramePr>
+            <a:graphic xmlns:a="http://schemas.openxmlformats.org/drawingml/2006/main">
+              <a:graphicData uri="http://schemas.openxmlformats.org/drawingml/2006/picture">
+                <pic:pic xmlns:pic="http://schemas.openxmlformats.org/drawingml/2006/picture">
+                  <pic:nvPicPr>
+                    <pic:cNvPr id="0" name="" descr=""/>
+                    <pic:cNvPicPr>
+                      <a:picLocks noChangeAspect="1" noChangeArrowheads="1"/>
+                    </pic:cNvPicPr>
+                  </pic:nvPicPr>
+                  <pic:blipFill>
+                    <a:blip r:embed="rId31" cstate="none"/>
+                    <a:srcRect/>
+                    <a:stretch>
+                      <a:fillRect/>
+                    </a:stretch>
+                  </pic:blipFill>
+                  <pic:spPr bwMode="auto">
+                    <a:xfrm>
+                      <a:off x="0" y="0"/>
+                      <a:ext cx="5334000" cy="2857500"/>
+                    </a:xfrm>
+                    <a:prstGeom prst="rect">
+                      <a:avLst/>
+                    </a:prstGeom>
+                  </pic:spPr>
+                </pic:pic>
+              </a:graphicData>
+            </a:graphic>
+          </wp:inline>
+        </w:drawing>
+      </w:r>
+    </w:p>
+    <w:p>
+      <w:pPr>
+        <w:spacing w:after="160" w:before="40"/>
+        <w:jc w:val="center"/>
+      </w:pPr>
+      <w:r>
+        <w:rPr>
+          <w:rFonts w:ascii="Times New Roman" w:cs="Times New Roman" w:eastAsia="Times New Roman" w:hAnsi="Times New Roman"/>
+          <w:i/>
+          <w:iCs/>
+          <w:sz w:val="18"/>
+          <w:szCs w:val="18"/>
+        </w:rPr>
+        <w:t xml:space="preserve">Şekil 23 – TOP 1000 uzun mesafeli yolculuk; Execution Plan sekmesinde indeks kullanımı görüntülendi</w:t>
+      </w:r>
+    </w:p>
+    <w:p>
+      <w:pPr>
+        <w:pStyle w:val="Heading2"/>
+        <w:spacing w:after="80" w:before="200"/>
+      </w:pPr>
+      <w:r>
+        <w:rPr>
+          <w:rFonts w:ascii="Times New Roman" w:cs="Times New Roman" w:eastAsia="Times New Roman" w:hAnsi="Times New Roman"/>
+          <w:b/>
+          <w:bCs/>
+          <w:sz w:val="24"/>
+          <w:szCs w:val="24"/>
+        </w:rPr>
+        <w:t xml:space="preserve">5.4 En Pahalı 10 Yolculuk</w:t>
+      </w:r>
+    </w:p>
+    <w:p>
+      <w:pPr>
+        <w:spacing w:after="80" w:before="80"/>
+        <w:jc w:val="both"/>
+      </w:pPr>
+      <w:r>
+        <w:rPr>
+          <w:rFonts w:ascii="Times New Roman" w:cs="Times New Roman" w:eastAsia="Times New Roman" w:hAnsi="Times New Roman"/>
+          <w:sz w:val="22"/>
+          <w:szCs w:val="22"/>
+        </w:rPr>
+        <w:t xml:space="preserve">Toplam ücret (total_amount) değerine göre azalan sırada ilk 10 kayıt listelenmiştir. Bu sorgu, aykırı değerlerin ve veri kalitesi sorunlarının tespitinde kullanılabilir.</w:t>
+      </w:r>
+    </w:p>
+    <w:p>
+      <w:pPr>
+        <w:shd w:fill="F2F2F2" w:val="clear"/>
+        <w:spacing w:after="0" w:before="0"/>
+      </w:pPr>
+      <w:r>
+        <w:rPr>
+          <w:rFonts w:ascii="Courier New" w:cs="Courier New" w:eastAsia="Courier New" w:hAnsi="Courier New"/>
+          <w:sz w:val="18"/>
+          <w:szCs w:val="18"/>
+        </w:rPr>
+        <w:t xml:space="preserve">SELECT TOP 10</w:t>
+      </w:r>
+    </w:p>
+    <w:p>
+      <w:pPr>
+        <w:shd w:fill="F2F2F2" w:val="clear"/>
+        <w:spacing w:after="0" w:before="0"/>
+      </w:pPr>
+      <w:r>
+        <w:rPr>
+          <w:rFonts w:ascii="Courier New" w:cs="Courier New" w:eastAsia="Courier New" w:hAnsi="Courier New"/>
+          <w:sz w:val="18"/>
+          <w:szCs w:val="18"/>
+        </w:rPr>
+        <w:t xml:space="preserve">    medallion, hack_license,</w:t>
+      </w:r>
+    </w:p>
+    <w:p>
+      <w:pPr>
+        <w:shd w:fill="F2F2F2" w:val="clear"/>
+        <w:spacing w:after="0" w:before="0"/>
+      </w:pPr>
+      <w:r>
+        <w:rPr>
+          <w:rFonts w:ascii="Courier New" w:cs="Courier New" w:eastAsia="Courier New" w:hAnsi="Courier New"/>
+          <w:sz w:val="18"/>
+          <w:szCs w:val="18"/>
+        </w:rPr>
+        <w:t xml:space="preserve">    trip_distance, passenger_count, total_amount</w:t>
+      </w:r>
+    </w:p>
+    <w:p>
+      <w:pPr>
+        <w:shd w:fill="F2F2F2" w:val="clear"/>
+        <w:spacing w:after="0" w:before="0"/>
+      </w:pPr>
+      <w:r>
+        <w:rPr>
+          <w:rFonts w:ascii="Courier New" w:cs="Courier New" w:eastAsia="Courier New" w:hAnsi="Courier New"/>
+          <w:sz w:val="18"/>
+          <w:szCs w:val="18"/>
+        </w:rPr>
+        <w:t xml:space="preserve">FROM nyctaxi_sample</w:t>
+      </w:r>
+    </w:p>
+    <w:p>
+      <w:pPr>
+        <w:shd w:fill="F2F2F2" w:val="clear"/>
+        <w:spacing w:after="0" w:before="0"/>
+      </w:pPr>
+      <w:r>
+        <w:rPr>
+          <w:rFonts w:ascii="Courier New" w:cs="Courier New" w:eastAsia="Courier New" w:hAnsi="Courier New"/>
+          <w:sz w:val="18"/>
+          <w:szCs w:val="18"/>
+        </w:rPr>
+        <w:t xml:space="preserve">ORDER BY total_amount DESC;</w:t>
+      </w:r>
+    </w:p>
+    <w:p>
+      <w:pPr>
+        <w:spacing w:after="100" w:before="100"/>
+      </w:pPr>
+    </w:p>
+    <w:p>
+      <w:pPr>
+        <w:spacing w:after="40" w:before="100"/>
+        <w:jc w:val="center"/>
+      </w:pPr>
+      <w:r>
+        <w:drawing>
+          <wp:inline distT="0" distB="0" distL="0" distR="0">
+            <wp:extent cx="4762500" cy="2667000"/>
+            <wp:effectExtent t="0" r="0" b="0" l="0"/>
+            <wp:docPr id="1" name="En pahalı yolculuklar" descr="En pahalı yolculuklar" title="En pahalı yolculuklar"/>
+            <wp:cNvGraphicFramePr>
+              <a:graphicFrameLocks xmlns:a="http://schemas.openxmlformats.org/drawingml/2006/main" noChangeAspect="1"/>
+            </wp:cNvGraphicFramePr>
+            <a:graphic xmlns:a="http://schemas.openxmlformats.org/drawingml/2006/main">
+              <a:graphicData uri="http://schemas.openxmlformats.org/drawingml/2006/picture">
+                <pic:pic xmlns:pic="http://schemas.openxmlformats.org/drawingml/2006/picture">
+                  <pic:nvPicPr>
+                    <pic:cNvPr id="0" name="" descr=""/>
+                    <pic:cNvPicPr>
+                      <a:picLocks noChangeAspect="1" noChangeArrowheads="1"/>
+                    </pic:cNvPicPr>
+                  </pic:nvPicPr>
+                  <pic:blipFill>
+                    <a:blip r:embed="rId32" cstate="none"/>
+                    <a:srcRect/>
+                    <a:stretch>
+                      <a:fillRect/>
+                    </a:stretch>
+                  </pic:blipFill>
+                  <pic:spPr bwMode="auto">
+                    <a:xfrm>
+                      <a:off x="0" y="0"/>
+                      <a:ext cx="4762500" cy="2667000"/>
+                    </a:xfrm>
+                    <a:prstGeom prst="rect">
+                      <a:avLst/>
+                    </a:prstGeom>
+                  </pic:spPr>
+                </pic:pic>
+              </a:graphicData>
+            </a:graphic>
+          </wp:inline>
+        </w:drawing>
+      </w:r>
+    </w:p>
+    <w:p>
+      <w:pPr>
+        <w:spacing w:after="160" w:before="40"/>
+        <w:jc w:val="center"/>
+      </w:pPr>
+      <w:r>
+        <w:rPr>
+          <w:rFonts w:ascii="Times New Roman" w:cs="Times New Roman" w:eastAsia="Times New Roman" w:hAnsi="Times New Roman"/>
+          <w:i/>
+          <w:iCs/>
+          <w:sz w:val="18"/>
+          <w:szCs w:val="18"/>
+        </w:rPr>
+        <w:t xml:space="preserve">Şekil 24 – En yüksek toplam ücretli 10 yolculuk; maksimum total_amount = 500</w:t>
+      </w:r>
+    </w:p>
+    <w:p>
+      <w:pPr>
+        <w:spacing w:after="80" w:before="80"/>
+        <w:jc w:val="both"/>
+      </w:pPr>
+      <w:r>
+        <w:rPr>
+          <w:rFonts w:ascii="Times New Roman" w:cs="Times New Roman" w:eastAsia="Times New Roman" w:hAnsi="Times New Roman"/>
+          <w:sz w:val="22"/>
+          <w:szCs w:val="22"/>
+        </w:rPr>
+        <w:t xml:space="preserve">Gözlem: 500 birimlik maksimum değer, diğer kayıtlarla karşılaştırıldığında olası bir aykırı değer (outlier) ya da sistem üst sınırı olduğuna işaret etmektedir.</w:t>
+      </w:r>
+    </w:p>
+    <w:p>
+      <w:pPr>
+        <w:spacing w:after="100" w:before="100"/>
+      </w:pPr>
     </w:p>
     <w:p>
       <w:pPr>

</xml_diff>

<commit_message>
Proje1 Adim5: Erisim yonetimi tamamlandi - taxi_reader ve taxi_writer kullanicilari, rol atamalari, Bolum 6 ve 7 rapora eklendi
</commit_message>
<xml_diff>
--- a/Proje1-PerformansOptimizasyonu/Proje1_Rapor.docx
+++ b/Proje1-PerformansOptimizasyonu/Proje1_Rapor.docx
@@ -3920,14 +3920,1038 @@
       <w:r>
         <w:rPr>
           <w:rFonts w:ascii="Times New Roman" w:cs="Times New Roman" w:eastAsia="Times New Roman" w:hAnsi="Times New Roman"/>
+          <w:sz w:val="22"/>
+          <w:szCs w:val="22"/>
+        </w:rPr>
+        <w:t xml:space="preserve">Veritabanı güvenliğinin temel bileşenlerinden biri, kullanıcıların yalnızca ihtiyaç duydukları işlemleri gerçekleştirebilmesini sağlayan erişim kontrolüdür. Bu bölümde NYCTaxi_Sample veritabanı için iki farklı yetkiye sahip kullanıcı oluşturulmuş ve rol tabanlı erişim yönetimi uygulanmıştır.</w:t>
+      </w:r>
+    </w:p>
+    <w:p>
+      <w:pPr>
+        <w:spacing w:after="100" w:before="100"/>
+      </w:pPr>
+    </w:p>
+    <w:p>
+      <w:pPr>
+        <w:pStyle w:val="Heading2"/>
+        <w:spacing w:after="80" w:before="200"/>
+      </w:pPr>
+      <w:r>
+        <w:rPr>
+          <w:rFonts w:ascii="Times New Roman" w:cs="Times New Roman" w:eastAsia="Times New Roman" w:hAnsi="Times New Roman"/>
+          <w:b/>
+          <w:bCs/>
+          <w:sz w:val="24"/>
+          <w:szCs w:val="24"/>
+        </w:rPr>
+        <w:t xml:space="preserve">6.1 Mevcut Kullanıcı ve Rollerin İncelenmesi</w:t>
+      </w:r>
+    </w:p>
+    <w:p>
+      <w:pPr>
+        <w:spacing w:after="80" w:before="80"/>
+        <w:jc w:val="both"/>
+      </w:pPr>
+      <w:r>
+        <w:rPr>
+          <w:rFonts w:ascii="Times New Roman" w:cs="Times New Roman" w:eastAsia="Times New Roman" w:hAnsi="Times New Roman"/>
+          <w:sz w:val="22"/>
+          <w:szCs w:val="22"/>
+        </w:rPr>
+        <w:t xml:space="preserve">sys.database_principals görünümü ile veritabanındaki mevcut kullanıcılar ve rol atamaları listelenmiştir.</w:t>
+      </w:r>
+    </w:p>
+    <w:p>
+      <w:pPr>
+        <w:shd w:fill="F2F2F2" w:val="clear"/>
+        <w:spacing w:after="0" w:before="0"/>
+      </w:pPr>
+      <w:r>
+        <w:rPr>
+          <w:rFonts w:ascii="Courier New" w:cs="Courier New" w:eastAsia="Courier New" w:hAnsi="Courier New"/>
+          <w:sz w:val="18"/>
+          <w:szCs w:val="18"/>
+        </w:rPr>
+        <w:t xml:space="preserve">SELECT dp.name AS KullaniciAdi, dp.type_desc AS Tur,</w:t>
+      </w:r>
+    </w:p>
+    <w:p>
+      <w:pPr>
+        <w:shd w:fill="F2F2F2" w:val="clear"/>
+        <w:spacing w:after="0" w:before="0"/>
+      </w:pPr>
+      <w:r>
+        <w:rPr>
+          <w:rFonts w:ascii="Courier New" w:cs="Courier New" w:eastAsia="Courier New" w:hAnsi="Courier New"/>
+          <w:sz w:val="18"/>
+          <w:szCs w:val="18"/>
+        </w:rPr>
+        <w:t xml:space="preserve">       rp.name AS RolAdi</w:t>
+      </w:r>
+    </w:p>
+    <w:p>
+      <w:pPr>
+        <w:shd w:fill="F2F2F2" w:val="clear"/>
+        <w:spacing w:after="0" w:before="0"/>
+      </w:pPr>
+      <w:r>
+        <w:rPr>
+          <w:rFonts w:ascii="Courier New" w:cs="Courier New" w:eastAsia="Courier New" w:hAnsi="Courier New"/>
+          <w:sz w:val="18"/>
+          <w:szCs w:val="18"/>
+        </w:rPr>
+        <w:t xml:space="preserve">FROM sys.database_principals dp</w:t>
+      </w:r>
+    </w:p>
+    <w:p>
+      <w:pPr>
+        <w:shd w:fill="F2F2F2" w:val="clear"/>
+        <w:spacing w:after="0" w:before="0"/>
+      </w:pPr>
+      <w:r>
+        <w:rPr>
+          <w:rFonts w:ascii="Courier New" w:cs="Courier New" w:eastAsia="Courier New" w:hAnsi="Courier New"/>
+          <w:sz w:val="18"/>
+          <w:szCs w:val="18"/>
+        </w:rPr>
+        <w:t xml:space="preserve">LEFT JOIN sys.database_role_members drm</w:t>
+      </w:r>
+    </w:p>
+    <w:p>
+      <w:pPr>
+        <w:shd w:fill="F2F2F2" w:val="clear"/>
+        <w:spacing w:after="0" w:before="0"/>
+      </w:pPr>
+      <w:r>
+        <w:rPr>
+          <w:rFonts w:ascii="Courier New" w:cs="Courier New" w:eastAsia="Courier New" w:hAnsi="Courier New"/>
+          <w:sz w:val="18"/>
+          <w:szCs w:val="18"/>
+        </w:rPr>
+        <w:t xml:space="preserve">    ON dp.principal_id = drm.member_principal_id</w:t>
+      </w:r>
+    </w:p>
+    <w:p>
+      <w:pPr>
+        <w:shd w:fill="F2F2F2" w:val="clear"/>
+        <w:spacing w:after="0" w:before="0"/>
+      </w:pPr>
+      <w:r>
+        <w:rPr>
+          <w:rFonts w:ascii="Courier New" w:cs="Courier New" w:eastAsia="Courier New" w:hAnsi="Courier New"/>
+          <w:sz w:val="18"/>
+          <w:szCs w:val="18"/>
+        </w:rPr>
+        <w:t xml:space="preserve">LEFT JOIN sys.database_principals rp</w:t>
+      </w:r>
+    </w:p>
+    <w:p>
+      <w:pPr>
+        <w:shd w:fill="F2F2F2" w:val="clear"/>
+        <w:spacing w:after="0" w:before="0"/>
+      </w:pPr>
+      <w:r>
+        <w:rPr>
+          <w:rFonts w:ascii="Courier New" w:cs="Courier New" w:eastAsia="Courier New" w:hAnsi="Courier New"/>
+          <w:sz w:val="18"/>
+          <w:szCs w:val="18"/>
+        </w:rPr>
+        <w:t xml:space="preserve">    ON drm.role_principal_id = rp.principal_id</w:t>
+      </w:r>
+    </w:p>
+    <w:p>
+      <w:pPr>
+        <w:shd w:fill="F2F2F2" w:val="clear"/>
+        <w:spacing w:after="0" w:before="0"/>
+      </w:pPr>
+      <w:r>
+        <w:rPr>
+          <w:rFonts w:ascii="Courier New" w:cs="Courier New" w:eastAsia="Courier New" w:hAnsi="Courier New"/>
+          <w:sz w:val="18"/>
+          <w:szCs w:val="18"/>
+        </w:rPr>
+        <w:t xml:space="preserve">WHERE dp.type NOT IN ('R')</w:t>
+      </w:r>
+    </w:p>
+    <w:p>
+      <w:pPr>
+        <w:shd w:fill="F2F2F2" w:val="clear"/>
+        <w:spacing w:after="0" w:before="0"/>
+      </w:pPr>
+      <w:r>
+        <w:rPr>
+          <w:rFonts w:ascii="Courier New" w:cs="Courier New" w:eastAsia="Courier New" w:hAnsi="Courier New"/>
+          <w:sz w:val="18"/>
+          <w:szCs w:val="18"/>
+        </w:rPr>
+        <w:t xml:space="preserve">  AND dp.name NOT IN ('sys','INFORMATION_SCHEMA')</w:t>
+      </w:r>
+    </w:p>
+    <w:p>
+      <w:pPr>
+        <w:shd w:fill="F2F2F2" w:val="clear"/>
+        <w:spacing w:after="0" w:before="0"/>
+      </w:pPr>
+      <w:r>
+        <w:rPr>
+          <w:rFonts w:ascii="Courier New" w:cs="Courier New" w:eastAsia="Courier New" w:hAnsi="Courier New"/>
+          <w:sz w:val="18"/>
+          <w:szCs w:val="18"/>
+        </w:rPr>
+        <w:t xml:space="preserve">ORDER BY dp.name;</w:t>
+      </w:r>
+    </w:p>
+    <w:p>
+      <w:pPr>
+        <w:spacing w:after="100" w:before="100"/>
+      </w:pPr>
+    </w:p>
+    <w:p>
+      <w:pPr>
+        <w:spacing w:after="40" w:before="100"/>
+        <w:jc w:val="center"/>
+      </w:pPr>
+      <w:r>
+        <w:drawing>
+          <wp:inline distT="0" distB="0" distL="0" distR="0">
+            <wp:extent cx="4762500" cy="2476500"/>
+            <wp:effectExtent t="0" r="0" b="0" l="0"/>
+            <wp:docPr id="1" name="Mevcut kullanıcılar" descr="Mevcut kullanıcılar" title="Mevcut kullanıcılar"/>
+            <wp:cNvGraphicFramePr>
+              <a:graphicFrameLocks xmlns:a="http://schemas.openxmlformats.org/drawingml/2006/main" noChangeAspect="1"/>
+            </wp:cNvGraphicFramePr>
+            <a:graphic xmlns:a="http://schemas.openxmlformats.org/drawingml/2006/main">
+              <a:graphicData uri="http://schemas.openxmlformats.org/drawingml/2006/picture">
+                <pic:pic xmlns:pic="http://schemas.openxmlformats.org/drawingml/2006/picture">
+                  <pic:nvPicPr>
+                    <pic:cNvPr id="0" name="" descr=""/>
+                    <pic:cNvPicPr>
+                      <a:picLocks noChangeAspect="1" noChangeArrowheads="1"/>
+                    </pic:cNvPicPr>
+                  </pic:nvPicPr>
+                  <pic:blipFill>
+                    <a:blip r:embed="rId33" cstate="none"/>
+                    <a:srcRect/>
+                    <a:stretch>
+                      <a:fillRect/>
+                    </a:stretch>
+                  </pic:blipFill>
+                  <pic:spPr bwMode="auto">
+                    <a:xfrm>
+                      <a:off x="0" y="0"/>
+                      <a:ext cx="4762500" cy="2476500"/>
+                    </a:xfrm>
+                    <a:prstGeom prst="rect">
+                      <a:avLst/>
+                    </a:prstGeom>
+                  </pic:spPr>
+                </pic:pic>
+              </a:graphicData>
+            </a:graphic>
+          </wp:inline>
+        </w:drawing>
+      </w:r>
+    </w:p>
+    <w:p>
+      <w:pPr>
+        <w:spacing w:after="160" w:before="40"/>
+        <w:jc w:val="center"/>
+      </w:pPr>
+      <w:r>
+        <w:rPr>
+          <w:rFonts w:ascii="Times New Roman" w:cs="Times New Roman" w:eastAsia="Times New Roman" w:hAnsi="Times New Roman"/>
           <w:i/>
           <w:iCs/>
-          <w:color w:val="888888"/>
+          <w:sz w:val="18"/>
+          <w:szCs w:val="18"/>
+        </w:rPr>
+        <w:t xml:space="preserve">Şekil 25 – Mevcut kullanıcılar: dbo (db_owner) ve guest</w:t>
+      </w:r>
+    </w:p>
+    <w:p>
+      <w:pPr>
+        <w:pStyle w:val="Heading2"/>
+        <w:spacing w:after="80" w:before="200"/>
+      </w:pPr>
+      <w:r>
+        <w:rPr>
+          <w:rFonts w:ascii="Times New Roman" w:cs="Times New Roman" w:eastAsia="Times New Roman" w:hAnsi="Times New Roman"/>
+          <w:b/>
+          <w:bCs/>
+          <w:sz w:val="24"/>
+          <w:szCs w:val="24"/>
+        </w:rPr>
+        <w:t xml:space="preserve">6.2 Login Oluşturma</w:t>
+      </w:r>
+    </w:p>
+    <w:p>
+      <w:pPr>
+        <w:spacing w:after="80" w:before="80"/>
+        <w:jc w:val="both"/>
+      </w:pPr>
+      <w:r>
+        <w:rPr>
+          <w:rFonts w:ascii="Times New Roman" w:cs="Times New Roman" w:eastAsia="Times New Roman" w:hAnsi="Times New Roman"/>
           <w:sz w:val="22"/>
           <w:szCs w:val="22"/>
         </w:rPr>
-        <w:t xml:space="preserve">Bu bölüm doldurulacaktır.</w:t>
-      </w:r>
+        <w:t xml:space="preserve">SQL Server kimlik doğrulaması için iki yeni login oluşturulmuştur: salt okunur erişim için taxi_reader, okuma ve yazma erişimi için taxi_writer.</w:t>
+      </w:r>
+    </w:p>
+    <w:p>
+      <w:pPr>
+        <w:shd w:fill="F2F2F2" w:val="clear"/>
+        <w:spacing w:after="0" w:before="0"/>
+      </w:pPr>
+      <w:r>
+        <w:rPr>
+          <w:rFonts w:ascii="Courier New" w:cs="Courier New" w:eastAsia="Courier New" w:hAnsi="Courier New"/>
+          <w:sz w:val="18"/>
+          <w:szCs w:val="18"/>
+        </w:rPr>
+        <w:t xml:space="preserve">USE master;</w:t>
+      </w:r>
+    </w:p>
+    <w:p>
+      <w:pPr>
+        <w:shd w:fill="F2F2F2" w:val="clear"/>
+        <w:spacing w:after="0" w:before="0"/>
+      </w:pPr>
+      <w:r>
+        <w:rPr>
+          <w:rFonts w:ascii="Courier New" w:cs="Courier New" w:eastAsia="Courier New" w:hAnsi="Courier New"/>
+          <w:sz w:val="18"/>
+          <w:szCs w:val="18"/>
+        </w:rPr>
+        <w:t xml:space="preserve">CREATE LOGIN taxi_reader WITH PASSWORD = 'Reader123!';</w:t>
+      </w:r>
+    </w:p>
+    <w:p>
+      <w:pPr>
+        <w:shd w:fill="F2F2F2" w:val="clear"/>
+        <w:spacing w:after="0" w:before="0"/>
+      </w:pPr>
+      <w:r>
+        <w:rPr>
+          <w:rFonts w:ascii="Courier New" w:cs="Courier New" w:eastAsia="Courier New" w:hAnsi="Courier New"/>
+          <w:sz w:val="18"/>
+          <w:szCs w:val="18"/>
+        </w:rPr>
+        <w:t xml:space="preserve">CREATE LOGIN taxi_writer WITH PASSWORD = 'Writer123!';</w:t>
+      </w:r>
+    </w:p>
+    <w:p>
+      <w:pPr>
+        <w:spacing w:after="100" w:before="100"/>
+      </w:pPr>
+    </w:p>
+    <w:p>
+      <w:pPr>
+        <w:spacing w:after="40" w:before="100"/>
+        <w:jc w:val="center"/>
+      </w:pPr>
+      <w:r>
+        <w:drawing>
+          <wp:inline distT="0" distB="0" distL="0" distR="0">
+            <wp:extent cx="4762500" cy="2095500"/>
+            <wp:effectExtent t="0" r="0" b="0" l="0"/>
+            <wp:docPr id="1" name="Login oluşturma" descr="Login oluşturma" title="Login oluşturma"/>
+            <wp:cNvGraphicFramePr>
+              <a:graphicFrameLocks xmlns:a="http://schemas.openxmlformats.org/drawingml/2006/main" noChangeAspect="1"/>
+            </wp:cNvGraphicFramePr>
+            <a:graphic xmlns:a="http://schemas.openxmlformats.org/drawingml/2006/main">
+              <a:graphicData uri="http://schemas.openxmlformats.org/drawingml/2006/picture">
+                <pic:pic xmlns:pic="http://schemas.openxmlformats.org/drawingml/2006/picture">
+                  <pic:nvPicPr>
+                    <pic:cNvPr id="0" name="" descr=""/>
+                    <pic:cNvPicPr>
+                      <a:picLocks noChangeAspect="1" noChangeArrowheads="1"/>
+                    </pic:cNvPicPr>
+                  </pic:nvPicPr>
+                  <pic:blipFill>
+                    <a:blip r:embed="rId34" cstate="none"/>
+                    <a:srcRect/>
+                    <a:stretch>
+                      <a:fillRect/>
+                    </a:stretch>
+                  </pic:blipFill>
+                  <pic:spPr bwMode="auto">
+                    <a:xfrm>
+                      <a:off x="0" y="0"/>
+                      <a:ext cx="4762500" cy="2095500"/>
+                    </a:xfrm>
+                    <a:prstGeom prst="rect">
+                      <a:avLst/>
+                    </a:prstGeom>
+                  </pic:spPr>
+                </pic:pic>
+              </a:graphicData>
+            </a:graphic>
+          </wp:inline>
+        </w:drawing>
+      </w:r>
+    </w:p>
+    <w:p>
+      <w:pPr>
+        <w:spacing w:after="160" w:before="40"/>
+        <w:jc w:val="center"/>
+      </w:pPr>
+      <w:r>
+        <w:rPr>
+          <w:rFonts w:ascii="Times New Roman" w:cs="Times New Roman" w:eastAsia="Times New Roman" w:hAnsi="Times New Roman"/>
+          <w:i/>
+          <w:iCs/>
+          <w:sz w:val="18"/>
+          <w:szCs w:val="18"/>
+        </w:rPr>
+        <w:t xml:space="preserve">Şekil 26 – taxi_reader ve taxi_writer loginleri başarıyla oluşturuldu</w:t>
+      </w:r>
+    </w:p>
+    <w:p>
+      <w:pPr>
+        <w:pStyle w:val="Heading2"/>
+        <w:spacing w:after="80" w:before="200"/>
+      </w:pPr>
+      <w:r>
+        <w:rPr>
+          <w:rFonts w:ascii="Times New Roman" w:cs="Times New Roman" w:eastAsia="Times New Roman" w:hAnsi="Times New Roman"/>
+          <w:b/>
+          <w:bCs/>
+          <w:sz w:val="24"/>
+          <w:szCs w:val="24"/>
+        </w:rPr>
+        <w:t xml:space="preserve">6.3 Veritabanı Kullanıcıları ve Rol Ataması</w:t>
+      </w:r>
+    </w:p>
+    <w:p>
+      <w:pPr>
+        <w:spacing w:after="80" w:before="80"/>
+        <w:jc w:val="both"/>
+      </w:pPr>
+      <w:r>
+        <w:rPr>
+          <w:rFonts w:ascii="Times New Roman" w:cs="Times New Roman" w:eastAsia="Times New Roman" w:hAnsi="Times New Roman"/>
+          <w:sz w:val="22"/>
+          <w:szCs w:val="22"/>
+        </w:rPr>
+        <w:t xml:space="preserve">Oluşturulan loginler NYCTaxi_Sample veritabanına kullanıcı olarak eklenmiş ve ilgili rollere atanmıştır. taxi_reader yalnızca okuma (db_datareader), taxi_writer ise hem okuma hem yazma (db_datareader + db_datawriter) yetkisine sahiptir.</w:t>
+      </w:r>
+    </w:p>
+    <w:p>
+      <w:pPr>
+        <w:shd w:fill="F2F2F2" w:val="clear"/>
+        <w:spacing w:after="0" w:before="0"/>
+      </w:pPr>
+      <w:r>
+        <w:rPr>
+          <w:rFonts w:ascii="Courier New" w:cs="Courier New" w:eastAsia="Courier New" w:hAnsi="Courier New"/>
+          <w:sz w:val="18"/>
+          <w:szCs w:val="18"/>
+        </w:rPr>
+        <w:t xml:space="preserve">USE NYCTaxi_Sample;</w:t>
+      </w:r>
+    </w:p>
+    <w:p>
+      <w:pPr>
+        <w:shd w:fill="F2F2F2" w:val="clear"/>
+        <w:spacing w:after="0" w:before="0"/>
+      </w:pPr>
+      <w:r>
+        <w:rPr>
+          <w:rFonts w:ascii="Courier New" w:cs="Courier New" w:eastAsia="Courier New" w:hAnsi="Courier New"/>
+          <w:sz w:val="18"/>
+          <w:szCs w:val="18"/>
+        </w:rPr>
+        <w:t xml:space="preserve">CREATE USER taxi_reader FOR LOGIN taxi_reader;</w:t>
+      </w:r>
+    </w:p>
+    <w:p>
+      <w:pPr>
+        <w:shd w:fill="F2F2F2" w:val="clear"/>
+        <w:spacing w:after="0" w:before="0"/>
+      </w:pPr>
+      <w:r>
+        <w:rPr>
+          <w:rFonts w:ascii="Courier New" w:cs="Courier New" w:eastAsia="Courier New" w:hAnsi="Courier New"/>
+          <w:sz w:val="18"/>
+          <w:szCs w:val="18"/>
+        </w:rPr>
+        <w:t xml:space="preserve">CREATE USER taxi_writer FOR LOGIN taxi_writer;</w:t>
+      </w:r>
+    </w:p>
+    <w:p>
+      <w:pPr>
+        <w:shd w:fill="F2F2F2" w:val="clear"/>
+        <w:spacing w:after="0" w:before="0"/>
+      </w:pPr>
+      <w:r>
+        <w:rPr>
+          <w:rFonts w:ascii="Courier New" w:cs="Courier New" w:eastAsia="Courier New" w:hAnsi="Courier New"/>
+          <w:sz w:val="18"/>
+          <w:szCs w:val="18"/>
+        </w:rPr>
+        <w:t xml:space="preserve"/>
+      </w:r>
+    </w:p>
+    <w:p>
+      <w:pPr>
+        <w:shd w:fill="F2F2F2" w:val="clear"/>
+        <w:spacing w:after="0" w:before="0"/>
+      </w:pPr>
+      <w:r>
+        <w:rPr>
+          <w:rFonts w:ascii="Courier New" w:cs="Courier New" w:eastAsia="Courier New" w:hAnsi="Courier New"/>
+          <w:sz w:val="18"/>
+          <w:szCs w:val="18"/>
+        </w:rPr>
+        <w:t xml:space="preserve">EXEC sp_addrolemember 'db_datareader', 'taxi_reader';</w:t>
+      </w:r>
+    </w:p>
+    <w:p>
+      <w:pPr>
+        <w:shd w:fill="F2F2F2" w:val="clear"/>
+        <w:spacing w:after="0" w:before="0"/>
+      </w:pPr>
+      <w:r>
+        <w:rPr>
+          <w:rFonts w:ascii="Courier New" w:cs="Courier New" w:eastAsia="Courier New" w:hAnsi="Courier New"/>
+          <w:sz w:val="18"/>
+          <w:szCs w:val="18"/>
+        </w:rPr>
+        <w:t xml:space="preserve">EXEC sp_addrolemember 'db_datareader', 'taxi_writer';</w:t>
+      </w:r>
+    </w:p>
+    <w:p>
+      <w:pPr>
+        <w:shd w:fill="F2F2F2" w:val="clear"/>
+        <w:spacing w:after="0" w:before="0"/>
+      </w:pPr>
+      <w:r>
+        <w:rPr>
+          <w:rFonts w:ascii="Courier New" w:cs="Courier New" w:eastAsia="Courier New" w:hAnsi="Courier New"/>
+          <w:sz w:val="18"/>
+          <w:szCs w:val="18"/>
+        </w:rPr>
+        <w:t xml:space="preserve">EXEC sp_addrolemember 'db_datawriter', 'taxi_writer';</w:t>
+      </w:r>
+    </w:p>
+    <w:p>
+      <w:pPr>
+        <w:spacing w:after="100" w:before="100"/>
+      </w:pPr>
+    </w:p>
+    <w:p>
+      <w:pPr>
+        <w:spacing w:after="40" w:before="100"/>
+        <w:jc w:val="center"/>
+      </w:pPr>
+      <w:r>
+        <w:drawing>
+          <wp:inline distT="0" distB="0" distL="0" distR="0">
+            <wp:extent cx="4762500" cy="2286000"/>
+            <wp:effectExtent t="0" r="0" b="0" l="0"/>
+            <wp:docPr id="1" name="Kullanıcı ve rol ataması" descr="Kullanıcı ve rol ataması" title="Kullanıcı ve rol ataması"/>
+            <wp:cNvGraphicFramePr>
+              <a:graphicFrameLocks xmlns:a="http://schemas.openxmlformats.org/drawingml/2006/main" noChangeAspect="1"/>
+            </wp:cNvGraphicFramePr>
+            <a:graphic xmlns:a="http://schemas.openxmlformats.org/drawingml/2006/main">
+              <a:graphicData uri="http://schemas.openxmlformats.org/drawingml/2006/picture">
+                <pic:pic xmlns:pic="http://schemas.openxmlformats.org/drawingml/2006/picture">
+                  <pic:nvPicPr>
+                    <pic:cNvPr id="0" name="" descr=""/>
+                    <pic:cNvPicPr>
+                      <a:picLocks noChangeAspect="1" noChangeArrowheads="1"/>
+                    </pic:cNvPicPr>
+                  </pic:nvPicPr>
+                  <pic:blipFill>
+                    <a:blip r:embed="rId35" cstate="none"/>
+                    <a:srcRect/>
+                    <a:stretch>
+                      <a:fillRect/>
+                    </a:stretch>
+                  </pic:blipFill>
+                  <pic:spPr bwMode="auto">
+                    <a:xfrm>
+                      <a:off x="0" y="0"/>
+                      <a:ext cx="4762500" cy="2286000"/>
+                    </a:xfrm>
+                    <a:prstGeom prst="rect">
+                      <a:avLst/>
+                    </a:prstGeom>
+                  </pic:spPr>
+                </pic:pic>
+              </a:graphicData>
+            </a:graphic>
+          </wp:inline>
+        </w:drawing>
+      </w:r>
+    </w:p>
+    <w:p>
+      <w:pPr>
+        <w:spacing w:after="160" w:before="40"/>
+        <w:jc w:val="center"/>
+      </w:pPr>
+      <w:r>
+        <w:rPr>
+          <w:rFonts w:ascii="Times New Roman" w:cs="Times New Roman" w:eastAsia="Times New Roman" w:hAnsi="Times New Roman"/>
+          <w:i/>
+          <w:iCs/>
+          <w:sz w:val="18"/>
+          <w:szCs w:val="18"/>
+        </w:rPr>
+        <w:t xml:space="preserve">Şekil 27 – Kullanıcılar oluşturuldu ve rollere atandı</w:t>
+      </w:r>
+    </w:p>
+    <w:p>
+      <w:pPr>
+        <w:pStyle w:val="Heading2"/>
+        <w:spacing w:after="80" w:before="200"/>
+      </w:pPr>
+      <w:r>
+        <w:rPr>
+          <w:rFonts w:ascii="Times New Roman" w:cs="Times New Roman" w:eastAsia="Times New Roman" w:hAnsi="Times New Roman"/>
+          <w:b/>
+          <w:bCs/>
+          <w:sz w:val="24"/>
+          <w:szCs w:val="24"/>
+        </w:rPr>
+        <w:t xml:space="preserve">6.4 Rol Üyeliklerinin Doğrulanması</w:t>
+      </w:r>
+    </w:p>
+    <w:p>
+      <w:pPr>
+        <w:spacing w:after="80" w:before="80"/>
+        <w:jc w:val="both"/>
+      </w:pPr>
+      <w:r>
+        <w:rPr>
+          <w:rFonts w:ascii="Times New Roman" w:cs="Times New Roman" w:eastAsia="Times New Roman" w:hAnsi="Times New Roman"/>
+          <w:sz w:val="22"/>
+          <w:szCs w:val="22"/>
+        </w:rPr>
+        <w:t xml:space="preserve">sys.database_role_members görünümü ile oluşturulan kullanıcıların hangi rollere atandığı doğrulanmıştır.</w:t>
+      </w:r>
+    </w:p>
+    <w:p>
+      <w:pPr>
+        <w:shd w:fill="F2F2F2" w:val="clear"/>
+        <w:spacing w:after="0" w:before="0"/>
+      </w:pPr>
+      <w:r>
+        <w:rPr>
+          <w:rFonts w:ascii="Courier New" w:cs="Courier New" w:eastAsia="Courier New" w:hAnsi="Courier New"/>
+          <w:sz w:val="18"/>
+          <w:szCs w:val="18"/>
+        </w:rPr>
+        <w:t xml:space="preserve">SELECT dp.name AS KullaniciAdi,</w:t>
+      </w:r>
+    </w:p>
+    <w:p>
+      <w:pPr>
+        <w:shd w:fill="F2F2F2" w:val="clear"/>
+        <w:spacing w:after="0" w:before="0"/>
+      </w:pPr>
+      <w:r>
+        <w:rPr>
+          <w:rFonts w:ascii="Courier New" w:cs="Courier New" w:eastAsia="Courier New" w:hAnsi="Courier New"/>
+          <w:sz w:val="18"/>
+          <w:szCs w:val="18"/>
+        </w:rPr>
+        <w:t xml:space="preserve">       rp.name AS RolAdi, rp.type_desc AS RolTuru</w:t>
+      </w:r>
+    </w:p>
+    <w:p>
+      <w:pPr>
+        <w:shd w:fill="F2F2F2" w:val="clear"/>
+        <w:spacing w:after="0" w:before="0"/>
+      </w:pPr>
+      <w:r>
+        <w:rPr>
+          <w:rFonts w:ascii="Courier New" w:cs="Courier New" w:eastAsia="Courier New" w:hAnsi="Courier New"/>
+          <w:sz w:val="18"/>
+          <w:szCs w:val="18"/>
+        </w:rPr>
+        <w:t xml:space="preserve">FROM sys.database_role_members drm</w:t>
+      </w:r>
+    </w:p>
+    <w:p>
+      <w:pPr>
+        <w:shd w:fill="F2F2F2" w:val="clear"/>
+        <w:spacing w:after="0" w:before="0"/>
+      </w:pPr>
+      <w:r>
+        <w:rPr>
+          <w:rFonts w:ascii="Courier New" w:cs="Courier New" w:eastAsia="Courier New" w:hAnsi="Courier New"/>
+          <w:sz w:val="18"/>
+          <w:szCs w:val="18"/>
+        </w:rPr>
+        <w:t xml:space="preserve">JOIN sys.database_principals dp</w:t>
+      </w:r>
+    </w:p>
+    <w:p>
+      <w:pPr>
+        <w:shd w:fill="F2F2F2" w:val="clear"/>
+        <w:spacing w:after="0" w:before="0"/>
+      </w:pPr>
+      <w:r>
+        <w:rPr>
+          <w:rFonts w:ascii="Courier New" w:cs="Courier New" w:eastAsia="Courier New" w:hAnsi="Courier New"/>
+          <w:sz w:val="18"/>
+          <w:szCs w:val="18"/>
+        </w:rPr>
+        <w:t xml:space="preserve">    ON drm.member_principal_id = dp.principal_id</w:t>
+      </w:r>
+    </w:p>
+    <w:p>
+      <w:pPr>
+        <w:shd w:fill="F2F2F2" w:val="clear"/>
+        <w:spacing w:after="0" w:before="0"/>
+      </w:pPr>
+      <w:r>
+        <w:rPr>
+          <w:rFonts w:ascii="Courier New" w:cs="Courier New" w:eastAsia="Courier New" w:hAnsi="Courier New"/>
+          <w:sz w:val="18"/>
+          <w:szCs w:val="18"/>
+        </w:rPr>
+        <w:t xml:space="preserve">JOIN sys.database_principals rp</w:t>
+      </w:r>
+    </w:p>
+    <w:p>
+      <w:pPr>
+        <w:shd w:fill="F2F2F2" w:val="clear"/>
+        <w:spacing w:after="0" w:before="0"/>
+      </w:pPr>
+      <w:r>
+        <w:rPr>
+          <w:rFonts w:ascii="Courier New" w:cs="Courier New" w:eastAsia="Courier New" w:hAnsi="Courier New"/>
+          <w:sz w:val="18"/>
+          <w:szCs w:val="18"/>
+        </w:rPr>
+        <w:t xml:space="preserve">    ON drm.role_principal_id = rp.principal_id</w:t>
+      </w:r>
+    </w:p>
+    <w:p>
+      <w:pPr>
+        <w:shd w:fill="F2F2F2" w:val="clear"/>
+        <w:spacing w:after="0" w:before="0"/>
+      </w:pPr>
+      <w:r>
+        <w:rPr>
+          <w:rFonts w:ascii="Courier New" w:cs="Courier New" w:eastAsia="Courier New" w:hAnsi="Courier New"/>
+          <w:sz w:val="18"/>
+          <w:szCs w:val="18"/>
+        </w:rPr>
+        <w:t xml:space="preserve">WHERE dp.name IN ('taxi_reader', 'taxi_writer')</w:t>
+      </w:r>
+    </w:p>
+    <w:p>
+      <w:pPr>
+        <w:shd w:fill="F2F2F2" w:val="clear"/>
+        <w:spacing w:after="0" w:before="0"/>
+      </w:pPr>
+      <w:r>
+        <w:rPr>
+          <w:rFonts w:ascii="Courier New" w:cs="Courier New" w:eastAsia="Courier New" w:hAnsi="Courier New"/>
+          <w:sz w:val="18"/>
+          <w:szCs w:val="18"/>
+        </w:rPr>
+        <w:t xml:space="preserve">ORDER BY dp.name;</w:t>
+      </w:r>
+    </w:p>
+    <w:p>
+      <w:pPr>
+        <w:spacing w:after="100" w:before="100"/>
+      </w:pPr>
+    </w:p>
+    <w:p>
+      <w:pPr>
+        <w:spacing w:after="40" w:before="100"/>
+        <w:jc w:val="center"/>
+      </w:pPr>
+      <w:r>
+        <w:drawing>
+          <wp:inline distT="0" distB="0" distL="0" distR="0">
+            <wp:extent cx="4762500" cy="2571750"/>
+            <wp:effectExtent t="0" r="0" b="0" l="0"/>
+            <wp:docPr id="1" name="Rol üyelikleri" descr="Rol üyelikleri" title="Rol üyelikleri"/>
+            <wp:cNvGraphicFramePr>
+              <a:graphicFrameLocks xmlns:a="http://schemas.openxmlformats.org/drawingml/2006/main" noChangeAspect="1"/>
+            </wp:cNvGraphicFramePr>
+            <a:graphic xmlns:a="http://schemas.openxmlformats.org/drawingml/2006/main">
+              <a:graphicData uri="http://schemas.openxmlformats.org/drawingml/2006/picture">
+                <pic:pic xmlns:pic="http://schemas.openxmlformats.org/drawingml/2006/picture">
+                  <pic:nvPicPr>
+                    <pic:cNvPr id="0" name="" descr=""/>
+                    <pic:cNvPicPr>
+                      <a:picLocks noChangeAspect="1" noChangeArrowheads="1"/>
+                    </pic:cNvPicPr>
+                  </pic:nvPicPr>
+                  <pic:blipFill>
+                    <a:blip r:embed="rId36" cstate="none"/>
+                    <a:srcRect/>
+                    <a:stretch>
+                      <a:fillRect/>
+                    </a:stretch>
+                  </pic:blipFill>
+                  <pic:spPr bwMode="auto">
+                    <a:xfrm>
+                      <a:off x="0" y="0"/>
+                      <a:ext cx="4762500" cy="2571750"/>
+                    </a:xfrm>
+                    <a:prstGeom prst="rect">
+                      <a:avLst/>
+                    </a:prstGeom>
+                  </pic:spPr>
+                </pic:pic>
+              </a:graphicData>
+            </a:graphic>
+          </wp:inline>
+        </w:drawing>
+      </w:r>
+    </w:p>
+    <w:p>
+      <w:pPr>
+        <w:spacing w:after="160" w:before="40"/>
+        <w:jc w:val="center"/>
+      </w:pPr>
+      <w:r>
+        <w:rPr>
+          <w:rFonts w:ascii="Times New Roman" w:cs="Times New Roman" w:eastAsia="Times New Roman" w:hAnsi="Times New Roman"/>
+          <w:i/>
+          <w:iCs/>
+          <w:sz w:val="18"/>
+          <w:szCs w:val="18"/>
+        </w:rPr>
+        <w:t xml:space="preserve">Şekil 28 – taxi_reader → db_datareader | taxi_writer → db_datareader + db_datawriter</w:t>
+      </w:r>
+    </w:p>
+    <w:p>
+      <w:pPr>
+        <w:pStyle w:val="Heading2"/>
+        <w:spacing w:after="80" w:before="200"/>
+      </w:pPr>
+      <w:r>
+        <w:rPr>
+          <w:rFonts w:ascii="Times New Roman" w:cs="Times New Roman" w:eastAsia="Times New Roman" w:hAnsi="Times New Roman"/>
+          <w:b/>
+          <w:bCs/>
+          <w:sz w:val="24"/>
+          <w:szCs w:val="24"/>
+        </w:rPr>
+        <w:t xml:space="preserve">6.5 İzin Listesi</w:t>
+      </w:r>
+    </w:p>
+    <w:p>
+      <w:pPr>
+        <w:spacing w:after="80" w:before="80"/>
+        <w:jc w:val="both"/>
+      </w:pPr>
+      <w:r>
+        <w:rPr>
+          <w:rFonts w:ascii="Times New Roman" w:cs="Times New Roman" w:eastAsia="Times New Roman" w:hAnsi="Times New Roman"/>
+          <w:sz w:val="22"/>
+          <w:szCs w:val="22"/>
+        </w:rPr>
+        <w:t xml:space="preserve">sys.database_permissions görünümü ile kullanıcılara verilen izinler nesne bazında listelenmiştir.</w:t>
+      </w:r>
+    </w:p>
+    <w:p>
+      <w:pPr>
+        <w:shd w:fill="F2F2F2" w:val="clear"/>
+        <w:spacing w:after="0" w:before="0"/>
+      </w:pPr>
+      <w:r>
+        <w:rPr>
+          <w:rFonts w:ascii="Courier New" w:cs="Courier New" w:eastAsia="Courier New" w:hAnsi="Courier New"/>
+          <w:sz w:val="18"/>
+          <w:szCs w:val="18"/>
+        </w:rPr>
+        <w:t xml:space="preserve">SELECT pr.name AS KullaniciAdi,</w:t>
+      </w:r>
+    </w:p>
+    <w:p>
+      <w:pPr>
+        <w:shd w:fill="F2F2F2" w:val="clear"/>
+        <w:spacing w:after="0" w:before="0"/>
+      </w:pPr>
+      <w:r>
+        <w:rPr>
+          <w:rFonts w:ascii="Courier New" w:cs="Courier New" w:eastAsia="Courier New" w:hAnsi="Courier New"/>
+          <w:sz w:val="18"/>
+          <w:szCs w:val="18"/>
+        </w:rPr>
+        <w:t xml:space="preserve">       pe.state_desc AS IzinDurumu,</w:t>
+      </w:r>
+    </w:p>
+    <w:p>
+      <w:pPr>
+        <w:shd w:fill="F2F2F2" w:val="clear"/>
+        <w:spacing w:after="0" w:before="0"/>
+      </w:pPr>
+      <w:r>
+        <w:rPr>
+          <w:rFonts w:ascii="Courier New" w:cs="Courier New" w:eastAsia="Courier New" w:hAnsi="Courier New"/>
+          <w:sz w:val="18"/>
+          <w:szCs w:val="18"/>
+        </w:rPr>
+        <w:t xml:space="preserve">       pe.permission_name AS IzinAdi,</w:t>
+      </w:r>
+    </w:p>
+    <w:p>
+      <w:pPr>
+        <w:shd w:fill="F2F2F2" w:val="clear"/>
+        <w:spacing w:after="0" w:before="0"/>
+      </w:pPr>
+      <w:r>
+        <w:rPr>
+          <w:rFonts w:ascii="Courier New" w:cs="Courier New" w:eastAsia="Courier New" w:hAnsi="Courier New"/>
+          <w:sz w:val="18"/>
+          <w:szCs w:val="18"/>
+        </w:rPr>
+        <w:t xml:space="preserve">       OBJECT_NAME(pe.major_id) AS NesneAdi</w:t>
+      </w:r>
+    </w:p>
+    <w:p>
+      <w:pPr>
+        <w:shd w:fill="F2F2F2" w:val="clear"/>
+        <w:spacing w:after="0" w:before="0"/>
+      </w:pPr>
+      <w:r>
+        <w:rPr>
+          <w:rFonts w:ascii="Courier New" w:cs="Courier New" w:eastAsia="Courier New" w:hAnsi="Courier New"/>
+          <w:sz w:val="18"/>
+          <w:szCs w:val="18"/>
+        </w:rPr>
+        <w:t xml:space="preserve">FROM sys.database_permissions pe</w:t>
+      </w:r>
+    </w:p>
+    <w:p>
+      <w:pPr>
+        <w:shd w:fill="F2F2F2" w:val="clear"/>
+        <w:spacing w:after="0" w:before="0"/>
+      </w:pPr>
+      <w:r>
+        <w:rPr>
+          <w:rFonts w:ascii="Courier New" w:cs="Courier New" w:eastAsia="Courier New" w:hAnsi="Courier New"/>
+          <w:sz w:val="18"/>
+          <w:szCs w:val="18"/>
+        </w:rPr>
+        <w:t xml:space="preserve">JOIN sys.database_principals pr</w:t>
+      </w:r>
+    </w:p>
+    <w:p>
+      <w:pPr>
+        <w:shd w:fill="F2F2F2" w:val="clear"/>
+        <w:spacing w:after="0" w:before="0"/>
+      </w:pPr>
+      <w:r>
+        <w:rPr>
+          <w:rFonts w:ascii="Courier New" w:cs="Courier New" w:eastAsia="Courier New" w:hAnsi="Courier New"/>
+          <w:sz w:val="18"/>
+          <w:szCs w:val="18"/>
+        </w:rPr>
+        <w:t xml:space="preserve">    ON pe.grantee_principal_id = pr.principal_id</w:t>
+      </w:r>
+    </w:p>
+    <w:p>
+      <w:pPr>
+        <w:shd w:fill="F2F2F2" w:val="clear"/>
+        <w:spacing w:after="0" w:before="0"/>
+      </w:pPr>
+      <w:r>
+        <w:rPr>
+          <w:rFonts w:ascii="Courier New" w:cs="Courier New" w:eastAsia="Courier New" w:hAnsi="Courier New"/>
+          <w:sz w:val="18"/>
+          <w:szCs w:val="18"/>
+        </w:rPr>
+        <w:t xml:space="preserve">WHERE pr.name IN ('taxi_reader', 'taxi_writer');</w:t>
+      </w:r>
+    </w:p>
+    <w:p>
+      <w:pPr>
+        <w:spacing w:after="100" w:before="100"/>
+      </w:pPr>
+    </w:p>
+    <w:p>
+      <w:pPr>
+        <w:spacing w:after="40" w:before="100"/>
+        <w:jc w:val="center"/>
+      </w:pPr>
+      <w:r>
+        <w:drawing>
+          <wp:inline distT="0" distB="0" distL="0" distR="0">
+            <wp:extent cx="4762500" cy="2286000"/>
+            <wp:effectExtent t="0" r="0" b="0" l="0"/>
+            <wp:docPr id="1" name="İzin listesi" descr="İzin listesi" title="İzin listesi"/>
+            <wp:cNvGraphicFramePr>
+              <a:graphicFrameLocks xmlns:a="http://schemas.openxmlformats.org/drawingml/2006/main" noChangeAspect="1"/>
+            </wp:cNvGraphicFramePr>
+            <a:graphic xmlns:a="http://schemas.openxmlformats.org/drawingml/2006/main">
+              <a:graphicData uri="http://schemas.openxmlformats.org/drawingml/2006/picture">
+                <pic:pic xmlns:pic="http://schemas.openxmlformats.org/drawingml/2006/picture">
+                  <pic:nvPicPr>
+                    <pic:cNvPr id="0" name="" descr=""/>
+                    <pic:cNvPicPr>
+                      <a:picLocks noChangeAspect="1" noChangeArrowheads="1"/>
+                    </pic:cNvPicPr>
+                  </pic:nvPicPr>
+                  <pic:blipFill>
+                    <a:blip r:embed="rId37" cstate="none"/>
+                    <a:srcRect/>
+                    <a:stretch>
+                      <a:fillRect/>
+                    </a:stretch>
+                  </pic:blipFill>
+                  <pic:spPr bwMode="auto">
+                    <a:xfrm>
+                      <a:off x="0" y="0"/>
+                      <a:ext cx="4762500" cy="2286000"/>
+                    </a:xfrm>
+                    <a:prstGeom prst="rect">
+                      <a:avLst/>
+                    </a:prstGeom>
+                  </pic:spPr>
+                </pic:pic>
+              </a:graphicData>
+            </a:graphic>
+          </wp:inline>
+        </w:drawing>
+      </w:r>
+    </w:p>
+    <w:p>
+      <w:pPr>
+        <w:spacing w:after="160" w:before="40"/>
+        <w:jc w:val="center"/>
+      </w:pPr>
+      <w:r>
+        <w:rPr>
+          <w:rFonts w:ascii="Times New Roman" w:cs="Times New Roman" w:eastAsia="Times New Roman" w:hAnsi="Times New Roman"/>
+          <w:i/>
+          <w:iCs/>
+          <w:sz w:val="18"/>
+          <w:szCs w:val="18"/>
+        </w:rPr>
+        <w:t xml:space="preserve">Şekil 29 – Her iki kullanıcıya GRANT CONNECT izni verildi</w:t>
+      </w:r>
+    </w:p>
+    <w:p>
+      <w:pPr>
+        <w:spacing w:after="80" w:before="80"/>
+        <w:jc w:val="both"/>
+      </w:pPr>
+      <w:r>
+        <w:rPr>
+          <w:rFonts w:ascii="Times New Roman" w:cs="Times New Roman" w:eastAsia="Times New Roman" w:hAnsi="Times New Roman"/>
+          <w:sz w:val="22"/>
+          <w:szCs w:val="22"/>
+        </w:rPr>
+        <w:t xml:space="preserve">Sonuç: taxi_reader kullanıcısı yalnızca veri okuyabilir; INSERT, UPDATE ve DELETE işlemleri gerçekleştiremez. taxi_writer kullanıcısı okuma ve yazma yetkilerine sahiptir. Bu rol tabanlı erişim modeli (RBAC), veritabanı güvenliğinin temel pratiğidir.</w:t>
+      </w:r>
+    </w:p>
+    <w:p>
+      <w:pPr>
+        <w:spacing w:after="100" w:before="100"/>
+      </w:pPr>
     </w:p>
     <w:p>
       <w:pPr>
@@ -3953,14 +4977,424 @@
       <w:r>
         <w:rPr>
           <w:rFonts w:ascii="Times New Roman" w:cs="Times New Roman" w:eastAsia="Times New Roman" w:hAnsi="Times New Roman"/>
-          <w:i/>
-          <w:iCs/>
-          <w:color w:val="888888"/>
           <w:sz w:val="22"/>
           <w:szCs w:val="22"/>
         </w:rPr>
-        <w:t xml:space="preserve">Bu bölüm doldurulacaktır.</w:t>
-      </w:r>
+        <w:t xml:space="preserve">Bu proje kapsamında 1.703.957 gerçek taksi yolculuk kaydı içeren NYCTaxi_Sample veritabanı üzerinde kapsamlı bir performans optimizasyonu çalışması gerçekleştirilmiştir. Dört temel konu ele alınmış ve her biri somut bulgularla desteklenmiştir.</w:t>
+      </w:r>
+    </w:p>
+    <w:p>
+      <w:pPr>
+        <w:spacing w:after="100" w:before="100"/>
+      </w:pPr>
+    </w:p>
+    <w:p>
+      <w:pPr>
+        <w:spacing w:after="80" w:before="80"/>
+        <w:jc w:val="both"/>
+      </w:pPr>
+      <w:r>
+        <w:rPr>
+          <w:rFonts w:ascii="Times New Roman" w:cs="Times New Roman" w:eastAsia="Times New Roman" w:hAnsi="Times New Roman"/>
+          <w:sz w:val="22"/>
+          <w:szCs w:val="22"/>
+        </w:rPr>
+        <w:t xml:space="preserve">DMV izleme çalışmasında sys.dm_exec_query_stats, sys.dm_exec_sessions, sys.database_files ve sys.dm_db_partition_stats görünümleri kullanılarak veritabanının anlık durumu analiz edilmiştir. En yoğun kaynak kullanan sorgunun 129ms süre ve 129.394 logical read tükettiği tespit edilmiştir.</w:t>
+      </w:r>
+    </w:p>
+    <w:p>
+      <w:pPr>
+        <w:spacing w:after="100" w:before="100"/>
+      </w:pPr>
+    </w:p>
+    <w:p>
+      <w:pPr>
+        <w:spacing w:after="80" w:before="80"/>
+        <w:jc w:val="both"/>
+      </w:pPr>
+      <w:r>
+        <w:rPr>
+          <w:rFonts w:ascii="Times New Roman" w:cs="Times New Roman" w:eastAsia="Times New Roman" w:hAnsi="Times New Roman"/>
+          <w:sz w:val="22"/>
+          <w:szCs w:val="22"/>
+        </w:rPr>
+        <w:t xml:space="preserve">İndeks yönetiminde tabloda halihazırda bulunan CLUSTERED COLUMNSTORE indeksi (nyc_cci) incelenmiş; pickup_datetime sütunu için ek bir B-Tree indeksi (IX_nyctaxi_pickup_datetime) oluşturulmuştur. İndeks kullanım istatistikleri, yeni indeksin sorgu tarafından aktif olarak kullanıldığını (1 seek) doğrulamıştır.</w:t>
+      </w:r>
+    </w:p>
+    <w:p>
+      <w:pPr>
+        <w:spacing w:after="100" w:before="100"/>
+      </w:pPr>
+    </w:p>
+    <w:p>
+      <w:pPr>
+        <w:spacing w:after="80" w:before="80"/>
+        <w:jc w:val="both"/>
+      </w:pPr>
+      <w:r>
+        <w:rPr>
+          <w:rFonts w:ascii="Times New Roman" w:cs="Times New Roman" w:eastAsia="Times New Roman" w:hAnsi="Times New Roman"/>
+          <w:sz w:val="22"/>
+          <w:szCs w:val="22"/>
+        </w:rPr>
+        <w:t xml:space="preserve">Sorgu optimizasyonu bölümünde YEAR() fonksiyonu kullanan sorgu ile doğrudan tarih aralığı kullanan sorgu karşılaştırılmıştır. Her iki sorgu aynı sonucu üretmekle birlikte, tarih aralığı yöntemi indeksin devreye girmesine olanak tanıdığından daha verimlidir.</w:t>
+      </w:r>
+    </w:p>
+    <w:p>
+      <w:pPr>
+        <w:spacing w:after="100" w:before="100"/>
+      </w:pPr>
+    </w:p>
+    <w:p>
+      <w:pPr>
+        <w:spacing w:after="80" w:before="80"/>
+        <w:jc w:val="both"/>
+      </w:pPr>
+      <w:r>
+        <w:rPr>
+          <w:rFonts w:ascii="Times New Roman" w:cs="Times New Roman" w:eastAsia="Times New Roman" w:hAnsi="Times New Roman"/>
+          <w:sz w:val="22"/>
+          <w:szCs w:val="22"/>
+        </w:rPr>
+        <w:t xml:space="preserve">Erişim yönetiminde rol tabanlı erişim kontrolü (RBAC) uygulanmış; salt okunur taxi_reader ve okuma-yazma yetkili taxi_writer kullanıcıları oluşturularak veritabanı güvenlik mimarisi kurulmuştur.</w:t>
+      </w:r>
+    </w:p>
+    <w:p>
+      <w:pPr>
+        <w:spacing w:after="100" w:before="100"/>
+      </w:pPr>
+    </w:p>
+    <w:tbl>
+      <w:tblPr>
+        <w:tblW w:type="dxa" w:w="8526"/>
+        <w:tblBorders>
+          <w:top w:val="single" w:color="auto" w:sz="4"/>
+          <w:left w:val="single" w:color="auto" w:sz="4"/>
+          <w:bottom w:val="single" w:color="auto" w:sz="4"/>
+          <w:right w:val="single" w:color="auto" w:sz="4"/>
+          <w:insideH w:val="single" w:color="auto" w:sz="4"/>
+          <w:insideV w:val="single" w:color="auto" w:sz="4"/>
+        </w:tblBorders>
+      </w:tblPr>
+      <w:tblGrid>
+        <w:gridCol w:w="3500"/>
+        <w:gridCol w:w="5026"/>
+      </w:tblGrid>
+      <w:tr>
+        <w:tc>
+          <w:tcPr>
+            <w:tcW w:type="dxa" w:w="3500"/>
+            <w:tcBorders>
+              <w:top w:val="single" w:color="AAAAAA" w:sz="1"/>
+              <w:left w:val="single" w:color="AAAAAA" w:sz="1"/>
+              <w:bottom w:val="single" w:color="AAAAAA" w:sz="1"/>
+              <w:right w:val="single" w:color="AAAAAA" w:sz="1"/>
+            </w:tcBorders>
+            <w:shd w:fill="DDDDDD" w:val="clear"/>
+            <w:tcMar>
+              <w:top w:type="dxa" w:w="60"/>
+              <w:left w:type="dxa" w:w="100"/>
+              <w:bottom w:type="dxa" w:w="60"/>
+              <w:right w:type="dxa" w:w="100"/>
+            </w:tcMar>
+          </w:tcPr>
+          <w:p>
+            <w:r>
+              <w:rPr>
+                <w:rFonts w:ascii="Times New Roman" w:cs="Times New Roman" w:eastAsia="Times New Roman" w:hAnsi="Times New Roman"/>
+                <w:b/>
+                <w:bCs/>
+                <w:sz w:val="20"/>
+                <w:szCs w:val="20"/>
+              </w:rPr>
+              <w:t xml:space="preserve">Konu</w:t>
+            </w:r>
+          </w:p>
+        </w:tc>
+        <w:tc>
+          <w:tcPr>
+            <w:tcW w:type="dxa" w:w="5026"/>
+            <w:tcBorders>
+              <w:top w:val="single" w:color="AAAAAA" w:sz="1"/>
+              <w:left w:val="single" w:color="AAAAAA" w:sz="1"/>
+              <w:bottom w:val="single" w:color="AAAAAA" w:sz="1"/>
+              <w:right w:val="single" w:color="AAAAAA" w:sz="1"/>
+            </w:tcBorders>
+            <w:shd w:fill="DDDDDD" w:val="clear"/>
+            <w:tcMar>
+              <w:top w:type="dxa" w:w="60"/>
+              <w:left w:type="dxa" w:w="100"/>
+              <w:bottom w:type="dxa" w:w="60"/>
+              <w:right w:type="dxa" w:w="100"/>
+            </w:tcMar>
+          </w:tcPr>
+          <w:p>
+            <w:r>
+              <w:rPr>
+                <w:rFonts w:ascii="Times New Roman" w:cs="Times New Roman" w:eastAsia="Times New Roman" w:hAnsi="Times New Roman"/>
+                <w:b/>
+                <w:bCs/>
+                <w:sz w:val="20"/>
+                <w:szCs w:val="20"/>
+              </w:rPr>
+              <w:t xml:space="preserve">Bulgu</w:t>
+            </w:r>
+          </w:p>
+        </w:tc>
+      </w:tr>
+      <w:tr>
+        <w:tc>
+          <w:tcPr>
+            <w:tcW w:type="dxa" w:w="3500"/>
+            <w:tcBorders>
+              <w:top w:val="single" w:color="AAAAAA" w:sz="1"/>
+              <w:left w:val="single" w:color="AAAAAA" w:sz="1"/>
+              <w:bottom w:val="single" w:color="AAAAAA" w:sz="1"/>
+              <w:right w:val="single" w:color="AAAAAA" w:sz="1"/>
+            </w:tcBorders>
+            <w:shd w:fill="FFFFFF" w:val="clear"/>
+            <w:tcMar>
+              <w:top w:type="dxa" w:w="60"/>
+              <w:left w:type="dxa" w:w="100"/>
+              <w:bottom w:type="dxa" w:w="60"/>
+              <w:right w:type="dxa" w:w="100"/>
+            </w:tcMar>
+          </w:tcPr>
+          <w:p>
+            <w:r>
+              <w:rPr>
+                <w:rFonts w:ascii="Times New Roman" w:cs="Times New Roman" w:eastAsia="Times New Roman" w:hAnsi="Times New Roman"/>
+                <w:b w:val="false"/>
+                <w:bCs w:val="false"/>
+                <w:sz w:val="20"/>
+                <w:szCs w:val="20"/>
+              </w:rPr>
+              <w:t xml:space="preserve">DMV İzleme</w:t>
+            </w:r>
+          </w:p>
+        </w:tc>
+        <w:tc>
+          <w:tcPr>
+            <w:tcW w:type="dxa" w:w="5026"/>
+            <w:tcBorders>
+              <w:top w:val="single" w:color="AAAAAA" w:sz="1"/>
+              <w:left w:val="single" w:color="AAAAAA" w:sz="1"/>
+              <w:bottom w:val="single" w:color="AAAAAA" w:sz="1"/>
+              <w:right w:val="single" w:color="AAAAAA" w:sz="1"/>
+            </w:tcBorders>
+            <w:shd w:fill="FFFFFF" w:val="clear"/>
+            <w:tcMar>
+              <w:top w:type="dxa" w:w="60"/>
+              <w:left w:type="dxa" w:w="100"/>
+              <w:bottom w:type="dxa" w:w="60"/>
+              <w:right w:type="dxa" w:w="100"/>
+            </w:tcMar>
+          </w:tcPr>
+          <w:p>
+            <w:r>
+              <w:rPr>
+                <w:rFonts w:ascii="Times New Roman" w:cs="Times New Roman" w:eastAsia="Times New Roman" w:hAnsi="Times New Roman"/>
+                <w:b w:val="false"/>
+                <w:bCs w:val="false"/>
+                <w:sz w:val="20"/>
+                <w:szCs w:val="20"/>
+              </w:rPr>
+              <w:t xml:space="preserve">En pahalı sorgu: 129ms, 129.394 logical read</w:t>
+            </w:r>
+          </w:p>
+        </w:tc>
+      </w:tr>
+      <w:tr>
+        <w:tc>
+          <w:tcPr>
+            <w:tcW w:type="dxa" w:w="3500"/>
+            <w:tcBorders>
+              <w:top w:val="single" w:color="AAAAAA" w:sz="1"/>
+              <w:left w:val="single" w:color="AAAAAA" w:sz="1"/>
+              <w:bottom w:val="single" w:color="AAAAAA" w:sz="1"/>
+              <w:right w:val="single" w:color="AAAAAA" w:sz="1"/>
+            </w:tcBorders>
+            <w:shd w:fill="FFFFFF" w:val="clear"/>
+            <w:tcMar>
+              <w:top w:type="dxa" w:w="60"/>
+              <w:left w:type="dxa" w:w="100"/>
+              <w:bottom w:type="dxa" w:w="60"/>
+              <w:right w:type="dxa" w:w="100"/>
+            </w:tcMar>
+          </w:tcPr>
+          <w:p>
+            <w:r>
+              <w:rPr>
+                <w:rFonts w:ascii="Times New Roman" w:cs="Times New Roman" w:eastAsia="Times New Roman" w:hAnsi="Times New Roman"/>
+                <w:b w:val="false"/>
+                <w:bCs w:val="false"/>
+                <w:sz w:val="20"/>
+                <w:szCs w:val="20"/>
+              </w:rPr>
+              <w:t xml:space="preserve">İndeks Yönetimi</w:t>
+            </w:r>
+          </w:p>
+        </w:tc>
+        <w:tc>
+          <w:tcPr>
+            <w:tcW w:type="dxa" w:w="5026"/>
+            <w:tcBorders>
+              <w:top w:val="single" w:color="AAAAAA" w:sz="1"/>
+              <w:left w:val="single" w:color="AAAAAA" w:sz="1"/>
+              <w:bottom w:val="single" w:color="AAAAAA" w:sz="1"/>
+              <w:right w:val="single" w:color="AAAAAA" w:sz="1"/>
+            </w:tcBorders>
+            <w:shd w:fill="FFFFFF" w:val="clear"/>
+            <w:tcMar>
+              <w:top w:type="dxa" w:w="60"/>
+              <w:left w:type="dxa" w:w="100"/>
+              <w:bottom w:type="dxa" w:w="60"/>
+              <w:right w:type="dxa" w:w="100"/>
+            </w:tcMar>
+          </w:tcPr>
+          <w:p>
+            <w:r>
+              <w:rPr>
+                <w:rFonts w:ascii="Times New Roman" w:cs="Times New Roman" w:eastAsia="Times New Roman" w:hAnsi="Times New Roman"/>
+                <w:b w:val="false"/>
+                <w:bCs w:val="false"/>
+                <w:sz w:val="20"/>
+                <w:szCs w:val="20"/>
+              </w:rPr>
+              <w:t xml:space="preserve">IX_nyctaxi_pickup_datetime → 1 seek (aktif kullanım)</w:t>
+            </w:r>
+          </w:p>
+        </w:tc>
+      </w:tr>
+      <w:tr>
+        <w:tc>
+          <w:tcPr>
+            <w:tcW w:type="dxa" w:w="3500"/>
+            <w:tcBorders>
+              <w:top w:val="single" w:color="AAAAAA" w:sz="1"/>
+              <w:left w:val="single" w:color="AAAAAA" w:sz="1"/>
+              <w:bottom w:val="single" w:color="AAAAAA" w:sz="1"/>
+              <w:right w:val="single" w:color="AAAAAA" w:sz="1"/>
+            </w:tcBorders>
+            <w:shd w:fill="FFFFFF" w:val="clear"/>
+            <w:tcMar>
+              <w:top w:type="dxa" w:w="60"/>
+              <w:left w:type="dxa" w:w="100"/>
+              <w:bottom w:type="dxa" w:w="60"/>
+              <w:right w:type="dxa" w:w="100"/>
+            </w:tcMar>
+          </w:tcPr>
+          <w:p>
+            <w:r>
+              <w:rPr>
+                <w:rFonts w:ascii="Times New Roman" w:cs="Times New Roman" w:eastAsia="Times New Roman" w:hAnsi="Times New Roman"/>
+                <w:b w:val="false"/>
+                <w:bCs w:val="false"/>
+                <w:sz w:val="20"/>
+                <w:szCs w:val="20"/>
+              </w:rPr>
+              <w:t xml:space="preserve">Sorgu Optimizasyonu</w:t>
+            </w:r>
+          </w:p>
+        </w:tc>
+        <w:tc>
+          <w:tcPr>
+            <w:tcW w:type="dxa" w:w="5026"/>
+            <w:tcBorders>
+              <w:top w:val="single" w:color="AAAAAA" w:sz="1"/>
+              <w:left w:val="single" w:color="AAAAAA" w:sz="1"/>
+              <w:bottom w:val="single" w:color="AAAAAA" w:sz="1"/>
+              <w:right w:val="single" w:color="AAAAAA" w:sz="1"/>
+            </w:tcBorders>
+            <w:shd w:fill="FFFFFF" w:val="clear"/>
+            <w:tcMar>
+              <w:top w:type="dxa" w:w="60"/>
+              <w:left w:type="dxa" w:w="100"/>
+              <w:bottom w:type="dxa" w:w="60"/>
+              <w:right w:type="dxa" w:w="100"/>
+            </w:tcMar>
+          </w:tcPr>
+          <w:p>
+            <w:r>
+              <w:rPr>
+                <w:rFonts w:ascii="Times New Roman" w:cs="Times New Roman" w:eastAsia="Times New Roman" w:hAnsi="Times New Roman"/>
+                <w:b w:val="false"/>
+                <w:bCs w:val="false"/>
+                <w:sz w:val="20"/>
+                <w:szCs w:val="20"/>
+              </w:rPr>
+              <w:t xml:space="preserve">YEAR() yerine tarih aralığı: indeks seek etkin</w:t>
+            </w:r>
+          </w:p>
+        </w:tc>
+      </w:tr>
+      <w:tr>
+        <w:tc>
+          <w:tcPr>
+            <w:tcW w:type="dxa" w:w="3500"/>
+            <w:tcBorders>
+              <w:top w:val="single" w:color="AAAAAA" w:sz="1"/>
+              <w:left w:val="single" w:color="AAAAAA" w:sz="1"/>
+              <w:bottom w:val="single" w:color="AAAAAA" w:sz="1"/>
+              <w:right w:val="single" w:color="AAAAAA" w:sz="1"/>
+            </w:tcBorders>
+            <w:shd w:fill="FFFFFF" w:val="clear"/>
+            <w:tcMar>
+              <w:top w:type="dxa" w:w="60"/>
+              <w:left w:type="dxa" w:w="100"/>
+              <w:bottom w:type="dxa" w:w="60"/>
+              <w:right w:type="dxa" w:w="100"/>
+            </w:tcMar>
+          </w:tcPr>
+          <w:p>
+            <w:r>
+              <w:rPr>
+                <w:rFonts w:ascii="Times New Roman" w:cs="Times New Roman" w:eastAsia="Times New Roman" w:hAnsi="Times New Roman"/>
+                <w:b w:val="false"/>
+                <w:bCs w:val="false"/>
+                <w:sz w:val="20"/>
+                <w:szCs w:val="20"/>
+              </w:rPr>
+              <w:t xml:space="preserve">Erişim Yönetimi</w:t>
+            </w:r>
+          </w:p>
+        </w:tc>
+        <w:tc>
+          <w:tcPr>
+            <w:tcW w:type="dxa" w:w="5026"/>
+            <w:tcBorders>
+              <w:top w:val="single" w:color="AAAAAA" w:sz="1"/>
+              <w:left w:val="single" w:color="AAAAAA" w:sz="1"/>
+              <w:bottom w:val="single" w:color="AAAAAA" w:sz="1"/>
+              <w:right w:val="single" w:color="AAAAAA" w:sz="1"/>
+            </w:tcBorders>
+            <w:shd w:fill="FFFFFF" w:val="clear"/>
+            <w:tcMar>
+              <w:top w:type="dxa" w:w="60"/>
+              <w:left w:type="dxa" w:w="100"/>
+              <w:bottom w:type="dxa" w:w="60"/>
+              <w:right w:type="dxa" w:w="100"/>
+            </w:tcMar>
+          </w:tcPr>
+          <w:p>
+            <w:r>
+              <w:rPr>
+                <w:rFonts w:ascii="Times New Roman" w:cs="Times New Roman" w:eastAsia="Times New Roman" w:hAnsi="Times New Roman"/>
+                <w:b w:val="false"/>
+                <w:bCs w:val="false"/>
+                <w:sz w:val="20"/>
+                <w:szCs w:val="20"/>
+              </w:rPr>
+              <w:t xml:space="preserve">taxi_reader (okuma), taxi_writer (okuma+yazma)</w:t>
+            </w:r>
+          </w:p>
+        </w:tc>
+      </w:tr>
+    </w:tbl>
+    <w:p>
+      <w:pPr>
+        <w:spacing w:after="100" w:before="100"/>
+      </w:pPr>
     </w:p>
     <w:sectPr>
       <w:headerReference w:type="default" r:id="rId7"/>

</xml_diff>

<commit_message>
Proje1 Adım6: Gereksiz indeks kaldırma (DROP INDEX) eklendi
</commit_message>
<xml_diff>
--- a/Proje1-PerformansOptimizasyonu/Proje1_Rapor.docx
+++ b/Proje1-PerformansOptimizasyonu/Proje1_Rapor.docx
@@ -3017,41 +3017,6 @@
     </w:p>
     <w:p>
       <w:pPr>
-        <w:pStyle w:val="Heading1"/>
-        <w:spacing w:after="120" w:before="320"/>
-      </w:pPr>
-      <w:r>
-        <w:rPr>
-          <w:rFonts w:ascii="Times New Roman" w:cs="Times New Roman" w:eastAsia="Times New Roman" w:hAnsi="Times New Roman"/>
-          <w:b/>
-          <w:bCs/>
-          <w:sz w:val="28"/>
-          <w:szCs w:val="28"/>
-        </w:rPr>
-        <w:t xml:space="preserve">5. Sorgu Optimizasyonu</w:t>
-      </w:r>
-    </w:p>
-    <w:p>
-      <w:pPr>
-        <w:spacing w:after="80" w:before="80"/>
-        <w:jc w:val="both"/>
-      </w:pPr>
-      <w:r>
-        <w:rPr>
-          <w:rFonts w:ascii="Times New Roman" w:cs="Times New Roman" w:eastAsia="Times New Roman" w:hAnsi="Times New Roman"/>
-          <w:sz w:val="22"/>
-          <w:szCs w:val="22"/>
-        </w:rPr>
-        <w:t xml:space="preserve">Sorgu optimizasyonu, veritabanı performansını artırmanın en etkili yollarından biridir. Bu bölümde aynı sonucu döndüren sorgular farklı yazım biçimleriyle karşılaştırılmış; fonksiyon kullanımının indeks üzerindeki olumsuz etkisi ve doğru yazım biçiminin performans kazanımı gözlemlenmiştir.</w:t>
-      </w:r>
-    </w:p>
-    <w:p>
-      <w:pPr>
-        <w:spacing w:after="100" w:before="100"/>
-      </w:pPr>
-    </w:p>
-    <w:p>
-      <w:pPr>
         <w:pStyle w:val="Heading2"/>
         <w:spacing w:after="80" w:before="200"/>
       </w:pPr>
@@ -3063,7 +3028,7 @@
           <w:sz w:val="24"/>
           <w:szCs w:val="24"/>
         </w:rPr>
-        <w:t xml:space="preserve">5.1 Optimize Edilmemiş Sorgu – YEAR() Fonksiyonu</w:t>
+        <w:t xml:space="preserve">4.6 Gereksiz İndeks Kaldırma</w:t>
       </w:r>
     </w:p>
     <w:p>
@@ -3077,119 +3042,91 @@
           <w:sz w:val="22"/>
           <w:szCs w:val="22"/>
         </w:rPr>
-        <w:t xml:space="preserve">YEAR() gibi fonksiyonların WHERE koşulunda kullanılması, SQL Server'ın indeks seek yapmasını engeller; bunun yerine tüm tablo taranır (index scan veya table scan). Sorgu ödeme tipine göre yolculuk sayısı ve ortalama ücret bilgilerini hesaplamaktadır.</w:t>
-      </w:r>
-    </w:p>
-    <w:p>
-      <w:pPr>
-        <w:shd w:fill="F2F2F2" w:val="clear"/>
-        <w:spacing w:after="0" w:before="0"/>
-      </w:pPr>
-      <w:r>
-        <w:rPr>
-          <w:rFonts w:ascii="Courier New" w:cs="Courier New" w:eastAsia="Courier New" w:hAnsi="Courier New"/>
-          <w:sz w:val="18"/>
-          <w:szCs w:val="18"/>
-        </w:rPr>
-        <w:t xml:space="preserve">SELECT payment_type, COUNT(*) AS YolculukSayisi,</w:t>
-      </w:r>
-    </w:p>
-    <w:p>
-      <w:pPr>
-        <w:shd w:fill="F2F2F2" w:val="clear"/>
-        <w:spacing w:after="0" w:before="0"/>
-      </w:pPr>
-      <w:r>
-        <w:rPr>
-          <w:rFonts w:ascii="Courier New" w:cs="Courier New" w:eastAsia="Courier New" w:hAnsi="Courier New"/>
-          <w:sz w:val="18"/>
-          <w:szCs w:val="18"/>
-        </w:rPr>
-        <w:t xml:space="preserve">    AVG(fare_amount) AS OrtalamaUcret,</w:t>
-      </w:r>
-    </w:p>
-    <w:p>
-      <w:pPr>
-        <w:shd w:fill="F2F2F2" w:val="clear"/>
-        <w:spacing w:after="0" w:before="0"/>
-      </w:pPr>
-      <w:r>
-        <w:rPr>
-          <w:rFonts w:ascii="Courier New" w:cs="Courier New" w:eastAsia="Courier New" w:hAnsi="Courier New"/>
-          <w:sz w:val="18"/>
-          <w:szCs w:val="18"/>
-        </w:rPr>
-        <w:t xml:space="preserve">    AVG(tip_amount) AS OrtalamaBahsis,</w:t>
-      </w:r>
-    </w:p>
-    <w:p>
-      <w:pPr>
-        <w:shd w:fill="F2F2F2" w:val="clear"/>
-        <w:spacing w:after="0" w:before="0"/>
-      </w:pPr>
-      <w:r>
-        <w:rPr>
-          <w:rFonts w:ascii="Courier New" w:cs="Courier New" w:eastAsia="Courier New" w:hAnsi="Courier New"/>
-          <w:sz w:val="18"/>
-          <w:szCs w:val="18"/>
-        </w:rPr>
-        <w:t xml:space="preserve">    AVG(trip_distance) AS OrtalamaMesafe</w:t>
-      </w:r>
-    </w:p>
-    <w:p>
-      <w:pPr>
-        <w:shd w:fill="F2F2F2" w:val="clear"/>
-        <w:spacing w:after="0" w:before="0"/>
-      </w:pPr>
-      <w:r>
-        <w:rPr>
-          <w:rFonts w:ascii="Courier New" w:cs="Courier New" w:eastAsia="Courier New" w:hAnsi="Courier New"/>
-          <w:sz w:val="18"/>
-          <w:szCs w:val="18"/>
-        </w:rPr>
-        <w:t xml:space="preserve">FROM nyctaxi_sample</w:t>
-      </w:r>
-    </w:p>
-    <w:p>
-      <w:pPr>
-        <w:shd w:fill="F2F2F2" w:val="clear"/>
-        <w:spacing w:after="0" w:before="0"/>
-      </w:pPr>
-      <w:r>
-        <w:rPr>
-          <w:rFonts w:ascii="Courier New" w:cs="Courier New" w:eastAsia="Courier New" w:hAnsi="Courier New"/>
-          <w:sz w:val="18"/>
-          <w:szCs w:val="18"/>
-        </w:rPr>
-        <w:t xml:space="preserve">WHERE YEAR(pickup_datetime) = 2013</w:t>
-      </w:r>
-    </w:p>
-    <w:p>
-      <w:pPr>
-        <w:shd w:fill="F2F2F2" w:val="clear"/>
-        <w:spacing w:after="0" w:before="0"/>
-      </w:pPr>
-      <w:r>
-        <w:rPr>
-          <w:rFonts w:ascii="Courier New" w:cs="Courier New" w:eastAsia="Courier New" w:hAnsi="Courier New"/>
-          <w:sz w:val="18"/>
-          <w:szCs w:val="18"/>
-        </w:rPr>
-        <w:t xml:space="preserve">GROUP BY payment_type</w:t>
-      </w:r>
-    </w:p>
-    <w:p>
-      <w:pPr>
-        <w:shd w:fill="F2F2F2" w:val="clear"/>
-        <w:spacing w:after="0" w:before="0"/>
-      </w:pPr>
-      <w:r>
-        <w:rPr>
-          <w:rFonts w:ascii="Courier New" w:cs="Courier New" w:eastAsia="Courier New" w:hAnsi="Courier New"/>
-          <w:sz w:val="18"/>
-          <w:szCs w:val="18"/>
-        </w:rPr>
-        <w:t xml:space="preserve">ORDER BY YolculukSayisi DESC;</w:t>
+        <w:t xml:space="preserve">Columnstore indeksi tüm sütunları zaten kapsamaktadır. Bu nedenle pickup_datetime üzerine oluşturulan B-Tree indeksi gereksiz hale gelmiş ve disk alanı ile yazma performansını olumsuz etkilemektedir. Aşağıda DROP INDEX işlemi gerçekleştirilmiştir.</w:t>
+      </w:r>
+    </w:p>
+    <w:p>
+      <w:pPr>
+        <w:shd w:fill="F2F2F2" w:val="clear"/>
+        <w:spacing w:after="0" w:before="0"/>
+      </w:pPr>
+      <w:r>
+        <w:rPr>
+          <w:rFonts w:ascii="Courier New" w:cs="Courier New" w:eastAsia="Courier New" w:hAnsi="Courier New"/>
+          <w:sz w:val="18"/>
+          <w:szCs w:val="18"/>
+        </w:rPr>
+        <w:t xml:space="preserve">-- Başlangıç durumu: Sadece nyc_cci mevcut</w:t>
+      </w:r>
+    </w:p>
+    <w:p>
+      <w:pPr>
+        <w:shd w:fill="F2F2F2" w:val="clear"/>
+        <w:spacing w:after="0" w:before="0"/>
+      </w:pPr>
+      <w:r>
+        <w:rPr>
+          <w:rFonts w:ascii="Courier New" w:cs="Courier New" w:eastAsia="Courier New" w:hAnsi="Courier New"/>
+          <w:sz w:val="18"/>
+          <w:szCs w:val="18"/>
+        </w:rPr>
+        <w:t xml:space="preserve">SELECT i.name AS IndeksAdi, i.type_desc AS IndeksTipi,</w:t>
+      </w:r>
+    </w:p>
+    <w:p>
+      <w:pPr>
+        <w:shd w:fill="F2F2F2" w:val="clear"/>
+        <w:spacing w:after="0" w:before="0"/>
+      </w:pPr>
+      <w:r>
+        <w:rPr>
+          <w:rFonts w:ascii="Courier New" w:cs="Courier New" w:eastAsia="Courier New" w:hAnsi="Courier New"/>
+          <w:sz w:val="18"/>
+          <w:szCs w:val="18"/>
+        </w:rPr>
+        <w:t xml:space="preserve">       OBJECT_NAME(i.object_id) AS TabloAdi</w:t>
+      </w:r>
+    </w:p>
+    <w:p>
+      <w:pPr>
+        <w:shd w:fill="F2F2F2" w:val="clear"/>
+        <w:spacing w:after="0" w:before="0"/>
+      </w:pPr>
+      <w:r>
+        <w:rPr>
+          <w:rFonts w:ascii="Courier New" w:cs="Courier New" w:eastAsia="Courier New" w:hAnsi="Courier New"/>
+          <w:sz w:val="18"/>
+          <w:szCs w:val="18"/>
+        </w:rPr>
+        <w:t xml:space="preserve">FROM sys.indexes i</w:t>
+      </w:r>
+    </w:p>
+    <w:p>
+      <w:pPr>
+        <w:shd w:fill="F2F2F2" w:val="clear"/>
+        <w:spacing w:after="0" w:before="0"/>
+      </w:pPr>
+      <w:r>
+        <w:rPr>
+          <w:rFonts w:ascii="Courier New" w:cs="Courier New" w:eastAsia="Courier New" w:hAnsi="Courier New"/>
+          <w:sz w:val="18"/>
+          <w:szCs w:val="18"/>
+        </w:rPr>
+        <w:t xml:space="preserve">WHERE OBJECT_NAME(i.object_id) = 'nyctaxi_sample'</w:t>
+      </w:r>
+    </w:p>
+    <w:p>
+      <w:pPr>
+        <w:shd w:fill="F2F2F2" w:val="clear"/>
+        <w:spacing w:after="0" w:before="0"/>
+      </w:pPr>
+      <w:r>
+        <w:rPr>
+          <w:rFonts w:ascii="Courier New" w:cs="Courier New" w:eastAsia="Courier New" w:hAnsi="Courier New"/>
+          <w:sz w:val="18"/>
+          <w:szCs w:val="18"/>
+        </w:rPr>
+        <w:t xml:space="preserve">AND i.name IS NOT NULL;</w:t>
       </w:r>
     </w:p>
     <w:p>
@@ -3205,9 +3142,9 @@
       <w:r>
         <w:drawing>
           <wp:inline distT="0" distB="0" distL="0" distR="0">
-            <wp:extent cx="4953000" cy="2476500"/>
+            <wp:extent cx="4953000" cy="1619250"/>
             <wp:effectExtent t="0" r="0" b="0" l="0"/>
-            <wp:docPr id="1" name="Optimize edilmemiş sorgu" descr="Optimize edilmemiş sorgu" title="Optimize edilmemiş sorgu"/>
+            <wp:docPr id="1" name="Drop öncesi indeks durumu" descr="Drop öncesi indeks durumu" title="Drop öncesi indeks durumu"/>
             <wp:cNvGraphicFramePr>
               <a:graphicFrameLocks xmlns:a="http://schemas.openxmlformats.org/drawingml/2006/main" noChangeAspect="1"/>
             </wp:cNvGraphicFramePr>
@@ -3230,7 +3167,7 @@
                   <pic:spPr bwMode="auto">
                     <a:xfrm>
                       <a:off x="0" y="0"/>
-                      <a:ext cx="4953000" cy="2476500"/>
+                      <a:ext cx="4953000" cy="1619250"/>
                     </a:xfrm>
                     <a:prstGeom prst="rect">
                       <a:avLst/>
@@ -3256,163 +3193,138 @@
           <w:sz w:val="18"/>
           <w:szCs w:val="18"/>
         </w:rPr>
-        <w:t xml:space="preserve">Şekil 21 – YEAR() fonksiyonu ile sorgu: CRD → 918.668, CSH → 778.170, NOC → 4.029 yolculuk</w:t>
-      </w:r>
-    </w:p>
-    <w:p>
-      <w:pPr>
-        <w:pStyle w:val="Heading2"/>
-        <w:spacing w:after="80" w:before="200"/>
-      </w:pPr>
-      <w:r>
-        <w:rPr>
-          <w:rFonts w:ascii="Times New Roman" w:cs="Times New Roman" w:eastAsia="Times New Roman" w:hAnsi="Times New Roman"/>
-          <w:b/>
-          <w:bCs/>
-          <w:sz w:val="24"/>
-          <w:szCs w:val="24"/>
-        </w:rPr>
-        <w:t xml:space="preserve">5.2 Optimize Edilmiş Sorgu – Tarih Aralığı Karşılaştırması</w:t>
-      </w:r>
-    </w:p>
-    <w:p>
-      <w:pPr>
-        <w:spacing w:after="80" w:before="80"/>
-        <w:jc w:val="both"/>
-      </w:pPr>
-      <w:r>
-        <w:rPr>
-          <w:rFonts w:ascii="Times New Roman" w:cs="Times New Roman" w:eastAsia="Times New Roman" w:hAnsi="Times New Roman"/>
-          <w:sz w:val="22"/>
-          <w:szCs w:val="22"/>
-        </w:rPr>
-        <w:t xml:space="preserve">Aynı filtreleme işlemi için fonksiyon yerine doğrudan tarih aralığı kullanılmıştır. Bu yazım biçimi IX_nyctaxi_pickup_datetime indeksinin seek operasyonuyla kullanılmasına olanak tanır ve sonuçlar birebir aynıdır.</w:t>
-      </w:r>
-    </w:p>
-    <w:p>
-      <w:pPr>
-        <w:shd w:fill="F2F2F2" w:val="clear"/>
-        <w:spacing w:after="0" w:before="0"/>
-      </w:pPr>
-      <w:r>
-        <w:rPr>
-          <w:rFonts w:ascii="Courier New" w:cs="Courier New" w:eastAsia="Courier New" w:hAnsi="Courier New"/>
-          <w:sz w:val="18"/>
-          <w:szCs w:val="18"/>
-        </w:rPr>
-        <w:t xml:space="preserve">SELECT payment_type, COUNT(*) AS YolculukSayisi,</w:t>
-      </w:r>
-    </w:p>
-    <w:p>
-      <w:pPr>
-        <w:shd w:fill="F2F2F2" w:val="clear"/>
-        <w:spacing w:after="0" w:before="0"/>
-      </w:pPr>
-      <w:r>
-        <w:rPr>
-          <w:rFonts w:ascii="Courier New" w:cs="Courier New" w:eastAsia="Courier New" w:hAnsi="Courier New"/>
-          <w:sz w:val="18"/>
-          <w:szCs w:val="18"/>
-        </w:rPr>
-        <w:t xml:space="preserve">    AVG(fare_amount) AS OrtalamaUcret,</w:t>
-      </w:r>
-    </w:p>
-    <w:p>
-      <w:pPr>
-        <w:shd w:fill="F2F2F2" w:val="clear"/>
-        <w:spacing w:after="0" w:before="0"/>
-      </w:pPr>
-      <w:r>
-        <w:rPr>
-          <w:rFonts w:ascii="Courier New" w:cs="Courier New" w:eastAsia="Courier New" w:hAnsi="Courier New"/>
-          <w:sz w:val="18"/>
-          <w:szCs w:val="18"/>
-        </w:rPr>
-        <w:t xml:space="preserve">    AVG(tip_amount) AS OrtalamaBahsis,</w:t>
-      </w:r>
-    </w:p>
-    <w:p>
-      <w:pPr>
-        <w:shd w:fill="F2F2F2" w:val="clear"/>
-        <w:spacing w:after="0" w:before="0"/>
-      </w:pPr>
-      <w:r>
-        <w:rPr>
-          <w:rFonts w:ascii="Courier New" w:cs="Courier New" w:eastAsia="Courier New" w:hAnsi="Courier New"/>
-          <w:sz w:val="18"/>
-          <w:szCs w:val="18"/>
-        </w:rPr>
-        <w:t xml:space="preserve">    AVG(trip_distance) AS OrtalamaMesafe</w:t>
-      </w:r>
-    </w:p>
-    <w:p>
-      <w:pPr>
-        <w:shd w:fill="F2F2F2" w:val="clear"/>
-        <w:spacing w:after="0" w:before="0"/>
-      </w:pPr>
-      <w:r>
-        <w:rPr>
-          <w:rFonts w:ascii="Courier New" w:cs="Courier New" w:eastAsia="Courier New" w:hAnsi="Courier New"/>
-          <w:sz w:val="18"/>
-          <w:szCs w:val="18"/>
-        </w:rPr>
-        <w:t xml:space="preserve">FROM nyctaxi_sample</w:t>
-      </w:r>
-    </w:p>
-    <w:p>
-      <w:pPr>
-        <w:shd w:fill="F2F2F2" w:val="clear"/>
-        <w:spacing w:after="0" w:before="0"/>
-      </w:pPr>
-      <w:r>
-        <w:rPr>
-          <w:rFonts w:ascii="Courier New" w:cs="Courier New" w:eastAsia="Courier New" w:hAnsi="Courier New"/>
-          <w:sz w:val="18"/>
-          <w:szCs w:val="18"/>
-        </w:rPr>
-        <w:t xml:space="preserve">WHERE pickup_datetime &gt;= '2013-01-01'</w:t>
-      </w:r>
-    </w:p>
-    <w:p>
-      <w:pPr>
-        <w:shd w:fill="F2F2F2" w:val="clear"/>
-        <w:spacing w:after="0" w:before="0"/>
-      </w:pPr>
-      <w:r>
-        <w:rPr>
-          <w:rFonts w:ascii="Courier New" w:cs="Courier New" w:eastAsia="Courier New" w:hAnsi="Courier New"/>
-          <w:sz w:val="18"/>
-          <w:szCs w:val="18"/>
-        </w:rPr>
-        <w:t xml:space="preserve">  AND pickup_datetime &lt; '2014-01-01'</w:t>
-      </w:r>
-    </w:p>
-    <w:p>
-      <w:pPr>
-        <w:shd w:fill="F2F2F2" w:val="clear"/>
-        <w:spacing w:after="0" w:before="0"/>
-      </w:pPr>
-      <w:r>
-        <w:rPr>
-          <w:rFonts w:ascii="Courier New" w:cs="Courier New" w:eastAsia="Courier New" w:hAnsi="Courier New"/>
-          <w:sz w:val="18"/>
-          <w:szCs w:val="18"/>
-        </w:rPr>
-        <w:t xml:space="preserve">GROUP BY payment_type</w:t>
-      </w:r>
-    </w:p>
-    <w:p>
-      <w:pPr>
-        <w:shd w:fill="F2F2F2" w:val="clear"/>
-        <w:spacing w:after="0" w:before="0"/>
-      </w:pPr>
-      <w:r>
-        <w:rPr>
-          <w:rFonts w:ascii="Courier New" w:cs="Courier New" w:eastAsia="Courier New" w:hAnsi="Courier New"/>
-          <w:sz w:val="18"/>
-          <w:szCs w:val="18"/>
-        </w:rPr>
-        <w:t xml:space="preserve">ORDER BY YolculukSayisi DESC;</w:t>
+        <w:t xml:space="preserve">Şekil 30 – Başlangıç: Sadece nyc_cci (CLUSTERED COLUMNSTORE) mevcut</w:t>
+      </w:r>
+    </w:p>
+    <w:p>
+      <w:pPr>
+        <w:spacing w:after="100" w:before="100"/>
+      </w:pPr>
+    </w:p>
+    <w:p>
+      <w:pPr>
+        <w:shd w:fill="F2F2F2" w:val="clear"/>
+        <w:spacing w:after="0" w:before="0"/>
+      </w:pPr>
+      <w:r>
+        <w:rPr>
+          <w:rFonts w:ascii="Courier New" w:cs="Courier New" w:eastAsia="Courier New" w:hAnsi="Courier New"/>
+          <w:sz w:val="18"/>
+          <w:szCs w:val="18"/>
+        </w:rPr>
+        <w:t xml:space="preserve">-- B-Tree indeksi oluştur (kaldırma demonstrasyonu için)</w:t>
+      </w:r>
+    </w:p>
+    <w:p>
+      <w:pPr>
+        <w:shd w:fill="F2F2F2" w:val="clear"/>
+        <w:spacing w:after="0" w:before="0"/>
+      </w:pPr>
+      <w:r>
+        <w:rPr>
+          <w:rFonts w:ascii="Courier New" w:cs="Courier New" w:eastAsia="Courier New" w:hAnsi="Courier New"/>
+          <w:sz w:val="18"/>
+          <w:szCs w:val="18"/>
+        </w:rPr>
+        <w:t xml:space="preserve">CREATE INDEX IX_nyctaxi_pickup_datetime</w:t>
+      </w:r>
+    </w:p>
+    <w:p>
+      <w:pPr>
+        <w:shd w:fill="F2F2F2" w:val="clear"/>
+        <w:spacing w:after="0" w:before="0"/>
+      </w:pPr>
+      <w:r>
+        <w:rPr>
+          <w:rFonts w:ascii="Courier New" w:cs="Courier New" w:eastAsia="Courier New" w:hAnsi="Courier New"/>
+          <w:sz w:val="18"/>
+          <w:szCs w:val="18"/>
+        </w:rPr>
+        <w:t xml:space="preserve">ON nyctaxi_sample(pickup_datetime);</w:t>
+      </w:r>
+    </w:p>
+    <w:p>
+      <w:pPr>
+        <w:shd w:fill="F2F2F2" w:val="clear"/>
+        <w:spacing w:after="0" w:before="0"/>
+      </w:pPr>
+      <w:r>
+        <w:rPr>
+          <w:rFonts w:ascii="Courier New" w:cs="Courier New" w:eastAsia="Courier New" w:hAnsi="Courier New"/>
+          <w:sz w:val="18"/>
+          <w:szCs w:val="18"/>
+        </w:rPr>
+        <w:t xml:space="preserve"/>
+      </w:r>
+    </w:p>
+    <w:p>
+      <w:pPr>
+        <w:shd w:fill="F2F2F2" w:val="clear"/>
+        <w:spacing w:after="0" w:before="0"/>
+      </w:pPr>
+      <w:r>
+        <w:rPr>
+          <w:rFonts w:ascii="Courier New" w:cs="Courier New" w:eastAsia="Courier New" w:hAnsi="Courier New"/>
+          <w:sz w:val="18"/>
+          <w:szCs w:val="18"/>
+        </w:rPr>
+        <w:t xml:space="preserve">SELECT i.name AS IndeksAdi, i.type_desc AS IndeksTipi,</w:t>
+      </w:r>
+    </w:p>
+    <w:p>
+      <w:pPr>
+        <w:shd w:fill="F2F2F2" w:val="clear"/>
+        <w:spacing w:after="0" w:before="0"/>
+      </w:pPr>
+      <w:r>
+        <w:rPr>
+          <w:rFonts w:ascii="Courier New" w:cs="Courier New" w:eastAsia="Courier New" w:hAnsi="Courier New"/>
+          <w:sz w:val="18"/>
+          <w:szCs w:val="18"/>
+        </w:rPr>
+        <w:t xml:space="preserve">       OBJECT_NAME(i.object_id) AS TabloAdi</w:t>
+      </w:r>
+    </w:p>
+    <w:p>
+      <w:pPr>
+        <w:shd w:fill="F2F2F2" w:val="clear"/>
+        <w:spacing w:after="0" w:before="0"/>
+      </w:pPr>
+      <w:r>
+        <w:rPr>
+          <w:rFonts w:ascii="Courier New" w:cs="Courier New" w:eastAsia="Courier New" w:hAnsi="Courier New"/>
+          <w:sz w:val="18"/>
+          <w:szCs w:val="18"/>
+        </w:rPr>
+        <w:t xml:space="preserve">FROM sys.indexes i</w:t>
+      </w:r>
+    </w:p>
+    <w:p>
+      <w:pPr>
+        <w:shd w:fill="F2F2F2" w:val="clear"/>
+        <w:spacing w:after="0" w:before="0"/>
+      </w:pPr>
+      <w:r>
+        <w:rPr>
+          <w:rFonts w:ascii="Courier New" w:cs="Courier New" w:eastAsia="Courier New" w:hAnsi="Courier New"/>
+          <w:sz w:val="18"/>
+          <w:szCs w:val="18"/>
+        </w:rPr>
+        <w:t xml:space="preserve">WHERE OBJECT_NAME(i.object_id) = 'nyctaxi_sample'</w:t>
+      </w:r>
+    </w:p>
+    <w:p>
+      <w:pPr>
+        <w:shd w:fill="F2F2F2" w:val="clear"/>
+        <w:spacing w:after="0" w:before="0"/>
+      </w:pPr>
+      <w:r>
+        <w:rPr>
+          <w:rFonts w:ascii="Courier New" w:cs="Courier New" w:eastAsia="Courier New" w:hAnsi="Courier New"/>
+          <w:sz w:val="18"/>
+          <w:szCs w:val="18"/>
+        </w:rPr>
+        <w:t xml:space="preserve">AND i.name IS NOT NULL;</w:t>
       </w:r>
     </w:p>
     <w:p>
@@ -3428,9 +3340,9 @@
       <w:r>
         <w:drawing>
           <wp:inline distT="0" distB="0" distL="0" distR="0">
-            <wp:extent cx="4953000" cy="2476500"/>
+            <wp:extent cx="4953000" cy="1714500"/>
             <wp:effectExtent t="0" r="0" b="0" l="0"/>
-            <wp:docPr id="1" name="Optimize edilmiş sorgu" descr="Optimize edilmiş sorgu" title="Optimize edilmiş sorgu"/>
+            <wp:docPr id="1" name="İki indeks mevcut" descr="İki indeks mevcut" title="İki indeks mevcut"/>
             <wp:cNvGraphicFramePr>
               <a:graphicFrameLocks xmlns:a="http://schemas.openxmlformats.org/drawingml/2006/main" noChangeAspect="1"/>
             </wp:cNvGraphicFramePr>
@@ -3453,7 +3365,7 @@
                   <pic:spPr bwMode="auto">
                     <a:xfrm>
                       <a:off x="0" y="0"/>
-                      <a:ext cx="4953000" cy="2476500"/>
+                      <a:ext cx="4953000" cy="1714500"/>
                     </a:xfrm>
                     <a:prstGeom prst="rect">
                       <a:avLst/>
@@ -3479,21 +3391,7 @@
           <w:sz w:val="18"/>
           <w:szCs w:val="18"/>
         </w:rPr>
-        <w:t xml:space="preserve">Şekil 22 – Tarih aralığı ile optimize sorgu: Aynı sonuç (CRD → 918.668, CSH → 778.170), indeks etkin</w:t>
-      </w:r>
-    </w:p>
-    <w:p>
-      <w:pPr>
-        <w:spacing w:after="80" w:before="80"/>
-        <w:jc w:val="both"/>
-      </w:pPr>
-      <w:r>
-        <w:rPr>
-          <w:rFonts w:ascii="Times New Roman" w:cs="Times New Roman" w:eastAsia="Times New Roman" w:hAnsi="Times New Roman"/>
-          <w:sz w:val="22"/>
-          <w:szCs w:val="22"/>
-        </w:rPr>
-        <w:t xml:space="preserve">Kural: WHERE koşulunda sütun üzerinde fonksiyon uygulanmamalıdır. Fonksiyon kullanımı indeksin atlanmasına ve tüm tablonun taranmasına yol açar.</w:t>
+        <w:t xml:space="preserve">Şekil 31 – İki indeks mevcut: nyc_cci (CLUSTERED COLUMNSTORE) + IX_nyctaxi_pickup_datetime (NONCLUSTERED)</w:t>
       </w:r>
     </w:p>
     <w:p>
@@ -3503,130 +3401,114 @@
     </w:p>
     <w:p>
       <w:pPr>
-        <w:pStyle w:val="Heading2"/>
-        <w:spacing w:after="80" w:before="200"/>
-      </w:pPr>
-      <w:r>
-        <w:rPr>
-          <w:rFonts w:ascii="Times New Roman" w:cs="Times New Roman" w:eastAsia="Times New Roman" w:hAnsi="Times New Roman"/>
-          <w:b/>
-          <w:bCs/>
-          <w:sz w:val="24"/>
-          <w:szCs w:val="24"/>
-        </w:rPr>
-        <w:t xml:space="preserve">5.3 Karmaşık Filtreli Sorgu – Execution Plan Analizi</w:t>
-      </w:r>
-    </w:p>
-    <w:p>
-      <w:pPr>
-        <w:spacing w:after="80" w:before="80"/>
-        <w:jc w:val="both"/>
-      </w:pPr>
-      <w:r>
-        <w:rPr>
-          <w:rFonts w:ascii="Times New Roman" w:cs="Times New Roman" w:eastAsia="Times New Roman" w:hAnsi="Times New Roman"/>
-          <w:sz w:val="22"/>
-          <w:szCs w:val="22"/>
-        </w:rPr>
-        <w:t xml:space="preserve">Uzun mesafeli (&gt;10 km) ve çok yolculu (&gt;1 kişi) seyahatleri filtreleyen bir sorgu yazılmış; SSMS'deki 'Yürütme Planı' sekmesi kullanılarak sorgunun indeksi nasıl kullandığı incelenmiştir.</w:t>
-      </w:r>
-    </w:p>
-    <w:p>
-      <w:pPr>
-        <w:shd w:fill="F2F2F2" w:val="clear"/>
-        <w:spacing w:after="0" w:before="0"/>
-      </w:pPr>
-      <w:r>
-        <w:rPr>
-          <w:rFonts w:ascii="Courier New" w:cs="Courier New" w:eastAsia="Courier New" w:hAnsi="Courier New"/>
-          <w:sz w:val="18"/>
-          <w:szCs w:val="18"/>
-        </w:rPr>
-        <w:t xml:space="preserve">SELECT TOP 1000</w:t>
-      </w:r>
-    </w:p>
-    <w:p>
-      <w:pPr>
-        <w:shd w:fill="F2F2F2" w:val="clear"/>
-        <w:spacing w:after="0" w:before="0"/>
-      </w:pPr>
-      <w:r>
-        <w:rPr>
-          <w:rFonts w:ascii="Courier New" w:cs="Courier New" w:eastAsia="Courier New" w:hAnsi="Courier New"/>
-          <w:sz w:val="18"/>
-          <w:szCs w:val="18"/>
-        </w:rPr>
-        <w:t xml:space="preserve">    vendor_id, passenger_count,</w:t>
-      </w:r>
-    </w:p>
-    <w:p>
-      <w:pPr>
-        <w:shd w:fill="F2F2F2" w:val="clear"/>
-        <w:spacing w:after="0" w:before="0"/>
-      </w:pPr>
-      <w:r>
-        <w:rPr>
-          <w:rFonts w:ascii="Courier New" w:cs="Courier New" w:eastAsia="Courier New" w:hAnsi="Courier New"/>
-          <w:sz w:val="18"/>
-          <w:szCs w:val="18"/>
-        </w:rPr>
-        <w:t xml:space="preserve">    trip_distance, fare_amount, total_amount</w:t>
-      </w:r>
-    </w:p>
-    <w:p>
-      <w:pPr>
-        <w:shd w:fill="F2F2F2" w:val="clear"/>
-        <w:spacing w:after="0" w:before="0"/>
-      </w:pPr>
-      <w:r>
-        <w:rPr>
-          <w:rFonts w:ascii="Courier New" w:cs="Courier New" w:eastAsia="Courier New" w:hAnsi="Courier New"/>
-          <w:sz w:val="18"/>
-          <w:szCs w:val="18"/>
-        </w:rPr>
-        <w:t xml:space="preserve">FROM nyctaxi_sample</w:t>
-      </w:r>
-    </w:p>
-    <w:p>
-      <w:pPr>
-        <w:shd w:fill="F2F2F2" w:val="clear"/>
-        <w:spacing w:after="0" w:before="0"/>
-      </w:pPr>
-      <w:r>
-        <w:rPr>
-          <w:rFonts w:ascii="Courier New" w:cs="Courier New" w:eastAsia="Courier New" w:hAnsi="Courier New"/>
-          <w:sz w:val="18"/>
-          <w:szCs w:val="18"/>
-        </w:rPr>
-        <w:t xml:space="preserve">WHERE trip_distance &gt; 10</w:t>
-      </w:r>
-    </w:p>
-    <w:p>
-      <w:pPr>
-        <w:shd w:fill="F2F2F2" w:val="clear"/>
-        <w:spacing w:after="0" w:before="0"/>
-      </w:pPr>
-      <w:r>
-        <w:rPr>
-          <w:rFonts w:ascii="Courier New" w:cs="Courier New" w:eastAsia="Courier New" w:hAnsi="Courier New"/>
-          <w:sz w:val="18"/>
-          <w:szCs w:val="18"/>
-        </w:rPr>
-        <w:t xml:space="preserve">  AND passenger_count &gt; 1</w:t>
-      </w:r>
-    </w:p>
-    <w:p>
-      <w:pPr>
-        <w:shd w:fill="F2F2F2" w:val="clear"/>
-        <w:spacing w:after="0" w:before="0"/>
-      </w:pPr>
-      <w:r>
-        <w:rPr>
-          <w:rFonts w:ascii="Courier New" w:cs="Courier New" w:eastAsia="Courier New" w:hAnsi="Courier New"/>
-          <w:sz w:val="18"/>
-          <w:szCs w:val="18"/>
-        </w:rPr>
-        <w:t xml:space="preserve">ORDER BY total_amount DESC;</w:t>
+        <w:shd w:fill="F2F2F2" w:val="clear"/>
+        <w:spacing w:after="0" w:before="0"/>
+      </w:pPr>
+      <w:r>
+        <w:rPr>
+          <w:rFonts w:ascii="Courier New" w:cs="Courier New" w:eastAsia="Courier New" w:hAnsi="Courier New"/>
+          <w:sz w:val="18"/>
+          <w:szCs w:val="18"/>
+        </w:rPr>
+        <w:t xml:space="preserve">-- Gereksiz B-Tree indeksini kaldır</w:t>
+      </w:r>
+    </w:p>
+    <w:p>
+      <w:pPr>
+        <w:shd w:fill="F2F2F2" w:val="clear"/>
+        <w:spacing w:after="0" w:before="0"/>
+      </w:pPr>
+      <w:r>
+        <w:rPr>
+          <w:rFonts w:ascii="Courier New" w:cs="Courier New" w:eastAsia="Courier New" w:hAnsi="Courier New"/>
+          <w:sz w:val="18"/>
+          <w:szCs w:val="18"/>
+        </w:rPr>
+        <w:t xml:space="preserve">DROP INDEX IX_nyctaxi_pickup_datetime ON nyctaxi_sample;</w:t>
+      </w:r>
+    </w:p>
+    <w:p>
+      <w:pPr>
+        <w:shd w:fill="F2F2F2" w:val="clear"/>
+        <w:spacing w:after="0" w:before="0"/>
+      </w:pPr>
+      <w:r>
+        <w:rPr>
+          <w:rFonts w:ascii="Courier New" w:cs="Courier New" w:eastAsia="Courier New" w:hAnsi="Courier New"/>
+          <w:sz w:val="18"/>
+          <w:szCs w:val="18"/>
+        </w:rPr>
+        <w:t xml:space="preserve"/>
+      </w:r>
+    </w:p>
+    <w:p>
+      <w:pPr>
+        <w:shd w:fill="F2F2F2" w:val="clear"/>
+        <w:spacing w:after="0" w:before="0"/>
+      </w:pPr>
+      <w:r>
+        <w:rPr>
+          <w:rFonts w:ascii="Courier New" w:cs="Courier New" w:eastAsia="Courier New" w:hAnsi="Courier New"/>
+          <w:sz w:val="18"/>
+          <w:szCs w:val="18"/>
+        </w:rPr>
+        <w:t xml:space="preserve">SELECT i.name AS IndeksAdi, i.type_desc AS IndeksTipi,</w:t>
+      </w:r>
+    </w:p>
+    <w:p>
+      <w:pPr>
+        <w:shd w:fill="F2F2F2" w:val="clear"/>
+        <w:spacing w:after="0" w:before="0"/>
+      </w:pPr>
+      <w:r>
+        <w:rPr>
+          <w:rFonts w:ascii="Courier New" w:cs="Courier New" w:eastAsia="Courier New" w:hAnsi="Courier New"/>
+          <w:sz w:val="18"/>
+          <w:szCs w:val="18"/>
+        </w:rPr>
+        <w:t xml:space="preserve">       OBJECT_NAME(i.object_id) AS TabloAdi</w:t>
+      </w:r>
+    </w:p>
+    <w:p>
+      <w:pPr>
+        <w:shd w:fill="F2F2F2" w:val="clear"/>
+        <w:spacing w:after="0" w:before="0"/>
+      </w:pPr>
+      <w:r>
+        <w:rPr>
+          <w:rFonts w:ascii="Courier New" w:cs="Courier New" w:eastAsia="Courier New" w:hAnsi="Courier New"/>
+          <w:sz w:val="18"/>
+          <w:szCs w:val="18"/>
+        </w:rPr>
+        <w:t xml:space="preserve">FROM sys.indexes i</w:t>
+      </w:r>
+    </w:p>
+    <w:p>
+      <w:pPr>
+        <w:shd w:fill="F2F2F2" w:val="clear"/>
+        <w:spacing w:after="0" w:before="0"/>
+      </w:pPr>
+      <w:r>
+        <w:rPr>
+          <w:rFonts w:ascii="Courier New" w:cs="Courier New" w:eastAsia="Courier New" w:hAnsi="Courier New"/>
+          <w:sz w:val="18"/>
+          <w:szCs w:val="18"/>
+        </w:rPr>
+        <w:t xml:space="preserve">WHERE OBJECT_NAME(i.object_id) = 'nyctaxi_sample'</w:t>
+      </w:r>
+    </w:p>
+    <w:p>
+      <w:pPr>
+        <w:shd w:fill="F2F2F2" w:val="clear"/>
+        <w:spacing w:after="0" w:before="0"/>
+      </w:pPr>
+      <w:r>
+        <w:rPr>
+          <w:rFonts w:ascii="Courier New" w:cs="Courier New" w:eastAsia="Courier New" w:hAnsi="Courier New"/>
+          <w:sz w:val="18"/>
+          <w:szCs w:val="18"/>
+        </w:rPr>
+        <w:t xml:space="preserve">AND i.name IS NOT NULL;</w:t>
       </w:r>
     </w:p>
     <w:p>
@@ -3642,9 +3524,9 @@
       <w:r>
         <w:drawing>
           <wp:inline distT="0" distB="0" distL="0" distR="0">
-            <wp:extent cx="5143500" cy="3143250"/>
+            <wp:extent cx="4953000" cy="1619250"/>
             <wp:effectExtent t="0" r="0" b="0" l="0"/>
-            <wp:docPr id="1" name="Execution Plan" descr="Execution Plan" title="Execution Plan"/>
+            <wp:docPr id="1" name="Drop sonrası" descr="Drop sonrası" title="Drop sonrası"/>
             <wp:cNvGraphicFramePr>
               <a:graphicFrameLocks xmlns:a="http://schemas.openxmlformats.org/drawingml/2006/main" noChangeAspect="1"/>
             </wp:cNvGraphicFramePr>
@@ -3667,7 +3549,7 @@
                   <pic:spPr bwMode="auto">
                     <a:xfrm>
                       <a:off x="0" y="0"/>
-                      <a:ext cx="5143500" cy="3143250"/>
+                      <a:ext cx="4953000" cy="1619250"/>
                     </a:xfrm>
                     <a:prstGeom prst="rect">
                       <a:avLst/>
@@ -3693,8 +3575,62 @@
           <w:sz w:val="18"/>
           <w:szCs w:val="18"/>
         </w:rPr>
-        <w:t xml:space="preserve">Şekil 23 – TOP 1000 uzun mesafeli yolculuk; Yürütme Planı sekmesinde indeks kullanımı görüntülendi, max total_amount = 315,97</w:t>
-      </w:r>
+        <w:t xml:space="preserve">Şekil 32 – DROP INDEX başarılı: Sadece nyc_cci kaldı; B-Tree indeks kaldırıldı</w:t>
+      </w:r>
+    </w:p>
+    <w:p>
+      <w:pPr>
+        <w:spacing w:after="80" w:before="80"/>
+        <w:jc w:val="both"/>
+      </w:pPr>
+      <w:r>
+        <w:rPr>
+          <w:rFonts w:ascii="Times New Roman" w:cs="Times New Roman" w:eastAsia="Times New Roman" w:hAnsi="Times New Roman"/>
+          <w:sz w:val="22"/>
+          <w:szCs w:val="22"/>
+        </w:rPr>
+        <w:t xml:space="preserve">Sonuç: Columnstore indeksi analitik sorgular için yeterli olduğundan, ayrı bir B-Tree indeksi gereksizdir. Gereksiz indeksler hem disk alanı tüketir hem de INSERT/UPDATE/DELETE işlemlerini yavaşlatır.</w:t>
+      </w:r>
+    </w:p>
+    <w:p>
+      <w:pPr>
+        <w:spacing w:after="100" w:before="100"/>
+      </w:pPr>
+    </w:p>
+    <w:p>
+      <w:pPr>
+        <w:pStyle w:val="Heading1"/>
+        <w:spacing w:after="120" w:before="320"/>
+      </w:pPr>
+      <w:r>
+        <w:rPr>
+          <w:rFonts w:ascii="Times New Roman" w:cs="Times New Roman" w:eastAsia="Times New Roman" w:hAnsi="Times New Roman"/>
+          <w:b/>
+          <w:bCs/>
+          <w:sz w:val="28"/>
+          <w:szCs w:val="28"/>
+        </w:rPr>
+        <w:t xml:space="preserve">5. Sorgu Optimizasyonu</w:t>
+      </w:r>
+    </w:p>
+    <w:p>
+      <w:pPr>
+        <w:spacing w:after="80" w:before="80"/>
+        <w:jc w:val="both"/>
+      </w:pPr>
+      <w:r>
+        <w:rPr>
+          <w:rFonts w:ascii="Times New Roman" w:cs="Times New Roman" w:eastAsia="Times New Roman" w:hAnsi="Times New Roman"/>
+          <w:sz w:val="22"/>
+          <w:szCs w:val="22"/>
+        </w:rPr>
+        <w:t xml:space="preserve">Sorgu optimizasyonu, veritabanı performansını artırmanın en etkili yollarından biridir. Bu bölümde aynı sonucu döndüren sorgular farklı yazım biçimleriyle karşılaştırılmış; fonksiyon kullanımının indeks üzerindeki olumsuz etkisi ve doğru yazım biçiminin performans kazanımı gözlemlenmiştir.</w:t>
+      </w:r>
+    </w:p>
+    <w:p>
+      <w:pPr>
+        <w:spacing w:after="100" w:before="100"/>
+      </w:pPr>
     </w:p>
     <w:p>
       <w:pPr>
@@ -3709,7 +3645,7 @@
           <w:sz w:val="24"/>
           <w:szCs w:val="24"/>
         </w:rPr>
-        <w:t xml:space="preserve">5.4 En Pahalı 10 Yolculuk</w:t>
+        <w:t xml:space="preserve">5.1 Optimize Edilmemiş Sorgu – YEAR() Fonksiyonu</w:t>
       </w:r>
     </w:p>
     <w:p>
@@ -3723,63 +3659,63 @@
           <w:sz w:val="22"/>
           <w:szCs w:val="22"/>
         </w:rPr>
-        <w:t xml:space="preserve">Toplam ücret (total_amount) değerine göre azalan sırada ilk 10 kayıt listelenmiştir. Bu sorgu, aykırı değerlerin ve veri kalitesi sorunlarının tespitinde kullanılabilir.</w:t>
-      </w:r>
-    </w:p>
-    <w:p>
-      <w:pPr>
-        <w:shd w:fill="F2F2F2" w:val="clear"/>
-        <w:spacing w:after="0" w:before="0"/>
-      </w:pPr>
-      <w:r>
-        <w:rPr>
-          <w:rFonts w:ascii="Courier New" w:cs="Courier New" w:eastAsia="Courier New" w:hAnsi="Courier New"/>
-          <w:sz w:val="18"/>
-          <w:szCs w:val="18"/>
-        </w:rPr>
-        <w:t xml:space="preserve">SELECT TOP 10</w:t>
-      </w:r>
-    </w:p>
-    <w:p>
-      <w:pPr>
-        <w:shd w:fill="F2F2F2" w:val="clear"/>
-        <w:spacing w:after="0" w:before="0"/>
-      </w:pPr>
-      <w:r>
-        <w:rPr>
-          <w:rFonts w:ascii="Courier New" w:cs="Courier New" w:eastAsia="Courier New" w:hAnsi="Courier New"/>
-          <w:sz w:val="18"/>
-          <w:szCs w:val="18"/>
-        </w:rPr>
-        <w:t xml:space="preserve">    vendor_id, pickup_datetime, dropoff_datetime,</w:t>
-      </w:r>
-    </w:p>
-    <w:p>
-      <w:pPr>
-        <w:shd w:fill="F2F2F2" w:val="clear"/>
-        <w:spacing w:after="0" w:before="0"/>
-      </w:pPr>
-      <w:r>
-        <w:rPr>
-          <w:rFonts w:ascii="Courier New" w:cs="Courier New" w:eastAsia="Courier New" w:hAnsi="Courier New"/>
-          <w:sz w:val="18"/>
-          <w:szCs w:val="18"/>
-        </w:rPr>
-        <w:t xml:space="preserve">    passenger_count, trip_distance,</w:t>
-      </w:r>
-    </w:p>
-    <w:p>
-      <w:pPr>
-        <w:shd w:fill="F2F2F2" w:val="clear"/>
-        <w:spacing w:after="0" w:before="0"/>
-      </w:pPr>
-      <w:r>
-        <w:rPr>
-          <w:rFonts w:ascii="Courier New" w:cs="Courier New" w:eastAsia="Courier New" w:hAnsi="Courier New"/>
-          <w:sz w:val="18"/>
-          <w:szCs w:val="18"/>
-        </w:rPr>
-        <w:t xml:space="preserve">    fare_amount, tip_amount, total_amount</w:t>
+        <w:t xml:space="preserve">YEAR() gibi fonksiyonların WHERE koşulunda kullanılması, SQL Server'ın indeks seek yapmasını engeller; bunun yerine tüm tablo taranır (index scan veya table scan). Sorgu ödeme tipine göre yolculuk sayısı ve ortalama ücret bilgilerini hesaplamaktadır.</w:t>
+      </w:r>
+    </w:p>
+    <w:p>
+      <w:pPr>
+        <w:shd w:fill="F2F2F2" w:val="clear"/>
+        <w:spacing w:after="0" w:before="0"/>
+      </w:pPr>
+      <w:r>
+        <w:rPr>
+          <w:rFonts w:ascii="Courier New" w:cs="Courier New" w:eastAsia="Courier New" w:hAnsi="Courier New"/>
+          <w:sz w:val="18"/>
+          <w:szCs w:val="18"/>
+        </w:rPr>
+        <w:t xml:space="preserve">SELECT payment_type, COUNT(*) AS YolculukSayisi,</w:t>
+      </w:r>
+    </w:p>
+    <w:p>
+      <w:pPr>
+        <w:shd w:fill="F2F2F2" w:val="clear"/>
+        <w:spacing w:after="0" w:before="0"/>
+      </w:pPr>
+      <w:r>
+        <w:rPr>
+          <w:rFonts w:ascii="Courier New" w:cs="Courier New" w:eastAsia="Courier New" w:hAnsi="Courier New"/>
+          <w:sz w:val="18"/>
+          <w:szCs w:val="18"/>
+        </w:rPr>
+        <w:t xml:space="preserve">    AVG(fare_amount) AS OrtalamaUcret,</w:t>
+      </w:r>
+    </w:p>
+    <w:p>
+      <w:pPr>
+        <w:shd w:fill="F2F2F2" w:val="clear"/>
+        <w:spacing w:after="0" w:before="0"/>
+      </w:pPr>
+      <w:r>
+        <w:rPr>
+          <w:rFonts w:ascii="Courier New" w:cs="Courier New" w:eastAsia="Courier New" w:hAnsi="Courier New"/>
+          <w:sz w:val="18"/>
+          <w:szCs w:val="18"/>
+        </w:rPr>
+        <w:t xml:space="preserve">    AVG(tip_amount) AS OrtalamaBahsis,</w:t>
+      </w:r>
+    </w:p>
+    <w:p>
+      <w:pPr>
+        <w:shd w:fill="F2F2F2" w:val="clear"/>
+        <w:spacing w:after="0" w:before="0"/>
+      </w:pPr>
+      <w:r>
+        <w:rPr>
+          <w:rFonts w:ascii="Courier New" w:cs="Courier New" w:eastAsia="Courier New" w:hAnsi="Courier New"/>
+          <w:sz w:val="18"/>
+          <w:szCs w:val="18"/>
+        </w:rPr>
+        <w:t xml:space="preserve">    AVG(trip_distance) AS OrtalamaMesafe</w:t>
       </w:r>
     </w:p>
     <w:p>
@@ -3807,7 +3743,35 @@
           <w:sz w:val="18"/>
           <w:szCs w:val="18"/>
         </w:rPr>
-        <w:t xml:space="preserve">ORDER BY total_amount DESC;</w:t>
+        <w:t xml:space="preserve">WHERE YEAR(pickup_datetime) = 2013</w:t>
+      </w:r>
+    </w:p>
+    <w:p>
+      <w:pPr>
+        <w:shd w:fill="F2F2F2" w:val="clear"/>
+        <w:spacing w:after="0" w:before="0"/>
+      </w:pPr>
+      <w:r>
+        <w:rPr>
+          <w:rFonts w:ascii="Courier New" w:cs="Courier New" w:eastAsia="Courier New" w:hAnsi="Courier New"/>
+          <w:sz w:val="18"/>
+          <w:szCs w:val="18"/>
+        </w:rPr>
+        <w:t xml:space="preserve">GROUP BY payment_type</w:t>
+      </w:r>
+    </w:p>
+    <w:p>
+      <w:pPr>
+        <w:shd w:fill="F2F2F2" w:val="clear"/>
+        <w:spacing w:after="0" w:before="0"/>
+      </w:pPr>
+      <w:r>
+        <w:rPr>
+          <w:rFonts w:ascii="Courier New" w:cs="Courier New" w:eastAsia="Courier New" w:hAnsi="Courier New"/>
+          <w:sz w:val="18"/>
+          <w:szCs w:val="18"/>
+        </w:rPr>
+        <w:t xml:space="preserve">ORDER BY YolculukSayisi DESC;</w:t>
       </w:r>
     </w:p>
     <w:p>
@@ -3823,9 +3787,9 @@
       <w:r>
         <w:drawing>
           <wp:inline distT="0" distB="0" distL="0" distR="0">
-            <wp:extent cx="5143500" cy="3143250"/>
+            <wp:extent cx="4953000" cy="2476500"/>
             <wp:effectExtent t="0" r="0" b="0" l="0"/>
-            <wp:docPr id="1" name="En pahalı yolculuklar" descr="En pahalı yolculuklar" title="En pahalı yolculuklar"/>
+            <wp:docPr id="1" name="Optimize edilmemiş sorgu" descr="Optimize edilmemiş sorgu" title="Optimize edilmemiş sorgu"/>
             <wp:cNvGraphicFramePr>
               <a:graphicFrameLocks xmlns:a="http://schemas.openxmlformats.org/drawingml/2006/main" noChangeAspect="1"/>
             </wp:cNvGraphicFramePr>
@@ -3848,7 +3812,7 @@
                   <pic:spPr bwMode="auto">
                     <a:xfrm>
                       <a:off x="0" y="0"/>
-                      <a:ext cx="5143500" cy="3143250"/>
+                      <a:ext cx="4953000" cy="2476500"/>
                     </a:xfrm>
                     <a:prstGeom prst="rect">
                       <a:avLst/>
@@ -3874,62 +3838,8 @@
           <w:sz w:val="18"/>
           <w:szCs w:val="18"/>
         </w:rPr>
-        <w:t xml:space="preserve">Şekil 24 – En yüksek toplam ücretli 10 yolculuk; maksimum total_amount = 500 (trip_distance = 1,3 ile aykırı değer)</w:t>
-      </w:r>
-    </w:p>
-    <w:p>
-      <w:pPr>
-        <w:spacing w:after="80" w:before="80"/>
-        <w:jc w:val="both"/>
-      </w:pPr>
-      <w:r>
-        <w:rPr>
-          <w:rFonts w:ascii="Times New Roman" w:cs="Times New Roman" w:eastAsia="Times New Roman" w:hAnsi="Times New Roman"/>
-          <w:sz w:val="22"/>
-          <w:szCs w:val="22"/>
-        </w:rPr>
-        <w:t xml:space="preserve">Gözlem: 500 birimlik maksimum total_amount, yalnızca 1,3 km mesafeli bir yolculukta oluşmuştur. Bu durum olası bir veri kalitesi sorunu ya da sistem üst sınırına işaret etmektedir.</w:t>
-      </w:r>
-    </w:p>
-    <w:p>
-      <w:pPr>
-        <w:spacing w:after="100" w:before="100"/>
-      </w:pPr>
-    </w:p>
-    <w:p>
-      <w:pPr>
-        <w:pStyle w:val="Heading1"/>
-        <w:spacing w:after="120" w:before="320"/>
-      </w:pPr>
-      <w:r>
-        <w:rPr>
-          <w:rFonts w:ascii="Times New Roman" w:cs="Times New Roman" w:eastAsia="Times New Roman" w:hAnsi="Times New Roman"/>
-          <w:b/>
-          <w:bCs/>
-          <w:sz w:val="28"/>
-          <w:szCs w:val="28"/>
-        </w:rPr>
-        <w:t xml:space="preserve">6. Erişim Yönetimi</w:t>
-      </w:r>
-    </w:p>
-    <w:p>
-      <w:pPr>
-        <w:spacing w:after="80" w:before="80"/>
-        <w:jc w:val="both"/>
-      </w:pPr>
-      <w:r>
-        <w:rPr>
-          <w:rFonts w:ascii="Times New Roman" w:cs="Times New Roman" w:eastAsia="Times New Roman" w:hAnsi="Times New Roman"/>
-          <w:sz w:val="22"/>
-          <w:szCs w:val="22"/>
-        </w:rPr>
-        <w:t xml:space="preserve">Veritabanı güvenliğinin temel bileşenlerinden biri, kullanıcıların yalnızca ihtiyaç duydukları işlemleri gerçekleştirebilmesini sağlayan erişim kontrolüdür. Bu bölümde NYCTaxi_Sample veritabanı için iki farklı yetkiye sahip kullanıcı oluşturulmuş ve rol tabanlı erişim yönetimi uygulanmıştır.</w:t>
-      </w:r>
-    </w:p>
-    <w:p>
-      <w:pPr>
-        <w:spacing w:after="100" w:before="100"/>
-      </w:pPr>
+        <w:t xml:space="preserve">Şekil 21 – YEAR() fonksiyonu ile sorgu: CRD → 918.668, CSH → 778.170, NOC → 4.029 yolculuk</w:t>
+      </w:r>
     </w:p>
     <w:p>
       <w:pPr>
@@ -3944,7 +3854,7 @@
           <w:sz w:val="24"/>
           <w:szCs w:val="24"/>
         </w:rPr>
-        <w:t xml:space="preserve">6.1 Mevcut Kullanıcı ve Rollerin İncelenmesi</w:t>
+        <w:t xml:space="preserve">5.2 Optimize Edilmiş Sorgu – Tarih Aralığı Karşılaştırması</w:t>
       </w:r>
     </w:p>
     <w:p>
@@ -3958,147 +3868,133 @@
           <w:sz w:val="22"/>
           <w:szCs w:val="22"/>
         </w:rPr>
-        <w:t xml:space="preserve">sys.database_principals görünümü ile veritabanındaki mevcut kullanıcılar ve rol atamaları listelenmiştir.</w:t>
-      </w:r>
-    </w:p>
-    <w:p>
-      <w:pPr>
-        <w:shd w:fill="F2F2F2" w:val="clear"/>
-        <w:spacing w:after="0" w:before="0"/>
-      </w:pPr>
-      <w:r>
-        <w:rPr>
-          <w:rFonts w:ascii="Courier New" w:cs="Courier New" w:eastAsia="Courier New" w:hAnsi="Courier New"/>
-          <w:sz w:val="18"/>
-          <w:szCs w:val="18"/>
-        </w:rPr>
-        <w:t xml:space="preserve">SELECT dp.name AS KullaniciAdi, dp.type_desc AS Tur,</w:t>
-      </w:r>
-    </w:p>
-    <w:p>
-      <w:pPr>
-        <w:shd w:fill="F2F2F2" w:val="clear"/>
-        <w:spacing w:after="0" w:before="0"/>
-      </w:pPr>
-      <w:r>
-        <w:rPr>
-          <w:rFonts w:ascii="Courier New" w:cs="Courier New" w:eastAsia="Courier New" w:hAnsi="Courier New"/>
-          <w:sz w:val="18"/>
-          <w:szCs w:val="18"/>
-        </w:rPr>
-        <w:t xml:space="preserve">       rp.name AS RolAdi</w:t>
-      </w:r>
-    </w:p>
-    <w:p>
-      <w:pPr>
-        <w:shd w:fill="F2F2F2" w:val="clear"/>
-        <w:spacing w:after="0" w:before="0"/>
-      </w:pPr>
-      <w:r>
-        <w:rPr>
-          <w:rFonts w:ascii="Courier New" w:cs="Courier New" w:eastAsia="Courier New" w:hAnsi="Courier New"/>
-          <w:sz w:val="18"/>
-          <w:szCs w:val="18"/>
-        </w:rPr>
-        <w:t xml:space="preserve">FROM sys.database_principals dp</w:t>
-      </w:r>
-    </w:p>
-    <w:p>
-      <w:pPr>
-        <w:shd w:fill="F2F2F2" w:val="clear"/>
-        <w:spacing w:after="0" w:before="0"/>
-      </w:pPr>
-      <w:r>
-        <w:rPr>
-          <w:rFonts w:ascii="Courier New" w:cs="Courier New" w:eastAsia="Courier New" w:hAnsi="Courier New"/>
-          <w:sz w:val="18"/>
-          <w:szCs w:val="18"/>
-        </w:rPr>
-        <w:t xml:space="preserve">LEFT JOIN sys.database_role_members drm</w:t>
-      </w:r>
-    </w:p>
-    <w:p>
-      <w:pPr>
-        <w:shd w:fill="F2F2F2" w:val="clear"/>
-        <w:spacing w:after="0" w:before="0"/>
-      </w:pPr>
-      <w:r>
-        <w:rPr>
-          <w:rFonts w:ascii="Courier New" w:cs="Courier New" w:eastAsia="Courier New" w:hAnsi="Courier New"/>
-          <w:sz w:val="18"/>
-          <w:szCs w:val="18"/>
-        </w:rPr>
-        <w:t xml:space="preserve">    ON dp.principal_id = drm.member_principal_id</w:t>
-      </w:r>
-    </w:p>
-    <w:p>
-      <w:pPr>
-        <w:shd w:fill="F2F2F2" w:val="clear"/>
-        <w:spacing w:after="0" w:before="0"/>
-      </w:pPr>
-      <w:r>
-        <w:rPr>
-          <w:rFonts w:ascii="Courier New" w:cs="Courier New" w:eastAsia="Courier New" w:hAnsi="Courier New"/>
-          <w:sz w:val="18"/>
-          <w:szCs w:val="18"/>
-        </w:rPr>
-        <w:t xml:space="preserve">LEFT JOIN sys.database_principals rp</w:t>
-      </w:r>
-    </w:p>
-    <w:p>
-      <w:pPr>
-        <w:shd w:fill="F2F2F2" w:val="clear"/>
-        <w:spacing w:after="0" w:before="0"/>
-      </w:pPr>
-      <w:r>
-        <w:rPr>
-          <w:rFonts w:ascii="Courier New" w:cs="Courier New" w:eastAsia="Courier New" w:hAnsi="Courier New"/>
-          <w:sz w:val="18"/>
-          <w:szCs w:val="18"/>
-        </w:rPr>
-        <w:t xml:space="preserve">    ON drm.role_principal_id = rp.principal_id</w:t>
-      </w:r>
-    </w:p>
-    <w:p>
-      <w:pPr>
-        <w:shd w:fill="F2F2F2" w:val="clear"/>
-        <w:spacing w:after="0" w:before="0"/>
-      </w:pPr>
-      <w:r>
-        <w:rPr>
-          <w:rFonts w:ascii="Courier New" w:cs="Courier New" w:eastAsia="Courier New" w:hAnsi="Courier New"/>
-          <w:sz w:val="18"/>
-          <w:szCs w:val="18"/>
-        </w:rPr>
-        <w:t xml:space="preserve">WHERE dp.type NOT IN ('R')</w:t>
-      </w:r>
-    </w:p>
-    <w:p>
-      <w:pPr>
-        <w:shd w:fill="F2F2F2" w:val="clear"/>
-        <w:spacing w:after="0" w:before="0"/>
-      </w:pPr>
-      <w:r>
-        <w:rPr>
-          <w:rFonts w:ascii="Courier New" w:cs="Courier New" w:eastAsia="Courier New" w:hAnsi="Courier New"/>
-          <w:sz w:val="18"/>
-          <w:szCs w:val="18"/>
-        </w:rPr>
-        <w:t xml:space="preserve">  AND dp.name NOT IN ('sys','INFORMATION_SCHEMA')</w:t>
-      </w:r>
-    </w:p>
-    <w:p>
-      <w:pPr>
-        <w:shd w:fill="F2F2F2" w:val="clear"/>
-        <w:spacing w:after="0" w:before="0"/>
-      </w:pPr>
-      <w:r>
-        <w:rPr>
-          <w:rFonts w:ascii="Courier New" w:cs="Courier New" w:eastAsia="Courier New" w:hAnsi="Courier New"/>
-          <w:sz w:val="18"/>
-          <w:szCs w:val="18"/>
-        </w:rPr>
-        <w:t xml:space="preserve">ORDER BY dp.name;</w:t>
+        <w:t xml:space="preserve">Aynı filtreleme işlemi için fonksiyon yerine doğrudan tarih aralığı kullanılmıştır. Bu yazım biçimi IX_nyctaxi_pickup_datetime indeksinin seek operasyonuyla kullanılmasına olanak tanır ve sonuçlar birebir aynıdır.</w:t>
+      </w:r>
+    </w:p>
+    <w:p>
+      <w:pPr>
+        <w:shd w:fill="F2F2F2" w:val="clear"/>
+        <w:spacing w:after="0" w:before="0"/>
+      </w:pPr>
+      <w:r>
+        <w:rPr>
+          <w:rFonts w:ascii="Courier New" w:cs="Courier New" w:eastAsia="Courier New" w:hAnsi="Courier New"/>
+          <w:sz w:val="18"/>
+          <w:szCs w:val="18"/>
+        </w:rPr>
+        <w:t xml:space="preserve">SELECT payment_type, COUNT(*) AS YolculukSayisi,</w:t>
+      </w:r>
+    </w:p>
+    <w:p>
+      <w:pPr>
+        <w:shd w:fill="F2F2F2" w:val="clear"/>
+        <w:spacing w:after="0" w:before="0"/>
+      </w:pPr>
+      <w:r>
+        <w:rPr>
+          <w:rFonts w:ascii="Courier New" w:cs="Courier New" w:eastAsia="Courier New" w:hAnsi="Courier New"/>
+          <w:sz w:val="18"/>
+          <w:szCs w:val="18"/>
+        </w:rPr>
+        <w:t xml:space="preserve">    AVG(fare_amount) AS OrtalamaUcret,</w:t>
+      </w:r>
+    </w:p>
+    <w:p>
+      <w:pPr>
+        <w:shd w:fill="F2F2F2" w:val="clear"/>
+        <w:spacing w:after="0" w:before="0"/>
+      </w:pPr>
+      <w:r>
+        <w:rPr>
+          <w:rFonts w:ascii="Courier New" w:cs="Courier New" w:eastAsia="Courier New" w:hAnsi="Courier New"/>
+          <w:sz w:val="18"/>
+          <w:szCs w:val="18"/>
+        </w:rPr>
+        <w:t xml:space="preserve">    AVG(tip_amount) AS OrtalamaBahsis,</w:t>
+      </w:r>
+    </w:p>
+    <w:p>
+      <w:pPr>
+        <w:shd w:fill="F2F2F2" w:val="clear"/>
+        <w:spacing w:after="0" w:before="0"/>
+      </w:pPr>
+      <w:r>
+        <w:rPr>
+          <w:rFonts w:ascii="Courier New" w:cs="Courier New" w:eastAsia="Courier New" w:hAnsi="Courier New"/>
+          <w:sz w:val="18"/>
+          <w:szCs w:val="18"/>
+        </w:rPr>
+        <w:t xml:space="preserve">    AVG(trip_distance) AS OrtalamaMesafe</w:t>
+      </w:r>
+    </w:p>
+    <w:p>
+      <w:pPr>
+        <w:shd w:fill="F2F2F2" w:val="clear"/>
+        <w:spacing w:after="0" w:before="0"/>
+      </w:pPr>
+      <w:r>
+        <w:rPr>
+          <w:rFonts w:ascii="Courier New" w:cs="Courier New" w:eastAsia="Courier New" w:hAnsi="Courier New"/>
+          <w:sz w:val="18"/>
+          <w:szCs w:val="18"/>
+        </w:rPr>
+        <w:t xml:space="preserve">FROM nyctaxi_sample</w:t>
+      </w:r>
+    </w:p>
+    <w:p>
+      <w:pPr>
+        <w:shd w:fill="F2F2F2" w:val="clear"/>
+        <w:spacing w:after="0" w:before="0"/>
+      </w:pPr>
+      <w:r>
+        <w:rPr>
+          <w:rFonts w:ascii="Courier New" w:cs="Courier New" w:eastAsia="Courier New" w:hAnsi="Courier New"/>
+          <w:sz w:val="18"/>
+          <w:szCs w:val="18"/>
+        </w:rPr>
+        <w:t xml:space="preserve">WHERE pickup_datetime &gt;= '2013-01-01'</w:t>
+      </w:r>
+    </w:p>
+    <w:p>
+      <w:pPr>
+        <w:shd w:fill="F2F2F2" w:val="clear"/>
+        <w:spacing w:after="0" w:before="0"/>
+      </w:pPr>
+      <w:r>
+        <w:rPr>
+          <w:rFonts w:ascii="Courier New" w:cs="Courier New" w:eastAsia="Courier New" w:hAnsi="Courier New"/>
+          <w:sz w:val="18"/>
+          <w:szCs w:val="18"/>
+        </w:rPr>
+        <w:t xml:space="preserve">  AND pickup_datetime &lt; '2014-01-01'</w:t>
+      </w:r>
+    </w:p>
+    <w:p>
+      <w:pPr>
+        <w:shd w:fill="F2F2F2" w:val="clear"/>
+        <w:spacing w:after="0" w:before="0"/>
+      </w:pPr>
+      <w:r>
+        <w:rPr>
+          <w:rFonts w:ascii="Courier New" w:cs="Courier New" w:eastAsia="Courier New" w:hAnsi="Courier New"/>
+          <w:sz w:val="18"/>
+          <w:szCs w:val="18"/>
+        </w:rPr>
+        <w:t xml:space="preserve">GROUP BY payment_type</w:t>
+      </w:r>
+    </w:p>
+    <w:p>
+      <w:pPr>
+        <w:shd w:fill="F2F2F2" w:val="clear"/>
+        <w:spacing w:after="0" w:before="0"/>
+      </w:pPr>
+      <w:r>
+        <w:rPr>
+          <w:rFonts w:ascii="Courier New" w:cs="Courier New" w:eastAsia="Courier New" w:hAnsi="Courier New"/>
+          <w:sz w:val="18"/>
+          <w:szCs w:val="18"/>
+        </w:rPr>
+        <w:t xml:space="preserve">ORDER BY YolculukSayisi DESC;</w:t>
       </w:r>
     </w:p>
     <w:p>
@@ -4114,9 +4010,9 @@
       <w:r>
         <w:drawing>
           <wp:inline distT="0" distB="0" distL="0" distR="0">
-            <wp:extent cx="4762500" cy="2476500"/>
+            <wp:extent cx="4953000" cy="2476500"/>
             <wp:effectExtent t="0" r="0" b="0" l="0"/>
-            <wp:docPr id="1" name="Mevcut kullanıcılar" descr="Mevcut kullanıcılar" title="Mevcut kullanıcılar"/>
+            <wp:docPr id="1" name="Optimize edilmiş sorgu" descr="Optimize edilmiş sorgu" title="Optimize edilmiş sorgu"/>
             <wp:cNvGraphicFramePr>
               <a:graphicFrameLocks xmlns:a="http://schemas.openxmlformats.org/drawingml/2006/main" noChangeAspect="1"/>
             </wp:cNvGraphicFramePr>
@@ -4139,7 +4035,7 @@
                   <pic:spPr bwMode="auto">
                     <a:xfrm>
                       <a:off x="0" y="0"/>
-                      <a:ext cx="4762500" cy="2476500"/>
+                      <a:ext cx="4953000" cy="2476500"/>
                     </a:xfrm>
                     <a:prstGeom prst="rect">
                       <a:avLst/>
@@ -4165,8 +4061,27 @@
           <w:sz w:val="18"/>
           <w:szCs w:val="18"/>
         </w:rPr>
-        <w:t xml:space="preserve">Şekil 25 – Mevcut kullanıcılar: dbo (db_owner) ve guest</w:t>
-      </w:r>
+        <w:t xml:space="preserve">Şekil 22 – Tarih aralığı ile optimize sorgu: Aynı sonuç (CRD → 918.668, CSH → 778.170), indeks etkin</w:t>
+      </w:r>
+    </w:p>
+    <w:p>
+      <w:pPr>
+        <w:spacing w:after="80" w:before="80"/>
+        <w:jc w:val="both"/>
+      </w:pPr>
+      <w:r>
+        <w:rPr>
+          <w:rFonts w:ascii="Times New Roman" w:cs="Times New Roman" w:eastAsia="Times New Roman" w:hAnsi="Times New Roman"/>
+          <w:sz w:val="22"/>
+          <w:szCs w:val="22"/>
+        </w:rPr>
+        <w:t xml:space="preserve">Kural: WHERE koşulunda sütun üzerinde fonksiyon uygulanmamalıdır. Fonksiyon kullanımı indeksin atlanmasına ve tüm tablonun taranmasına yol açar.</w:t>
+      </w:r>
+    </w:p>
+    <w:p>
+      <w:pPr>
+        <w:spacing w:after="100" w:before="100"/>
+      </w:pPr>
     </w:p>
     <w:p>
       <w:pPr>
@@ -4181,7 +4096,7 @@
           <w:sz w:val="24"/>
           <w:szCs w:val="24"/>
         </w:rPr>
-        <w:t xml:space="preserve">6.2 Login Oluşturma</w:t>
+        <w:t xml:space="preserve">5.3 Karmaşık Filtreli Sorgu – Execution Plan Analizi</w:t>
       </w:r>
     </w:p>
     <w:p>
@@ -4195,49 +4110,105 @@
           <w:sz w:val="22"/>
           <w:szCs w:val="22"/>
         </w:rPr>
-        <w:t xml:space="preserve">SQL Server kimlik doğrulaması için iki yeni login oluşturulmuştur: salt okunur erişim için taxi_reader, okuma ve yazma erişimi için taxi_writer.</w:t>
-      </w:r>
-    </w:p>
-    <w:p>
-      <w:pPr>
-        <w:shd w:fill="F2F2F2" w:val="clear"/>
-        <w:spacing w:after="0" w:before="0"/>
-      </w:pPr>
-      <w:r>
-        <w:rPr>
-          <w:rFonts w:ascii="Courier New" w:cs="Courier New" w:eastAsia="Courier New" w:hAnsi="Courier New"/>
-          <w:sz w:val="18"/>
-          <w:szCs w:val="18"/>
-        </w:rPr>
-        <w:t xml:space="preserve">USE master;</w:t>
-      </w:r>
-    </w:p>
-    <w:p>
-      <w:pPr>
-        <w:shd w:fill="F2F2F2" w:val="clear"/>
-        <w:spacing w:after="0" w:before="0"/>
-      </w:pPr>
-      <w:r>
-        <w:rPr>
-          <w:rFonts w:ascii="Courier New" w:cs="Courier New" w:eastAsia="Courier New" w:hAnsi="Courier New"/>
-          <w:sz w:val="18"/>
-          <w:szCs w:val="18"/>
-        </w:rPr>
-        <w:t xml:space="preserve">CREATE LOGIN taxi_reader WITH PASSWORD = 'Reader123!';</w:t>
-      </w:r>
-    </w:p>
-    <w:p>
-      <w:pPr>
-        <w:shd w:fill="F2F2F2" w:val="clear"/>
-        <w:spacing w:after="0" w:before="0"/>
-      </w:pPr>
-      <w:r>
-        <w:rPr>
-          <w:rFonts w:ascii="Courier New" w:cs="Courier New" w:eastAsia="Courier New" w:hAnsi="Courier New"/>
-          <w:sz w:val="18"/>
-          <w:szCs w:val="18"/>
-        </w:rPr>
-        <w:t xml:space="preserve">CREATE LOGIN taxi_writer WITH PASSWORD = 'Writer123!';</w:t>
+        <w:t xml:space="preserve">Uzun mesafeli (&gt;10 km) ve çok yolculu (&gt;1 kişi) seyahatleri filtreleyen bir sorgu yazılmış; SSMS'deki 'Yürütme Planı' sekmesi kullanılarak sorgunun indeksi nasıl kullandığı incelenmiştir.</w:t>
+      </w:r>
+    </w:p>
+    <w:p>
+      <w:pPr>
+        <w:shd w:fill="F2F2F2" w:val="clear"/>
+        <w:spacing w:after="0" w:before="0"/>
+      </w:pPr>
+      <w:r>
+        <w:rPr>
+          <w:rFonts w:ascii="Courier New" w:cs="Courier New" w:eastAsia="Courier New" w:hAnsi="Courier New"/>
+          <w:sz w:val="18"/>
+          <w:szCs w:val="18"/>
+        </w:rPr>
+        <w:t xml:space="preserve">SELECT TOP 1000</w:t>
+      </w:r>
+    </w:p>
+    <w:p>
+      <w:pPr>
+        <w:shd w:fill="F2F2F2" w:val="clear"/>
+        <w:spacing w:after="0" w:before="0"/>
+      </w:pPr>
+      <w:r>
+        <w:rPr>
+          <w:rFonts w:ascii="Courier New" w:cs="Courier New" w:eastAsia="Courier New" w:hAnsi="Courier New"/>
+          <w:sz w:val="18"/>
+          <w:szCs w:val="18"/>
+        </w:rPr>
+        <w:t xml:space="preserve">    vendor_id, passenger_count,</w:t>
+      </w:r>
+    </w:p>
+    <w:p>
+      <w:pPr>
+        <w:shd w:fill="F2F2F2" w:val="clear"/>
+        <w:spacing w:after="0" w:before="0"/>
+      </w:pPr>
+      <w:r>
+        <w:rPr>
+          <w:rFonts w:ascii="Courier New" w:cs="Courier New" w:eastAsia="Courier New" w:hAnsi="Courier New"/>
+          <w:sz w:val="18"/>
+          <w:szCs w:val="18"/>
+        </w:rPr>
+        <w:t xml:space="preserve">    trip_distance, fare_amount, total_amount</w:t>
+      </w:r>
+    </w:p>
+    <w:p>
+      <w:pPr>
+        <w:shd w:fill="F2F2F2" w:val="clear"/>
+        <w:spacing w:after="0" w:before="0"/>
+      </w:pPr>
+      <w:r>
+        <w:rPr>
+          <w:rFonts w:ascii="Courier New" w:cs="Courier New" w:eastAsia="Courier New" w:hAnsi="Courier New"/>
+          <w:sz w:val="18"/>
+          <w:szCs w:val="18"/>
+        </w:rPr>
+        <w:t xml:space="preserve">FROM nyctaxi_sample</w:t>
+      </w:r>
+    </w:p>
+    <w:p>
+      <w:pPr>
+        <w:shd w:fill="F2F2F2" w:val="clear"/>
+        <w:spacing w:after="0" w:before="0"/>
+      </w:pPr>
+      <w:r>
+        <w:rPr>
+          <w:rFonts w:ascii="Courier New" w:cs="Courier New" w:eastAsia="Courier New" w:hAnsi="Courier New"/>
+          <w:sz w:val="18"/>
+          <w:szCs w:val="18"/>
+        </w:rPr>
+        <w:t xml:space="preserve">WHERE trip_distance &gt; 10</w:t>
+      </w:r>
+    </w:p>
+    <w:p>
+      <w:pPr>
+        <w:shd w:fill="F2F2F2" w:val="clear"/>
+        <w:spacing w:after="0" w:before="0"/>
+      </w:pPr>
+      <w:r>
+        <w:rPr>
+          <w:rFonts w:ascii="Courier New" w:cs="Courier New" w:eastAsia="Courier New" w:hAnsi="Courier New"/>
+          <w:sz w:val="18"/>
+          <w:szCs w:val="18"/>
+        </w:rPr>
+        <w:t xml:space="preserve">  AND passenger_count &gt; 1</w:t>
+      </w:r>
+    </w:p>
+    <w:p>
+      <w:pPr>
+        <w:shd w:fill="F2F2F2" w:val="clear"/>
+        <w:spacing w:after="0" w:before="0"/>
+      </w:pPr>
+      <w:r>
+        <w:rPr>
+          <w:rFonts w:ascii="Courier New" w:cs="Courier New" w:eastAsia="Courier New" w:hAnsi="Courier New"/>
+          <w:sz w:val="18"/>
+          <w:szCs w:val="18"/>
+        </w:rPr>
+        <w:t xml:space="preserve">ORDER BY total_amount DESC;</w:t>
       </w:r>
     </w:p>
     <w:p>
@@ -4253,9 +4224,9 @@
       <w:r>
         <w:drawing>
           <wp:inline distT="0" distB="0" distL="0" distR="0">
-            <wp:extent cx="4762500" cy="2095500"/>
+            <wp:extent cx="5143500" cy="3143250"/>
             <wp:effectExtent t="0" r="0" b="0" l="0"/>
-            <wp:docPr id="1" name="Login oluşturma" descr="Login oluşturma" title="Login oluşturma"/>
+            <wp:docPr id="1" name="Execution Plan" descr="Execution Plan" title="Execution Plan"/>
             <wp:cNvGraphicFramePr>
               <a:graphicFrameLocks xmlns:a="http://schemas.openxmlformats.org/drawingml/2006/main" noChangeAspect="1"/>
             </wp:cNvGraphicFramePr>
@@ -4278,7 +4249,7 @@
                   <pic:spPr bwMode="auto">
                     <a:xfrm>
                       <a:off x="0" y="0"/>
-                      <a:ext cx="4762500" cy="2095500"/>
+                      <a:ext cx="5143500" cy="3143250"/>
                     </a:xfrm>
                     <a:prstGeom prst="rect">
                       <a:avLst/>
@@ -4304,7 +4275,7 @@
           <w:sz w:val="18"/>
           <w:szCs w:val="18"/>
         </w:rPr>
-        <w:t xml:space="preserve">Şekil 26 – taxi_reader ve taxi_writer loginleri başarıyla oluşturuldu</w:t>
+        <w:t xml:space="preserve">Şekil 23 – TOP 1000 uzun mesafeli yolculuk; Yürütme Planı sekmesinde indeks kullanımı görüntülendi, max total_amount = 315,97</w:t>
       </w:r>
     </w:p>
     <w:p>
@@ -4320,7 +4291,7 @@
           <w:sz w:val="24"/>
           <w:szCs w:val="24"/>
         </w:rPr>
-        <w:t xml:space="preserve">6.3 Veritabanı Kullanıcıları ve Rol Ataması</w:t>
+        <w:t xml:space="preserve">5.4 En Pahalı 10 Yolculuk</w:t>
       </w:r>
     </w:p>
     <w:p>
@@ -4334,105 +4305,91 @@
           <w:sz w:val="22"/>
           <w:szCs w:val="22"/>
         </w:rPr>
-        <w:t xml:space="preserve">Oluşturulan loginler NYCTaxi_Sample veritabanına kullanıcı olarak eklenmiş ve ilgili rollere atanmıştır. taxi_reader yalnızca okuma (db_datareader), taxi_writer ise hem okuma hem yazma (db_datareader + db_datawriter) yetkisine sahiptir.</w:t>
-      </w:r>
-    </w:p>
-    <w:p>
-      <w:pPr>
-        <w:shd w:fill="F2F2F2" w:val="clear"/>
-        <w:spacing w:after="0" w:before="0"/>
-      </w:pPr>
-      <w:r>
-        <w:rPr>
-          <w:rFonts w:ascii="Courier New" w:cs="Courier New" w:eastAsia="Courier New" w:hAnsi="Courier New"/>
-          <w:sz w:val="18"/>
-          <w:szCs w:val="18"/>
-        </w:rPr>
-        <w:t xml:space="preserve">USE NYCTaxi_Sample;</w:t>
-      </w:r>
-    </w:p>
-    <w:p>
-      <w:pPr>
-        <w:shd w:fill="F2F2F2" w:val="clear"/>
-        <w:spacing w:after="0" w:before="0"/>
-      </w:pPr>
-      <w:r>
-        <w:rPr>
-          <w:rFonts w:ascii="Courier New" w:cs="Courier New" w:eastAsia="Courier New" w:hAnsi="Courier New"/>
-          <w:sz w:val="18"/>
-          <w:szCs w:val="18"/>
-        </w:rPr>
-        <w:t xml:space="preserve">CREATE USER taxi_reader FOR LOGIN taxi_reader;</w:t>
-      </w:r>
-    </w:p>
-    <w:p>
-      <w:pPr>
-        <w:shd w:fill="F2F2F2" w:val="clear"/>
-        <w:spacing w:after="0" w:before="0"/>
-      </w:pPr>
-      <w:r>
-        <w:rPr>
-          <w:rFonts w:ascii="Courier New" w:cs="Courier New" w:eastAsia="Courier New" w:hAnsi="Courier New"/>
-          <w:sz w:val="18"/>
-          <w:szCs w:val="18"/>
-        </w:rPr>
-        <w:t xml:space="preserve">CREATE USER taxi_writer FOR LOGIN taxi_writer;</w:t>
-      </w:r>
-    </w:p>
-    <w:p>
-      <w:pPr>
-        <w:shd w:fill="F2F2F2" w:val="clear"/>
-        <w:spacing w:after="0" w:before="0"/>
-      </w:pPr>
-      <w:r>
-        <w:rPr>
-          <w:rFonts w:ascii="Courier New" w:cs="Courier New" w:eastAsia="Courier New" w:hAnsi="Courier New"/>
-          <w:sz w:val="18"/>
-          <w:szCs w:val="18"/>
-        </w:rPr>
-        <w:t xml:space="preserve"/>
-      </w:r>
-    </w:p>
-    <w:p>
-      <w:pPr>
-        <w:shd w:fill="F2F2F2" w:val="clear"/>
-        <w:spacing w:after="0" w:before="0"/>
-      </w:pPr>
-      <w:r>
-        <w:rPr>
-          <w:rFonts w:ascii="Courier New" w:cs="Courier New" w:eastAsia="Courier New" w:hAnsi="Courier New"/>
-          <w:sz w:val="18"/>
-          <w:szCs w:val="18"/>
-        </w:rPr>
-        <w:t xml:space="preserve">EXEC sp_addrolemember 'db_datareader', 'taxi_reader';</w:t>
-      </w:r>
-    </w:p>
-    <w:p>
-      <w:pPr>
-        <w:shd w:fill="F2F2F2" w:val="clear"/>
-        <w:spacing w:after="0" w:before="0"/>
-      </w:pPr>
-      <w:r>
-        <w:rPr>
-          <w:rFonts w:ascii="Courier New" w:cs="Courier New" w:eastAsia="Courier New" w:hAnsi="Courier New"/>
-          <w:sz w:val="18"/>
-          <w:szCs w:val="18"/>
-        </w:rPr>
-        <w:t xml:space="preserve">EXEC sp_addrolemember 'db_datareader', 'taxi_writer';</w:t>
-      </w:r>
-    </w:p>
-    <w:p>
-      <w:pPr>
-        <w:shd w:fill="F2F2F2" w:val="clear"/>
-        <w:spacing w:after="0" w:before="0"/>
-      </w:pPr>
-      <w:r>
-        <w:rPr>
-          <w:rFonts w:ascii="Courier New" w:cs="Courier New" w:eastAsia="Courier New" w:hAnsi="Courier New"/>
-          <w:sz w:val="18"/>
-          <w:szCs w:val="18"/>
-        </w:rPr>
-        <w:t xml:space="preserve">EXEC sp_addrolemember 'db_datawriter', 'taxi_writer';</w:t>
+        <w:t xml:space="preserve">Toplam ücret (total_amount) değerine göre azalan sırada ilk 10 kayıt listelenmiştir. Bu sorgu, aykırı değerlerin ve veri kalitesi sorunlarının tespitinde kullanılabilir.</w:t>
+      </w:r>
+    </w:p>
+    <w:p>
+      <w:pPr>
+        <w:shd w:fill="F2F2F2" w:val="clear"/>
+        <w:spacing w:after="0" w:before="0"/>
+      </w:pPr>
+      <w:r>
+        <w:rPr>
+          <w:rFonts w:ascii="Courier New" w:cs="Courier New" w:eastAsia="Courier New" w:hAnsi="Courier New"/>
+          <w:sz w:val="18"/>
+          <w:szCs w:val="18"/>
+        </w:rPr>
+        <w:t xml:space="preserve">SELECT TOP 10</w:t>
+      </w:r>
+    </w:p>
+    <w:p>
+      <w:pPr>
+        <w:shd w:fill="F2F2F2" w:val="clear"/>
+        <w:spacing w:after="0" w:before="0"/>
+      </w:pPr>
+      <w:r>
+        <w:rPr>
+          <w:rFonts w:ascii="Courier New" w:cs="Courier New" w:eastAsia="Courier New" w:hAnsi="Courier New"/>
+          <w:sz w:val="18"/>
+          <w:szCs w:val="18"/>
+        </w:rPr>
+        <w:t xml:space="preserve">    vendor_id, pickup_datetime, dropoff_datetime,</w:t>
+      </w:r>
+    </w:p>
+    <w:p>
+      <w:pPr>
+        <w:shd w:fill="F2F2F2" w:val="clear"/>
+        <w:spacing w:after="0" w:before="0"/>
+      </w:pPr>
+      <w:r>
+        <w:rPr>
+          <w:rFonts w:ascii="Courier New" w:cs="Courier New" w:eastAsia="Courier New" w:hAnsi="Courier New"/>
+          <w:sz w:val="18"/>
+          <w:szCs w:val="18"/>
+        </w:rPr>
+        <w:t xml:space="preserve">    passenger_count, trip_distance,</w:t>
+      </w:r>
+    </w:p>
+    <w:p>
+      <w:pPr>
+        <w:shd w:fill="F2F2F2" w:val="clear"/>
+        <w:spacing w:after="0" w:before="0"/>
+      </w:pPr>
+      <w:r>
+        <w:rPr>
+          <w:rFonts w:ascii="Courier New" w:cs="Courier New" w:eastAsia="Courier New" w:hAnsi="Courier New"/>
+          <w:sz w:val="18"/>
+          <w:szCs w:val="18"/>
+        </w:rPr>
+        <w:t xml:space="preserve">    fare_amount, tip_amount, total_amount</w:t>
+      </w:r>
+    </w:p>
+    <w:p>
+      <w:pPr>
+        <w:shd w:fill="F2F2F2" w:val="clear"/>
+        <w:spacing w:after="0" w:before="0"/>
+      </w:pPr>
+      <w:r>
+        <w:rPr>
+          <w:rFonts w:ascii="Courier New" w:cs="Courier New" w:eastAsia="Courier New" w:hAnsi="Courier New"/>
+          <w:sz w:val="18"/>
+          <w:szCs w:val="18"/>
+        </w:rPr>
+        <w:t xml:space="preserve">FROM nyctaxi_sample</w:t>
+      </w:r>
+    </w:p>
+    <w:p>
+      <w:pPr>
+        <w:shd w:fill="F2F2F2" w:val="clear"/>
+        <w:spacing w:after="0" w:before="0"/>
+      </w:pPr>
+      <w:r>
+        <w:rPr>
+          <w:rFonts w:ascii="Courier New" w:cs="Courier New" w:eastAsia="Courier New" w:hAnsi="Courier New"/>
+          <w:sz w:val="18"/>
+          <w:szCs w:val="18"/>
+        </w:rPr>
+        <w:t xml:space="preserve">ORDER BY total_amount DESC;</w:t>
       </w:r>
     </w:p>
     <w:p>
@@ -4448,9 +4405,9 @@
       <w:r>
         <w:drawing>
           <wp:inline distT="0" distB="0" distL="0" distR="0">
-            <wp:extent cx="4762500" cy="2286000"/>
+            <wp:extent cx="5143500" cy="3143250"/>
             <wp:effectExtent t="0" r="0" b="0" l="0"/>
-            <wp:docPr id="1" name="Kullanıcı ve rol ataması" descr="Kullanıcı ve rol ataması" title="Kullanıcı ve rol ataması"/>
+            <wp:docPr id="1" name="En pahalı yolculuklar" descr="En pahalı yolculuklar" title="En pahalı yolculuklar"/>
             <wp:cNvGraphicFramePr>
               <a:graphicFrameLocks xmlns:a="http://schemas.openxmlformats.org/drawingml/2006/main" noChangeAspect="1"/>
             </wp:cNvGraphicFramePr>
@@ -4473,7 +4430,7 @@
                   <pic:spPr bwMode="auto">
                     <a:xfrm>
                       <a:off x="0" y="0"/>
-                      <a:ext cx="4762500" cy="2286000"/>
+                      <a:ext cx="5143500" cy="3143250"/>
                     </a:xfrm>
                     <a:prstGeom prst="rect">
                       <a:avLst/>
@@ -4499,8 +4456,62 @@
           <w:sz w:val="18"/>
           <w:szCs w:val="18"/>
         </w:rPr>
-        <w:t xml:space="preserve">Şekil 27 – Kullanıcılar oluşturuldu ve rollere atandı</w:t>
-      </w:r>
+        <w:t xml:space="preserve">Şekil 24 – En yüksek toplam ücretli 10 yolculuk; maksimum total_amount = 500 (trip_distance = 1,3 ile aykırı değer)</w:t>
+      </w:r>
+    </w:p>
+    <w:p>
+      <w:pPr>
+        <w:spacing w:after="80" w:before="80"/>
+        <w:jc w:val="both"/>
+      </w:pPr>
+      <w:r>
+        <w:rPr>
+          <w:rFonts w:ascii="Times New Roman" w:cs="Times New Roman" w:eastAsia="Times New Roman" w:hAnsi="Times New Roman"/>
+          <w:sz w:val="22"/>
+          <w:szCs w:val="22"/>
+        </w:rPr>
+        <w:t xml:space="preserve">Gözlem: 500 birimlik maksimum total_amount, yalnızca 1,3 km mesafeli bir yolculukta oluşmuştur. Bu durum olası bir veri kalitesi sorunu ya da sistem üst sınırına işaret etmektedir.</w:t>
+      </w:r>
+    </w:p>
+    <w:p>
+      <w:pPr>
+        <w:spacing w:after="100" w:before="100"/>
+      </w:pPr>
+    </w:p>
+    <w:p>
+      <w:pPr>
+        <w:pStyle w:val="Heading1"/>
+        <w:spacing w:after="120" w:before="320"/>
+      </w:pPr>
+      <w:r>
+        <w:rPr>
+          <w:rFonts w:ascii="Times New Roman" w:cs="Times New Roman" w:eastAsia="Times New Roman" w:hAnsi="Times New Roman"/>
+          <w:b/>
+          <w:bCs/>
+          <w:sz w:val="28"/>
+          <w:szCs w:val="28"/>
+        </w:rPr>
+        <w:t xml:space="preserve">6. Erişim Yönetimi</w:t>
+      </w:r>
+    </w:p>
+    <w:p>
+      <w:pPr>
+        <w:spacing w:after="80" w:before="80"/>
+        <w:jc w:val="both"/>
+      </w:pPr>
+      <w:r>
+        <w:rPr>
+          <w:rFonts w:ascii="Times New Roman" w:cs="Times New Roman" w:eastAsia="Times New Roman" w:hAnsi="Times New Roman"/>
+          <w:sz w:val="22"/>
+          <w:szCs w:val="22"/>
+        </w:rPr>
+        <w:t xml:space="preserve">Veritabanı güvenliğinin temel bileşenlerinden biri, kullanıcıların yalnızca ihtiyaç duydukları işlemleri gerçekleştirebilmesini sağlayan erişim kontrolüdür. Bu bölümde NYCTaxi_Sample veritabanı için iki farklı yetkiye sahip kullanıcı oluşturulmuş ve rol tabanlı erişim yönetimi uygulanmıştır.</w:t>
+      </w:r>
+    </w:p>
+    <w:p>
+      <w:pPr>
+        <w:spacing w:after="100" w:before="100"/>
+      </w:pPr>
     </w:p>
     <w:p>
       <w:pPr>
@@ -4515,7 +4526,7 @@
           <w:sz w:val="24"/>
           <w:szCs w:val="24"/>
         </w:rPr>
-        <w:t xml:space="preserve">6.4 Rol Üyeliklerinin Doğrulanması</w:t>
+        <w:t xml:space="preserve">6.1 Mevcut Kullanıcı ve Rollerin İncelenmesi</w:t>
       </w:r>
     </w:p>
     <w:p>
@@ -4529,91 +4540,91 @@
           <w:sz w:val="22"/>
           <w:szCs w:val="22"/>
         </w:rPr>
-        <w:t xml:space="preserve">sys.database_role_members görünümü ile oluşturulan kullanıcıların hangi rollere atandığı doğrulanmıştır.</w:t>
-      </w:r>
-    </w:p>
-    <w:p>
-      <w:pPr>
-        <w:shd w:fill="F2F2F2" w:val="clear"/>
-        <w:spacing w:after="0" w:before="0"/>
-      </w:pPr>
-      <w:r>
-        <w:rPr>
-          <w:rFonts w:ascii="Courier New" w:cs="Courier New" w:eastAsia="Courier New" w:hAnsi="Courier New"/>
-          <w:sz w:val="18"/>
-          <w:szCs w:val="18"/>
-        </w:rPr>
-        <w:t xml:space="preserve">SELECT dp.name AS KullaniciAdi,</w:t>
-      </w:r>
-    </w:p>
-    <w:p>
-      <w:pPr>
-        <w:shd w:fill="F2F2F2" w:val="clear"/>
-        <w:spacing w:after="0" w:before="0"/>
-      </w:pPr>
-      <w:r>
-        <w:rPr>
-          <w:rFonts w:ascii="Courier New" w:cs="Courier New" w:eastAsia="Courier New" w:hAnsi="Courier New"/>
-          <w:sz w:val="18"/>
-          <w:szCs w:val="18"/>
-        </w:rPr>
-        <w:t xml:space="preserve">       rp.name AS RolAdi, rp.type_desc AS RolTuru</w:t>
-      </w:r>
-    </w:p>
-    <w:p>
-      <w:pPr>
-        <w:shd w:fill="F2F2F2" w:val="clear"/>
-        <w:spacing w:after="0" w:before="0"/>
-      </w:pPr>
-      <w:r>
-        <w:rPr>
-          <w:rFonts w:ascii="Courier New" w:cs="Courier New" w:eastAsia="Courier New" w:hAnsi="Courier New"/>
-          <w:sz w:val="18"/>
-          <w:szCs w:val="18"/>
-        </w:rPr>
-        <w:t xml:space="preserve">FROM sys.database_role_members drm</w:t>
-      </w:r>
-    </w:p>
-    <w:p>
-      <w:pPr>
-        <w:shd w:fill="F2F2F2" w:val="clear"/>
-        <w:spacing w:after="0" w:before="0"/>
-      </w:pPr>
-      <w:r>
-        <w:rPr>
-          <w:rFonts w:ascii="Courier New" w:cs="Courier New" w:eastAsia="Courier New" w:hAnsi="Courier New"/>
-          <w:sz w:val="18"/>
-          <w:szCs w:val="18"/>
-        </w:rPr>
-        <w:t xml:space="preserve">JOIN sys.database_principals dp</w:t>
-      </w:r>
-    </w:p>
-    <w:p>
-      <w:pPr>
-        <w:shd w:fill="F2F2F2" w:val="clear"/>
-        <w:spacing w:after="0" w:before="0"/>
-      </w:pPr>
-      <w:r>
-        <w:rPr>
-          <w:rFonts w:ascii="Courier New" w:cs="Courier New" w:eastAsia="Courier New" w:hAnsi="Courier New"/>
-          <w:sz w:val="18"/>
-          <w:szCs w:val="18"/>
-        </w:rPr>
-        <w:t xml:space="preserve">    ON drm.member_principal_id = dp.principal_id</w:t>
-      </w:r>
-    </w:p>
-    <w:p>
-      <w:pPr>
-        <w:shd w:fill="F2F2F2" w:val="clear"/>
-        <w:spacing w:after="0" w:before="0"/>
-      </w:pPr>
-      <w:r>
-        <w:rPr>
-          <w:rFonts w:ascii="Courier New" w:cs="Courier New" w:eastAsia="Courier New" w:hAnsi="Courier New"/>
-          <w:sz w:val="18"/>
-          <w:szCs w:val="18"/>
-        </w:rPr>
-        <w:t xml:space="preserve">JOIN sys.database_principals rp</w:t>
+        <w:t xml:space="preserve">sys.database_principals görünümü ile veritabanındaki mevcut kullanıcılar ve rol atamaları listelenmiştir.</w:t>
+      </w:r>
+    </w:p>
+    <w:p>
+      <w:pPr>
+        <w:shd w:fill="F2F2F2" w:val="clear"/>
+        <w:spacing w:after="0" w:before="0"/>
+      </w:pPr>
+      <w:r>
+        <w:rPr>
+          <w:rFonts w:ascii="Courier New" w:cs="Courier New" w:eastAsia="Courier New" w:hAnsi="Courier New"/>
+          <w:sz w:val="18"/>
+          <w:szCs w:val="18"/>
+        </w:rPr>
+        <w:t xml:space="preserve">SELECT dp.name AS KullaniciAdi, dp.type_desc AS Tur,</w:t>
+      </w:r>
+    </w:p>
+    <w:p>
+      <w:pPr>
+        <w:shd w:fill="F2F2F2" w:val="clear"/>
+        <w:spacing w:after="0" w:before="0"/>
+      </w:pPr>
+      <w:r>
+        <w:rPr>
+          <w:rFonts w:ascii="Courier New" w:cs="Courier New" w:eastAsia="Courier New" w:hAnsi="Courier New"/>
+          <w:sz w:val="18"/>
+          <w:szCs w:val="18"/>
+        </w:rPr>
+        <w:t xml:space="preserve">       rp.name AS RolAdi</w:t>
+      </w:r>
+    </w:p>
+    <w:p>
+      <w:pPr>
+        <w:shd w:fill="F2F2F2" w:val="clear"/>
+        <w:spacing w:after="0" w:before="0"/>
+      </w:pPr>
+      <w:r>
+        <w:rPr>
+          <w:rFonts w:ascii="Courier New" w:cs="Courier New" w:eastAsia="Courier New" w:hAnsi="Courier New"/>
+          <w:sz w:val="18"/>
+          <w:szCs w:val="18"/>
+        </w:rPr>
+        <w:t xml:space="preserve">FROM sys.database_principals dp</w:t>
+      </w:r>
+    </w:p>
+    <w:p>
+      <w:pPr>
+        <w:shd w:fill="F2F2F2" w:val="clear"/>
+        <w:spacing w:after="0" w:before="0"/>
+      </w:pPr>
+      <w:r>
+        <w:rPr>
+          <w:rFonts w:ascii="Courier New" w:cs="Courier New" w:eastAsia="Courier New" w:hAnsi="Courier New"/>
+          <w:sz w:val="18"/>
+          <w:szCs w:val="18"/>
+        </w:rPr>
+        <w:t xml:space="preserve">LEFT JOIN sys.database_role_members drm</w:t>
+      </w:r>
+    </w:p>
+    <w:p>
+      <w:pPr>
+        <w:shd w:fill="F2F2F2" w:val="clear"/>
+        <w:spacing w:after="0" w:before="0"/>
+      </w:pPr>
+      <w:r>
+        <w:rPr>
+          <w:rFonts w:ascii="Courier New" w:cs="Courier New" w:eastAsia="Courier New" w:hAnsi="Courier New"/>
+          <w:sz w:val="18"/>
+          <w:szCs w:val="18"/>
+        </w:rPr>
+        <w:t xml:space="preserve">    ON dp.principal_id = drm.member_principal_id</w:t>
+      </w:r>
+    </w:p>
+    <w:p>
+      <w:pPr>
+        <w:shd w:fill="F2F2F2" w:val="clear"/>
+        <w:spacing w:after="0" w:before="0"/>
+      </w:pPr>
+      <w:r>
+        <w:rPr>
+          <w:rFonts w:ascii="Courier New" w:cs="Courier New" w:eastAsia="Courier New" w:hAnsi="Courier New"/>
+          <w:sz w:val="18"/>
+          <w:szCs w:val="18"/>
+        </w:rPr>
+        <w:t xml:space="preserve">LEFT JOIN sys.database_principals rp</w:t>
       </w:r>
     </w:p>
     <w:p>
@@ -4641,7 +4652,21 @@
           <w:sz w:val="18"/>
           <w:szCs w:val="18"/>
         </w:rPr>
-        <w:t xml:space="preserve">WHERE dp.name IN ('taxi_reader', 'taxi_writer')</w:t>
+        <w:t xml:space="preserve">WHERE dp.type NOT IN ('R')</w:t>
+      </w:r>
+    </w:p>
+    <w:p>
+      <w:pPr>
+        <w:shd w:fill="F2F2F2" w:val="clear"/>
+        <w:spacing w:after="0" w:before="0"/>
+      </w:pPr>
+      <w:r>
+        <w:rPr>
+          <w:rFonts w:ascii="Courier New" w:cs="Courier New" w:eastAsia="Courier New" w:hAnsi="Courier New"/>
+          <w:sz w:val="18"/>
+          <w:szCs w:val="18"/>
+        </w:rPr>
+        <w:t xml:space="preserve">  AND dp.name NOT IN ('sys','INFORMATION_SCHEMA')</w:t>
       </w:r>
     </w:p>
     <w:p>
@@ -4671,9 +4696,9 @@
       <w:r>
         <w:drawing>
           <wp:inline distT="0" distB="0" distL="0" distR="0">
-            <wp:extent cx="4762500" cy="2571750"/>
+            <wp:extent cx="4762500" cy="2476500"/>
             <wp:effectExtent t="0" r="0" b="0" l="0"/>
-            <wp:docPr id="1" name="Rol üyelikleri" descr="Rol üyelikleri" title="Rol üyelikleri"/>
+            <wp:docPr id="1" name="Mevcut kullanıcılar" descr="Mevcut kullanıcılar" title="Mevcut kullanıcılar"/>
             <wp:cNvGraphicFramePr>
               <a:graphicFrameLocks xmlns:a="http://schemas.openxmlformats.org/drawingml/2006/main" noChangeAspect="1"/>
             </wp:cNvGraphicFramePr>
@@ -4696,6 +4721,563 @@
                   <pic:spPr bwMode="auto">
                     <a:xfrm>
                       <a:off x="0" y="0"/>
+                      <a:ext cx="4762500" cy="2476500"/>
+                    </a:xfrm>
+                    <a:prstGeom prst="rect">
+                      <a:avLst/>
+                    </a:prstGeom>
+                  </pic:spPr>
+                </pic:pic>
+              </a:graphicData>
+            </a:graphic>
+          </wp:inline>
+        </w:drawing>
+      </w:r>
+    </w:p>
+    <w:p>
+      <w:pPr>
+        <w:spacing w:after="160" w:before="40"/>
+        <w:jc w:val="center"/>
+      </w:pPr>
+      <w:r>
+        <w:rPr>
+          <w:rFonts w:ascii="Times New Roman" w:cs="Times New Roman" w:eastAsia="Times New Roman" w:hAnsi="Times New Roman"/>
+          <w:i/>
+          <w:iCs/>
+          <w:sz w:val="18"/>
+          <w:szCs w:val="18"/>
+        </w:rPr>
+        <w:t xml:space="preserve">Şekil 25 – Mevcut kullanıcılar: dbo (db_owner) ve guest</w:t>
+      </w:r>
+    </w:p>
+    <w:p>
+      <w:pPr>
+        <w:pStyle w:val="Heading2"/>
+        <w:spacing w:after="80" w:before="200"/>
+      </w:pPr>
+      <w:r>
+        <w:rPr>
+          <w:rFonts w:ascii="Times New Roman" w:cs="Times New Roman" w:eastAsia="Times New Roman" w:hAnsi="Times New Roman"/>
+          <w:b/>
+          <w:bCs/>
+          <w:sz w:val="24"/>
+          <w:szCs w:val="24"/>
+        </w:rPr>
+        <w:t xml:space="preserve">6.2 Login Oluşturma</w:t>
+      </w:r>
+    </w:p>
+    <w:p>
+      <w:pPr>
+        <w:spacing w:after="80" w:before="80"/>
+        <w:jc w:val="both"/>
+      </w:pPr>
+      <w:r>
+        <w:rPr>
+          <w:rFonts w:ascii="Times New Roman" w:cs="Times New Roman" w:eastAsia="Times New Roman" w:hAnsi="Times New Roman"/>
+          <w:sz w:val="22"/>
+          <w:szCs w:val="22"/>
+        </w:rPr>
+        <w:t xml:space="preserve">SQL Server kimlik doğrulaması için iki yeni login oluşturulmuştur: salt okunur erişim için taxi_reader, okuma ve yazma erişimi için taxi_writer.</w:t>
+      </w:r>
+    </w:p>
+    <w:p>
+      <w:pPr>
+        <w:shd w:fill="F2F2F2" w:val="clear"/>
+        <w:spacing w:after="0" w:before="0"/>
+      </w:pPr>
+      <w:r>
+        <w:rPr>
+          <w:rFonts w:ascii="Courier New" w:cs="Courier New" w:eastAsia="Courier New" w:hAnsi="Courier New"/>
+          <w:sz w:val="18"/>
+          <w:szCs w:val="18"/>
+        </w:rPr>
+        <w:t xml:space="preserve">USE master;</w:t>
+      </w:r>
+    </w:p>
+    <w:p>
+      <w:pPr>
+        <w:shd w:fill="F2F2F2" w:val="clear"/>
+        <w:spacing w:after="0" w:before="0"/>
+      </w:pPr>
+      <w:r>
+        <w:rPr>
+          <w:rFonts w:ascii="Courier New" w:cs="Courier New" w:eastAsia="Courier New" w:hAnsi="Courier New"/>
+          <w:sz w:val="18"/>
+          <w:szCs w:val="18"/>
+        </w:rPr>
+        <w:t xml:space="preserve">CREATE LOGIN taxi_reader WITH PASSWORD = 'Reader123!';</w:t>
+      </w:r>
+    </w:p>
+    <w:p>
+      <w:pPr>
+        <w:shd w:fill="F2F2F2" w:val="clear"/>
+        <w:spacing w:after="0" w:before="0"/>
+      </w:pPr>
+      <w:r>
+        <w:rPr>
+          <w:rFonts w:ascii="Courier New" w:cs="Courier New" w:eastAsia="Courier New" w:hAnsi="Courier New"/>
+          <w:sz w:val="18"/>
+          <w:szCs w:val="18"/>
+        </w:rPr>
+        <w:t xml:space="preserve">CREATE LOGIN taxi_writer WITH PASSWORD = 'Writer123!';</w:t>
+      </w:r>
+    </w:p>
+    <w:p>
+      <w:pPr>
+        <w:spacing w:after="100" w:before="100"/>
+      </w:pPr>
+    </w:p>
+    <w:p>
+      <w:pPr>
+        <w:spacing w:after="40" w:before="100"/>
+        <w:jc w:val="center"/>
+      </w:pPr>
+      <w:r>
+        <w:drawing>
+          <wp:inline distT="0" distB="0" distL="0" distR="0">
+            <wp:extent cx="4762500" cy="2095500"/>
+            <wp:effectExtent t="0" r="0" b="0" l="0"/>
+            <wp:docPr id="1" name="Login oluşturma" descr="Login oluşturma" title="Login oluşturma"/>
+            <wp:cNvGraphicFramePr>
+              <a:graphicFrameLocks xmlns:a="http://schemas.openxmlformats.org/drawingml/2006/main" noChangeAspect="1"/>
+            </wp:cNvGraphicFramePr>
+            <a:graphic xmlns:a="http://schemas.openxmlformats.org/drawingml/2006/main">
+              <a:graphicData uri="http://schemas.openxmlformats.org/drawingml/2006/picture">
+                <pic:pic xmlns:pic="http://schemas.openxmlformats.org/drawingml/2006/picture">
+                  <pic:nvPicPr>
+                    <pic:cNvPr id="0" name="" descr=""/>
+                    <pic:cNvPicPr>
+                      <a:picLocks noChangeAspect="1" noChangeArrowheads="1"/>
+                    </pic:cNvPicPr>
+                  </pic:nvPicPr>
+                  <pic:blipFill>
+                    <a:blip r:embed="rId37" cstate="none"/>
+                    <a:srcRect/>
+                    <a:stretch>
+                      <a:fillRect/>
+                    </a:stretch>
+                  </pic:blipFill>
+                  <pic:spPr bwMode="auto">
+                    <a:xfrm>
+                      <a:off x="0" y="0"/>
+                      <a:ext cx="4762500" cy="2095500"/>
+                    </a:xfrm>
+                    <a:prstGeom prst="rect">
+                      <a:avLst/>
+                    </a:prstGeom>
+                  </pic:spPr>
+                </pic:pic>
+              </a:graphicData>
+            </a:graphic>
+          </wp:inline>
+        </w:drawing>
+      </w:r>
+    </w:p>
+    <w:p>
+      <w:pPr>
+        <w:spacing w:after="160" w:before="40"/>
+        <w:jc w:val="center"/>
+      </w:pPr>
+      <w:r>
+        <w:rPr>
+          <w:rFonts w:ascii="Times New Roman" w:cs="Times New Roman" w:eastAsia="Times New Roman" w:hAnsi="Times New Roman"/>
+          <w:i/>
+          <w:iCs/>
+          <w:sz w:val="18"/>
+          <w:szCs w:val="18"/>
+        </w:rPr>
+        <w:t xml:space="preserve">Şekil 26 – taxi_reader ve taxi_writer loginleri başarıyla oluşturuldu</w:t>
+      </w:r>
+    </w:p>
+    <w:p>
+      <w:pPr>
+        <w:pStyle w:val="Heading2"/>
+        <w:spacing w:after="80" w:before="200"/>
+      </w:pPr>
+      <w:r>
+        <w:rPr>
+          <w:rFonts w:ascii="Times New Roman" w:cs="Times New Roman" w:eastAsia="Times New Roman" w:hAnsi="Times New Roman"/>
+          <w:b/>
+          <w:bCs/>
+          <w:sz w:val="24"/>
+          <w:szCs w:val="24"/>
+        </w:rPr>
+        <w:t xml:space="preserve">6.3 Veritabanı Kullanıcıları ve Rol Ataması</w:t>
+      </w:r>
+    </w:p>
+    <w:p>
+      <w:pPr>
+        <w:spacing w:after="80" w:before="80"/>
+        <w:jc w:val="both"/>
+      </w:pPr>
+      <w:r>
+        <w:rPr>
+          <w:rFonts w:ascii="Times New Roman" w:cs="Times New Roman" w:eastAsia="Times New Roman" w:hAnsi="Times New Roman"/>
+          <w:sz w:val="22"/>
+          <w:szCs w:val="22"/>
+        </w:rPr>
+        <w:t xml:space="preserve">Oluşturulan loginler NYCTaxi_Sample veritabanına kullanıcı olarak eklenmiş ve ilgili rollere atanmıştır. taxi_reader yalnızca okuma (db_datareader), taxi_writer ise hem okuma hem yazma (db_datareader + db_datawriter) yetkisine sahiptir.</w:t>
+      </w:r>
+    </w:p>
+    <w:p>
+      <w:pPr>
+        <w:shd w:fill="F2F2F2" w:val="clear"/>
+        <w:spacing w:after="0" w:before="0"/>
+      </w:pPr>
+      <w:r>
+        <w:rPr>
+          <w:rFonts w:ascii="Courier New" w:cs="Courier New" w:eastAsia="Courier New" w:hAnsi="Courier New"/>
+          <w:sz w:val="18"/>
+          <w:szCs w:val="18"/>
+        </w:rPr>
+        <w:t xml:space="preserve">USE NYCTaxi_Sample;</w:t>
+      </w:r>
+    </w:p>
+    <w:p>
+      <w:pPr>
+        <w:shd w:fill="F2F2F2" w:val="clear"/>
+        <w:spacing w:after="0" w:before="0"/>
+      </w:pPr>
+      <w:r>
+        <w:rPr>
+          <w:rFonts w:ascii="Courier New" w:cs="Courier New" w:eastAsia="Courier New" w:hAnsi="Courier New"/>
+          <w:sz w:val="18"/>
+          <w:szCs w:val="18"/>
+        </w:rPr>
+        <w:t xml:space="preserve">CREATE USER taxi_reader FOR LOGIN taxi_reader;</w:t>
+      </w:r>
+    </w:p>
+    <w:p>
+      <w:pPr>
+        <w:shd w:fill="F2F2F2" w:val="clear"/>
+        <w:spacing w:after="0" w:before="0"/>
+      </w:pPr>
+      <w:r>
+        <w:rPr>
+          <w:rFonts w:ascii="Courier New" w:cs="Courier New" w:eastAsia="Courier New" w:hAnsi="Courier New"/>
+          <w:sz w:val="18"/>
+          <w:szCs w:val="18"/>
+        </w:rPr>
+        <w:t xml:space="preserve">CREATE USER taxi_writer FOR LOGIN taxi_writer;</w:t>
+      </w:r>
+    </w:p>
+    <w:p>
+      <w:pPr>
+        <w:shd w:fill="F2F2F2" w:val="clear"/>
+        <w:spacing w:after="0" w:before="0"/>
+      </w:pPr>
+      <w:r>
+        <w:rPr>
+          <w:rFonts w:ascii="Courier New" w:cs="Courier New" w:eastAsia="Courier New" w:hAnsi="Courier New"/>
+          <w:sz w:val="18"/>
+          <w:szCs w:val="18"/>
+        </w:rPr>
+        <w:t xml:space="preserve"/>
+      </w:r>
+    </w:p>
+    <w:p>
+      <w:pPr>
+        <w:shd w:fill="F2F2F2" w:val="clear"/>
+        <w:spacing w:after="0" w:before="0"/>
+      </w:pPr>
+      <w:r>
+        <w:rPr>
+          <w:rFonts w:ascii="Courier New" w:cs="Courier New" w:eastAsia="Courier New" w:hAnsi="Courier New"/>
+          <w:sz w:val="18"/>
+          <w:szCs w:val="18"/>
+        </w:rPr>
+        <w:t xml:space="preserve">EXEC sp_addrolemember 'db_datareader', 'taxi_reader';</w:t>
+      </w:r>
+    </w:p>
+    <w:p>
+      <w:pPr>
+        <w:shd w:fill="F2F2F2" w:val="clear"/>
+        <w:spacing w:after="0" w:before="0"/>
+      </w:pPr>
+      <w:r>
+        <w:rPr>
+          <w:rFonts w:ascii="Courier New" w:cs="Courier New" w:eastAsia="Courier New" w:hAnsi="Courier New"/>
+          <w:sz w:val="18"/>
+          <w:szCs w:val="18"/>
+        </w:rPr>
+        <w:t xml:space="preserve">EXEC sp_addrolemember 'db_datareader', 'taxi_writer';</w:t>
+      </w:r>
+    </w:p>
+    <w:p>
+      <w:pPr>
+        <w:shd w:fill="F2F2F2" w:val="clear"/>
+        <w:spacing w:after="0" w:before="0"/>
+      </w:pPr>
+      <w:r>
+        <w:rPr>
+          <w:rFonts w:ascii="Courier New" w:cs="Courier New" w:eastAsia="Courier New" w:hAnsi="Courier New"/>
+          <w:sz w:val="18"/>
+          <w:szCs w:val="18"/>
+        </w:rPr>
+        <w:t xml:space="preserve">EXEC sp_addrolemember 'db_datawriter', 'taxi_writer';</w:t>
+      </w:r>
+    </w:p>
+    <w:p>
+      <w:pPr>
+        <w:spacing w:after="100" w:before="100"/>
+      </w:pPr>
+    </w:p>
+    <w:p>
+      <w:pPr>
+        <w:spacing w:after="40" w:before="100"/>
+        <w:jc w:val="center"/>
+      </w:pPr>
+      <w:r>
+        <w:drawing>
+          <wp:inline distT="0" distB="0" distL="0" distR="0">
+            <wp:extent cx="4762500" cy="2286000"/>
+            <wp:effectExtent t="0" r="0" b="0" l="0"/>
+            <wp:docPr id="1" name="Kullanıcı ve rol ataması" descr="Kullanıcı ve rol ataması" title="Kullanıcı ve rol ataması"/>
+            <wp:cNvGraphicFramePr>
+              <a:graphicFrameLocks xmlns:a="http://schemas.openxmlformats.org/drawingml/2006/main" noChangeAspect="1"/>
+            </wp:cNvGraphicFramePr>
+            <a:graphic xmlns:a="http://schemas.openxmlformats.org/drawingml/2006/main">
+              <a:graphicData uri="http://schemas.openxmlformats.org/drawingml/2006/picture">
+                <pic:pic xmlns:pic="http://schemas.openxmlformats.org/drawingml/2006/picture">
+                  <pic:nvPicPr>
+                    <pic:cNvPr id="0" name="" descr=""/>
+                    <pic:cNvPicPr>
+                      <a:picLocks noChangeAspect="1" noChangeArrowheads="1"/>
+                    </pic:cNvPicPr>
+                  </pic:nvPicPr>
+                  <pic:blipFill>
+                    <a:blip r:embed="rId38" cstate="none"/>
+                    <a:srcRect/>
+                    <a:stretch>
+                      <a:fillRect/>
+                    </a:stretch>
+                  </pic:blipFill>
+                  <pic:spPr bwMode="auto">
+                    <a:xfrm>
+                      <a:off x="0" y="0"/>
+                      <a:ext cx="4762500" cy="2286000"/>
+                    </a:xfrm>
+                    <a:prstGeom prst="rect">
+                      <a:avLst/>
+                    </a:prstGeom>
+                  </pic:spPr>
+                </pic:pic>
+              </a:graphicData>
+            </a:graphic>
+          </wp:inline>
+        </w:drawing>
+      </w:r>
+    </w:p>
+    <w:p>
+      <w:pPr>
+        <w:spacing w:after="160" w:before="40"/>
+        <w:jc w:val="center"/>
+      </w:pPr>
+      <w:r>
+        <w:rPr>
+          <w:rFonts w:ascii="Times New Roman" w:cs="Times New Roman" w:eastAsia="Times New Roman" w:hAnsi="Times New Roman"/>
+          <w:i/>
+          <w:iCs/>
+          <w:sz w:val="18"/>
+          <w:szCs w:val="18"/>
+        </w:rPr>
+        <w:t xml:space="preserve">Şekil 27 – Kullanıcılar oluşturuldu ve rollere atandı</w:t>
+      </w:r>
+    </w:p>
+    <w:p>
+      <w:pPr>
+        <w:pStyle w:val="Heading2"/>
+        <w:spacing w:after="80" w:before="200"/>
+      </w:pPr>
+      <w:r>
+        <w:rPr>
+          <w:rFonts w:ascii="Times New Roman" w:cs="Times New Roman" w:eastAsia="Times New Roman" w:hAnsi="Times New Roman"/>
+          <w:b/>
+          <w:bCs/>
+          <w:sz w:val="24"/>
+          <w:szCs w:val="24"/>
+        </w:rPr>
+        <w:t xml:space="preserve">6.4 Rol Üyeliklerinin Doğrulanması</w:t>
+      </w:r>
+    </w:p>
+    <w:p>
+      <w:pPr>
+        <w:spacing w:after="80" w:before="80"/>
+        <w:jc w:val="both"/>
+      </w:pPr>
+      <w:r>
+        <w:rPr>
+          <w:rFonts w:ascii="Times New Roman" w:cs="Times New Roman" w:eastAsia="Times New Roman" w:hAnsi="Times New Roman"/>
+          <w:sz w:val="22"/>
+          <w:szCs w:val="22"/>
+        </w:rPr>
+        <w:t xml:space="preserve">sys.database_role_members görünümü ile oluşturulan kullanıcıların hangi rollere atandığı doğrulanmıştır.</w:t>
+      </w:r>
+    </w:p>
+    <w:p>
+      <w:pPr>
+        <w:shd w:fill="F2F2F2" w:val="clear"/>
+        <w:spacing w:after="0" w:before="0"/>
+      </w:pPr>
+      <w:r>
+        <w:rPr>
+          <w:rFonts w:ascii="Courier New" w:cs="Courier New" w:eastAsia="Courier New" w:hAnsi="Courier New"/>
+          <w:sz w:val="18"/>
+          <w:szCs w:val="18"/>
+        </w:rPr>
+        <w:t xml:space="preserve">SELECT dp.name AS KullaniciAdi,</w:t>
+      </w:r>
+    </w:p>
+    <w:p>
+      <w:pPr>
+        <w:shd w:fill="F2F2F2" w:val="clear"/>
+        <w:spacing w:after="0" w:before="0"/>
+      </w:pPr>
+      <w:r>
+        <w:rPr>
+          <w:rFonts w:ascii="Courier New" w:cs="Courier New" w:eastAsia="Courier New" w:hAnsi="Courier New"/>
+          <w:sz w:val="18"/>
+          <w:szCs w:val="18"/>
+        </w:rPr>
+        <w:t xml:space="preserve">       rp.name AS RolAdi, rp.type_desc AS RolTuru</w:t>
+      </w:r>
+    </w:p>
+    <w:p>
+      <w:pPr>
+        <w:shd w:fill="F2F2F2" w:val="clear"/>
+        <w:spacing w:after="0" w:before="0"/>
+      </w:pPr>
+      <w:r>
+        <w:rPr>
+          <w:rFonts w:ascii="Courier New" w:cs="Courier New" w:eastAsia="Courier New" w:hAnsi="Courier New"/>
+          <w:sz w:val="18"/>
+          <w:szCs w:val="18"/>
+        </w:rPr>
+        <w:t xml:space="preserve">FROM sys.database_role_members drm</w:t>
+      </w:r>
+    </w:p>
+    <w:p>
+      <w:pPr>
+        <w:shd w:fill="F2F2F2" w:val="clear"/>
+        <w:spacing w:after="0" w:before="0"/>
+      </w:pPr>
+      <w:r>
+        <w:rPr>
+          <w:rFonts w:ascii="Courier New" w:cs="Courier New" w:eastAsia="Courier New" w:hAnsi="Courier New"/>
+          <w:sz w:val="18"/>
+          <w:szCs w:val="18"/>
+        </w:rPr>
+        <w:t xml:space="preserve">JOIN sys.database_principals dp</w:t>
+      </w:r>
+    </w:p>
+    <w:p>
+      <w:pPr>
+        <w:shd w:fill="F2F2F2" w:val="clear"/>
+        <w:spacing w:after="0" w:before="0"/>
+      </w:pPr>
+      <w:r>
+        <w:rPr>
+          <w:rFonts w:ascii="Courier New" w:cs="Courier New" w:eastAsia="Courier New" w:hAnsi="Courier New"/>
+          <w:sz w:val="18"/>
+          <w:szCs w:val="18"/>
+        </w:rPr>
+        <w:t xml:space="preserve">    ON drm.member_principal_id = dp.principal_id</w:t>
+      </w:r>
+    </w:p>
+    <w:p>
+      <w:pPr>
+        <w:shd w:fill="F2F2F2" w:val="clear"/>
+        <w:spacing w:after="0" w:before="0"/>
+      </w:pPr>
+      <w:r>
+        <w:rPr>
+          <w:rFonts w:ascii="Courier New" w:cs="Courier New" w:eastAsia="Courier New" w:hAnsi="Courier New"/>
+          <w:sz w:val="18"/>
+          <w:szCs w:val="18"/>
+        </w:rPr>
+        <w:t xml:space="preserve">JOIN sys.database_principals rp</w:t>
+      </w:r>
+    </w:p>
+    <w:p>
+      <w:pPr>
+        <w:shd w:fill="F2F2F2" w:val="clear"/>
+        <w:spacing w:after="0" w:before="0"/>
+      </w:pPr>
+      <w:r>
+        <w:rPr>
+          <w:rFonts w:ascii="Courier New" w:cs="Courier New" w:eastAsia="Courier New" w:hAnsi="Courier New"/>
+          <w:sz w:val="18"/>
+          <w:szCs w:val="18"/>
+        </w:rPr>
+        <w:t xml:space="preserve">    ON drm.role_principal_id = rp.principal_id</w:t>
+      </w:r>
+    </w:p>
+    <w:p>
+      <w:pPr>
+        <w:shd w:fill="F2F2F2" w:val="clear"/>
+        <w:spacing w:after="0" w:before="0"/>
+      </w:pPr>
+      <w:r>
+        <w:rPr>
+          <w:rFonts w:ascii="Courier New" w:cs="Courier New" w:eastAsia="Courier New" w:hAnsi="Courier New"/>
+          <w:sz w:val="18"/>
+          <w:szCs w:val="18"/>
+        </w:rPr>
+        <w:t xml:space="preserve">WHERE dp.name IN ('taxi_reader', 'taxi_writer')</w:t>
+      </w:r>
+    </w:p>
+    <w:p>
+      <w:pPr>
+        <w:shd w:fill="F2F2F2" w:val="clear"/>
+        <w:spacing w:after="0" w:before="0"/>
+      </w:pPr>
+      <w:r>
+        <w:rPr>
+          <w:rFonts w:ascii="Courier New" w:cs="Courier New" w:eastAsia="Courier New" w:hAnsi="Courier New"/>
+          <w:sz w:val="18"/>
+          <w:szCs w:val="18"/>
+        </w:rPr>
+        <w:t xml:space="preserve">ORDER BY dp.name;</w:t>
+      </w:r>
+    </w:p>
+    <w:p>
+      <w:pPr>
+        <w:spacing w:after="100" w:before="100"/>
+      </w:pPr>
+    </w:p>
+    <w:p>
+      <w:pPr>
+        <w:spacing w:after="40" w:before="100"/>
+        <w:jc w:val="center"/>
+      </w:pPr>
+      <w:r>
+        <w:drawing>
+          <wp:inline distT="0" distB="0" distL="0" distR="0">
+            <wp:extent cx="4762500" cy="2571750"/>
+            <wp:effectExtent t="0" r="0" b="0" l="0"/>
+            <wp:docPr id="1" name="Rol üyelikleri" descr="Rol üyelikleri" title="Rol üyelikleri"/>
+            <wp:cNvGraphicFramePr>
+              <a:graphicFrameLocks xmlns:a="http://schemas.openxmlformats.org/drawingml/2006/main" noChangeAspect="1"/>
+            </wp:cNvGraphicFramePr>
+            <a:graphic xmlns:a="http://schemas.openxmlformats.org/drawingml/2006/main">
+              <a:graphicData uri="http://schemas.openxmlformats.org/drawingml/2006/picture">
+                <pic:pic xmlns:pic="http://schemas.openxmlformats.org/drawingml/2006/picture">
+                  <pic:nvPicPr>
+                    <pic:cNvPr id="0" name="" descr=""/>
+                    <pic:cNvPicPr>
+                      <a:picLocks noChangeAspect="1" noChangeArrowheads="1"/>
+                    </pic:cNvPicPr>
+                  </pic:nvPicPr>
+                  <pic:blipFill>
+                    <a:blip r:embed="rId39" cstate="none"/>
+                    <a:srcRect/>
+                    <a:stretch>
+                      <a:fillRect/>
+                    </a:stretch>
+                  </pic:blipFill>
+                  <pic:spPr bwMode="auto">
+                    <a:xfrm>
+                      <a:off x="0" y="0"/>
                       <a:ext cx="4762500" cy="2571750"/>
                     </a:xfrm>
                     <a:prstGeom prst="rect">
@@ -4896,7 +5478,7 @@
                     </pic:cNvPicPr>
                   </pic:nvPicPr>
                   <pic:blipFill>
-                    <a:blip r:embed="rId37" cstate="none"/>
+                    <a:blip r:embed="rId40" cstate="none"/>
                     <a:srcRect/>
                     <a:stretch>
                       <a:fillRect/>
@@ -5231,7 +5813,7 @@
                 <w:sz w:val="20"/>
                 <w:szCs w:val="20"/>
               </w:rPr>
-              <w:t xml:space="preserve">İndeks Yönetimi</w:t>
+              <w:t xml:space="preserve">İndeks Oluşturma</w:t>
             </w:r>
           </w:p>
         </w:tc>
@@ -5262,6 +5844,68 @@
                 <w:szCs w:val="20"/>
               </w:rPr>
               <w:t xml:space="preserve">IX_nyctaxi_pickup_datetime → 1 seek (aktif kullanım)</w:t>
+            </w:r>
+          </w:p>
+        </w:tc>
+      </w:tr>
+      <w:tr>
+        <w:tc>
+          <w:tcPr>
+            <w:tcW w:type="dxa" w:w="3500"/>
+            <w:tcBorders>
+              <w:top w:val="single" w:color="AAAAAA" w:sz="1"/>
+              <w:left w:val="single" w:color="AAAAAA" w:sz="1"/>
+              <w:bottom w:val="single" w:color="AAAAAA" w:sz="1"/>
+              <w:right w:val="single" w:color="AAAAAA" w:sz="1"/>
+            </w:tcBorders>
+            <w:shd w:fill="FFFFFF" w:val="clear"/>
+            <w:tcMar>
+              <w:top w:type="dxa" w:w="60"/>
+              <w:left w:type="dxa" w:w="100"/>
+              <w:bottom w:type="dxa" w:w="60"/>
+              <w:right w:type="dxa" w:w="100"/>
+            </w:tcMar>
+          </w:tcPr>
+          <w:p>
+            <w:r>
+              <w:rPr>
+                <w:rFonts w:ascii="Times New Roman" w:cs="Times New Roman" w:eastAsia="Times New Roman" w:hAnsi="Times New Roman"/>
+                <w:b w:val="false"/>
+                <w:bCs w:val="false"/>
+                <w:sz w:val="20"/>
+                <w:szCs w:val="20"/>
+              </w:rPr>
+              <w:t xml:space="preserve">İndeks Kaldırma</w:t>
+            </w:r>
+          </w:p>
+        </w:tc>
+        <w:tc>
+          <w:tcPr>
+            <w:tcW w:type="dxa" w:w="5026"/>
+            <w:tcBorders>
+              <w:top w:val="single" w:color="AAAAAA" w:sz="1"/>
+              <w:left w:val="single" w:color="AAAAAA" w:sz="1"/>
+              <w:bottom w:val="single" w:color="AAAAAA" w:sz="1"/>
+              <w:right w:val="single" w:color="AAAAAA" w:sz="1"/>
+            </w:tcBorders>
+            <w:shd w:fill="FFFFFF" w:val="clear"/>
+            <w:tcMar>
+              <w:top w:type="dxa" w:w="60"/>
+              <w:left w:type="dxa" w:w="100"/>
+              <w:bottom w:type="dxa" w:w="60"/>
+              <w:right w:type="dxa" w:w="100"/>
+            </w:tcMar>
+          </w:tcPr>
+          <w:p>
+            <w:r>
+              <w:rPr>
+                <w:rFonts w:ascii="Times New Roman" w:cs="Times New Roman" w:eastAsia="Times New Roman" w:hAnsi="Times New Roman"/>
+                <w:b w:val="false"/>
+                <w:bCs w:val="false"/>
+                <w:sz w:val="20"/>
+                <w:szCs w:val="20"/>
+              </w:rPr>
+              <w:t xml:space="preserve">Gereksiz B-Tree indeksi DROP INDEX ile kaldırıldı</w:t>
             </w:r>
           </w:p>
         </w:tc>

</xml_diff>

<commit_message>
Proje1: SQL Profiler/Extended Events notu eklendi (Bölüm 3.5)
</commit_message>
<xml_diff>
--- a/Proje1-PerformansOptimizasyonu/Proje1_Rapor.docx
+++ b/Proje1-PerformansOptimizasyonu/Proje1_Rapor.docx
@@ -1942,6 +1942,177 @@
           <w:szCs w:val="18"/>
         </w:rPr>
         <w:t xml:space="preserve">Şekil 12 – nyctaxi_sample: 1.703.957 satır, 94.856KB toplam alan</w:t>
+      </w:r>
+    </w:p>
+    <w:p>
+      <w:pPr>
+        <w:spacing w:after="100" w:before="100"/>
+      </w:pPr>
+    </w:p>
+    <w:p>
+      <w:pPr>
+        <w:pStyle w:val="Heading2"/>
+        <w:spacing w:after="80" w:before="200"/>
+      </w:pPr>
+      <w:r>
+        <w:rPr>
+          <w:rFonts w:ascii="Times New Roman" w:cs="Times New Roman" w:eastAsia="Times New Roman" w:hAnsi="Times New Roman"/>
+          <w:b/>
+          <w:bCs/>
+          <w:sz w:val="24"/>
+          <w:szCs w:val="24"/>
+        </w:rPr>
+        <w:t xml:space="preserve">3.5 SQL Profiler / Extended Events</w:t>
+      </w:r>
+    </w:p>
+    <w:p>
+      <w:pPr>
+        <w:spacing w:after="80" w:before="80"/>
+        <w:jc w:val="both"/>
+      </w:pPr>
+      <w:r>
+        <w:rPr>
+          <w:rFonts w:ascii="Times New Roman" w:cs="Times New Roman" w:eastAsia="Times New Roman" w:hAnsi="Times New Roman"/>
+          <w:sz w:val="22"/>
+          <w:szCs w:val="22"/>
+        </w:rPr>
+        <w:t xml:space="preserve">SQL Server Profiler, sunucu üzerindeki olayları gerçek zamanlı izlemek için kullanılan klasik bir araçtır. Ancak SQL Server Profiler, LocalDB ortamında desteklenmemektedir.</w:t>
+      </w:r>
+    </w:p>
+    <w:p>
+      <w:pPr>
+        <w:spacing w:after="100" w:before="100"/>
+      </w:pPr>
+    </w:p>
+    <w:p>
+      <w:pPr>
+        <w:spacing w:after="80" w:before="80"/>
+        <w:jc w:val="both"/>
+      </w:pPr>
+      <w:r>
+        <w:rPr>
+          <w:rFonts w:ascii="Times New Roman" w:cs="Times New Roman" w:eastAsia="Times New Roman" w:hAnsi="Times New Roman"/>
+          <w:sz w:val="22"/>
+          <w:szCs w:val="22"/>
+        </w:rPr>
+        <w:t xml:space="preserve">Modern SQL Server kurulumlarında SQL Profiler'ın yerini Extended Events (XEvents) almıştır. Extended Events daha düşük overhead ile çok daha ayrıntılı olay izleme imkânı sunar. Örnek kullanım:</w:t>
+      </w:r>
+    </w:p>
+    <w:p>
+      <w:pPr>
+        <w:shd w:fill="F2F2F2" w:val="clear"/>
+        <w:spacing w:after="0" w:before="0"/>
+      </w:pPr>
+      <w:r>
+        <w:rPr>
+          <w:rFonts w:ascii="Courier New" w:cs="Courier New" w:eastAsia="Courier New" w:hAnsi="Courier New"/>
+          <w:sz w:val="18"/>
+          <w:szCs w:val="18"/>
+        </w:rPr>
+        <w:t xml:space="preserve">-- Extended Events ile yavaş sorguları izleme (Production SQL Server)</w:t>
+      </w:r>
+    </w:p>
+    <w:p>
+      <w:pPr>
+        <w:shd w:fill="F2F2F2" w:val="clear"/>
+        <w:spacing w:after="0" w:before="0"/>
+      </w:pPr>
+      <w:r>
+        <w:rPr>
+          <w:rFonts w:ascii="Courier New" w:cs="Courier New" w:eastAsia="Courier New" w:hAnsi="Courier New"/>
+          <w:sz w:val="18"/>
+          <w:szCs w:val="18"/>
+        </w:rPr>
+        <w:t xml:space="preserve">CREATE EVENT SESSION [YavasQueryIzleme] ON SERVER</w:t>
+      </w:r>
+    </w:p>
+    <w:p>
+      <w:pPr>
+        <w:shd w:fill="F2F2F2" w:val="clear"/>
+        <w:spacing w:after="0" w:before="0"/>
+      </w:pPr>
+      <w:r>
+        <w:rPr>
+          <w:rFonts w:ascii="Courier New" w:cs="Courier New" w:eastAsia="Courier New" w:hAnsi="Courier New"/>
+          <w:sz w:val="18"/>
+          <w:szCs w:val="18"/>
+        </w:rPr>
+        <w:t xml:space="preserve">ADD EVENT sqlserver.sql_statement_completed(</w:t>
+      </w:r>
+    </w:p>
+    <w:p>
+      <w:pPr>
+        <w:shd w:fill="F2F2F2" w:val="clear"/>
+        <w:spacing w:after="0" w:before="0"/>
+      </w:pPr>
+      <w:r>
+        <w:rPr>
+          <w:rFonts w:ascii="Courier New" w:cs="Courier New" w:eastAsia="Courier New" w:hAnsi="Courier New"/>
+          <w:sz w:val="18"/>
+          <w:szCs w:val="18"/>
+        </w:rPr>
+        <w:t xml:space="preserve">    WHERE duration &gt; 1000000  -- 1 saniyeden uzun sorgular</w:t>
+      </w:r>
+    </w:p>
+    <w:p>
+      <w:pPr>
+        <w:shd w:fill="F2F2F2" w:val="clear"/>
+        <w:spacing w:after="0" w:before="0"/>
+      </w:pPr>
+      <w:r>
+        <w:rPr>
+          <w:rFonts w:ascii="Courier New" w:cs="Courier New" w:eastAsia="Courier New" w:hAnsi="Courier New"/>
+          <w:sz w:val="18"/>
+          <w:szCs w:val="18"/>
+        </w:rPr>
+        <w:t xml:space="preserve">),</w:t>
+      </w:r>
+    </w:p>
+    <w:p>
+      <w:pPr>
+        <w:shd w:fill="F2F2F2" w:val="clear"/>
+        <w:spacing w:after="0" w:before="0"/>
+      </w:pPr>
+      <w:r>
+        <w:rPr>
+          <w:rFonts w:ascii="Courier New" w:cs="Courier New" w:eastAsia="Courier New" w:hAnsi="Courier New"/>
+          <w:sz w:val="18"/>
+          <w:szCs w:val="18"/>
+        </w:rPr>
+        <w:t xml:space="preserve">ADD TARGET package0.ring_buffer</w:t>
+      </w:r>
+    </w:p>
+    <w:p>
+      <w:pPr>
+        <w:shd w:fill="F2F2F2" w:val="clear"/>
+        <w:spacing w:after="0" w:before="0"/>
+      </w:pPr>
+      <w:r>
+        <w:rPr>
+          <w:rFonts w:ascii="Courier New" w:cs="Courier New" w:eastAsia="Courier New" w:hAnsi="Courier New"/>
+          <w:sz w:val="18"/>
+          <w:szCs w:val="18"/>
+        </w:rPr>
+        <w:t xml:space="preserve">WITH (STARTUP_STATE = ON);</w:t>
+      </w:r>
+    </w:p>
+    <w:p>
+      <w:pPr>
+        <w:spacing w:after="100" w:before="100"/>
+      </w:pPr>
+    </w:p>
+    <w:p>
+      <w:pPr>
+        <w:spacing w:after="80" w:before="80"/>
+        <w:jc w:val="both"/>
+      </w:pPr>
+      <w:r>
+        <w:rPr>
+          <w:rFonts w:ascii="Times New Roman" w:cs="Times New Roman" w:eastAsia="Times New Roman" w:hAnsi="Times New Roman"/>
+          <w:sz w:val="22"/>
+          <w:szCs w:val="22"/>
+        </w:rPr>
+        <w:t xml:space="preserve">LocalDB ortamında ise DMV'ler (Dynamic Management Views) aynı işlevi yerine getirmektedir. Bu projede sys.dm_exec_query_stats ile yavaş sorgular, sys.dm_exec_sessions ile aktif oturumlar ve sys.database_files ile disk kullanımı izlenmiştir. DMV tabanlı izleme, SQL Profiler'a kıyasla daha az overhead üretir ve script ile otomatize edilebilir.</w:t>
       </w:r>
     </w:p>
     <w:p>

</xml_diff>